<commit_message>
docs: retain displayed chat messages on account disconnect (D41-REQ-24)
</commit_message>
<xml_diff>
--- a/docs/Правила_и_дальнейший_распорядок_работ.docx
+++ b/docs/Правила_и_дальнейший_распорядок_работ.docx
@@ -18088,6 +18088,12 @@
       </w:r>
     </w:p>
     <w:p>
+      <w:pPr/>
+      <w:r>
+        <w:t>D41-REQ-24. Обычное отключение авторизованного аккаунта платформы без замены другим аккаунтом: прекратить получение новых сообщений этой платформы и удалить из временного буфера задержки только те её сообщения, которые ещё не были выведены. Уже выведенные сообщения сохраняются в оперативной памяти и продолжают отображаться во вкладке «Мультичат» и (если ранее были допущены туда) в OBS-виджете; отключение не скрывает их задним числом. Они остаются до естественного вытеснения общим лимитом, подтверждённого удаления платформой, достоверного начала новой трансляции этой платформы либо закрытия InOneLine. При повторном подключении того же аккаунта получать только новые сообщения; пропущенный период не восстанавливать. Другие платформы и сохранённые настройки не затрагивать. Это отличается от смены аккаунта на другой: тогда действует D41-REQ-22 с полной очисткой сообщений старого аккаунта. Решение принято пользователем 24 октября 2026 года; заменяет первоначально предложенную очистку уже показанного чата при обычном отключении.</w:t>
+      </w:r>
+    </w:p>
+    <w:p>
       <w:pPr>
         <w:pStyle w:val="Heading3"/>
         <w:keepNext/>
@@ -18115,6 +18121,9 @@
       </w:r>
       <w:r>
         <w:t xml:space="preserve"> После этой записи принято дополнительное правило D41-REQ-23: запуск InOneLine посреди эфира не загружает предыдущую переписку. В тот же день пользователь потребовал регистрировать каждое принятое решение в этом документе и синхронизировать его копию на GitHub; правило закреплено в §1.7.</w:t>
+      </w:r>
+      <w:r>
+        <w:t xml:space="preserve"> Дополнение от 24 октября 2026 года: принято D41-REQ-24 — при обычном отключении аккаунта без замены уже отображённые сообщения остаются до обычного вытеснения; ожидавшие в буфере сообщения не выводятся. Отличать это от смены аккаунта по D41-REQ-22.</w:t>
       </w:r>
     </w:p>
     <w:p>

</xml_diff>

<commit_message>
docs: agree single-screen chat settings and adaptive D41 layout
</commit_message>
<xml_diff>
--- a/docs/Правила_и_дальнейший_распорядок_работ.docx
+++ b/docs/Правила_и_дальнейший_распорядок_работ.docx
@@ -18094,6 +18094,12 @@
       </w:r>
     </w:p>
     <w:p>
+      <w:pPr/>
+      <w:r>
+        <w:t>D41-REQ-25. Операторская лента сообщений и все настройки мультичата размещаются одновременно внутри ОДНОЙ основной вкладки «Мультичат». Для изменения оформления и параметров не требуется переход в отдельную вкладку/страницу: пользователь наблюдает немедленный результат в живой ленте. Целевая компоновка для достаточной ширины: окно сообщений слева, панель настроек справа. Использовать уже принятый единый стиль блоков, групп, подписей и кнопок InOneLine, не создавать неузнаваемый самостоятельный интерфейс. В минимальном размере основного окна 520 × 360 и на промежуточных размерах обязательна адаптация: все элементы доступны, текст и кнопки не перекрываются, главная лента остаётся видимой при настройке, внешняя горизонтальная полоса не появляется, главное окно не меняет размер при переключении вкладок. Настройки могут иметь собственную вертикальную прокрутку, но уже согласованный запрет на ручную прокрутку ленты чата сохраняется. Вариант компактной схемы «лента сверху, настройки снизу» предложен к проверке и окончательному согласованию, а не утверждён как неизменная геометрия. Конкретные пропорции, точки перестроения, высоты панелей и размещение URL-кнопок проверить по существующей Qt-компоновке при реализации и вручную на 520 × 360, промежуточных и больших размерах. Основание: прямое уточнение пользователя 24 октября 2026 года; заменяет предыдущую предложенную модель с отдельными разделами «Сообщения»/«Настройки». Статус: требования к одной вкладке и единому стилю согласованы, точная компактная схема уточняется; код и Windows QA ещё отсутствуют.</w:t>
+      </w:r>
+    </w:p>
+    <w:p>
       <w:pPr>
         <w:pStyle w:val="Heading3"/>
         <w:keepNext/>
@@ -18105,7 +18111,7 @@
     <w:p>
       <w:pPr/>
       <w:r>
-        <w:t>Не решено и требует технической проверки: точные пределы ручного значения задержки и лимита памяти; поведение при экстремальной нагрузке и весе медиа; факт доступности всех типовых и нестандартных эмодзи YouTube/стикеров и других платформ; полнота событий удаления и подключения; точный интерфейс вкладки и размещение регуляторов; штатное сохранение признака «разрешено в OBS» на момент готовности сообщения для надёжного восстановления нескольких браузерных экземпляров.</w:t>
+        <w:t>Не решено и требует технической проверки: точные пределы ручного значения задержки и лимита памяти; поведение при экстремальной нагрузке и весе медиа; факт доступности всех типовых и нестандартных эмодзи YouTube/стикеров и других платформ; полнота событий удаления и подключения; точные пропорции, точки адаптивного перестроения и компактная компоновка единой вкладки «Мультичат», положение регуляторов и URL-кнопок; штатное сохранение признака «разрешено в OBS» на момент готовности сообщения для надёжного восстановления нескольких браузерных экземпляров.</w:t>
       </w:r>
     </w:p>
     <w:p>
@@ -18124,6 +18130,9 @@
       </w:r>
       <w:r>
         <w:t xml:space="preserve"> Дополнение от 24 октября 2026 года: принято D41-REQ-24 — при обычном отключении аккаунта без замены уже отображённые сообщения остаются до обычного вытеснения; ожидавшие в буфере сообщения не выводятся. Отличать это от смены аккаунта по D41-REQ-22.</w:t>
+      </w:r>
+      <w:r>
+        <w:t xml:space="preserve"> 24 октября 2026 года пользователь потребовал разместить мультичат и его настройки в одной вкладке, слева ленту и справа параметры на широком окне, с обязательной адаптацией под 520 × 360 и сохранением узнаваемого общего UI; это внесено в D41-REQ-25. Точная схема на минимуме остаётся предметом согласования.</w:t>
       </w:r>
     </w:p>
     <w:p>

</xml_diff>

<commit_message>
docs: finalize minimum-window multichat layout D41-REQ-25
</commit_message>
<xml_diff>
--- a/docs/Правила_и_дальнейший_распорядок_работ.docx
+++ b/docs/Правила_и_дальнейший_распорядок_работ.docx
@@ -18096,7 +18096,7 @@
     <w:p>
       <w:pPr/>
       <w:r>
-        <w:t>D41-REQ-25. Операторская лента сообщений и все настройки мультичата размещаются одновременно внутри ОДНОЙ основной вкладки «Мультичат». Для изменения оформления и параметров не требуется переход в отдельную вкладку/страницу: пользователь наблюдает немедленный результат в живой ленте. Целевая компоновка для достаточной ширины: окно сообщений слева, панель настроек справа. Использовать уже принятый единый стиль блоков, групп, подписей и кнопок InOneLine, не создавать неузнаваемый самостоятельный интерфейс. В минимальном размере основного окна 520 × 360 и на промежуточных размерах обязательна адаптация: все элементы доступны, текст и кнопки не перекрываются, главная лента остаётся видимой при настройке, внешняя горизонтальная полоса не появляется, главное окно не меняет размер при переключении вкладок. Настройки могут иметь собственную вертикальную прокрутку, но уже согласованный запрет на ручную прокрутку ленты чата сохраняется. Вариант компактной схемы «лента сверху, настройки снизу» предложен к проверке и окончательному согласованию, а не утверждён как неизменная геометрия. Конкретные пропорции, точки перестроения, высоты панелей и размещение URL-кнопок проверить по существующей Qt-компоновке при реализации и вручную на 520 × 360, промежуточных и больших размерах. Основание: прямое уточнение пользователя 24 октября 2026 года; заменяет предыдущую предложенную модель с отдельными разделами «Сообщения»/«Настройки». Статус: требования к одной вкладке и единому стилю согласованы, точная компактная схема уточняется; код и Windows QA ещё отсутствуют.</w:t>
+        <w:t>D41-REQ-25. Операторская лента сообщений и все настройки мультичата размещаются одновременно внутри ОДНОЙ основной вкладки «Мультичат». Для изменения оформления и параметров не требуется переход в отдельную вкладку/страницу: пользователь наблюдает немедленный результат в живой ленте. Целевая компоновка для достаточной ширины: окно сообщений слева, панель настроек справа. Использовать уже принятый единый стиль блоков, групп, подписей и кнопок InOneLine, не создавать неузнаваемый самостоятельный интерфейс. В минимальном размере основного окна 520 × 360 и на промежуточных размерах обязательна адаптация: все элементы доступны, текст и кнопки не перекрываются, главная лента остаётся видимой при настройке, внешняя горизонтальная полоса не появляется, главное окно не меняет размер при переключении вкладок. При минимальном размере 520 × 360 окончательно согласована вертикальная компоновка: лента чата сверху, настройки снизу с собственной вертикальной прокруткой. Лента остаётся видимой при прокрутке настроек и сама не прокручивается вручную. При достаточной ширине автоматически восстанавливается горизонтальная компоновка: чат слева, настройки справа. Конкретные пропорции, точки перестроения, высоты панелей и размещение URL-кнопок проверить по существующей Qt-компоновке при реализации и вручную на 520 × 360, промежуточных и больших размерах. Основание: прямое уточнение пользователя 24 октября 2026 года; заменяет предыдущую предложенную модель с отдельными разделами «Сообщения»/«Настройки». Статус: единая вкладка, общий стиль, горизонтальная и вертикальная схемы согласованы пользователем 24 октября 2026 года; конкретные пропорции и порог перестроения проверяются при реализации; код и Windows QA ещё отсутствуют.</w:t>
       </w:r>
     </w:p>
     <w:p>
@@ -18111,7 +18111,7 @@
     <w:p>
       <w:pPr/>
       <w:r>
-        <w:t>Не решено и требует технической проверки: точные пределы ручного значения задержки и лимита памяти; поведение при экстремальной нагрузке и весе медиа; факт доступности всех типовых и нестандартных эмодзи YouTube/стикеров и других платформ; полнота событий удаления и подключения; точные пропорции, точки адаптивного перестроения и компактная компоновка единой вкладки «Мультичат», положение регуляторов и URL-кнопок; штатное сохранение признака «разрешено в OBS» на момент готовности сообщения для надёжного восстановления нескольких браузерных экземпляров.</w:t>
+        <w:t>Не решено и требует технической проверки: точные пределы ручного значения задержки и лимита памяти; поведение при экстремальной нагрузке и весе медиа; факт доступности всех типовых и нестандартных эмодзи YouTube/стикеров и других платформ; полнота событий удаления и подключения; точные пропорции и точки адаптивного перестроения принятой двухрежимной компоновки вкладки «Мультичат», положение регуляторов и URL-кнопок; штатное сохранение признака «разрешено в OBS» на момент готовности сообщения для надёжного восстановления нескольких браузерных экземпляров.</w:t>
       </w:r>
     </w:p>
     <w:p>
@@ -18132,7 +18132,7 @@
         <w:t xml:space="preserve"> Дополнение от 24 октября 2026 года: принято D41-REQ-24 — при обычном отключении аккаунта без замены уже отображённые сообщения остаются до обычного вытеснения; ожидавшие в буфере сообщения не выводятся. Отличать это от смены аккаунта по D41-REQ-22.</w:t>
       </w:r>
       <w:r>
-        <w:t xml:space="preserve"> 24 октября 2026 года пользователь потребовал разместить мультичат и его настройки в одной вкладке, слева ленту и справа параметры на широком окне, с обязательной адаптацией под 520 × 360 и сохранением узнаваемого общего UI; это внесено в D41-REQ-25. Точная схема на минимуме остаётся предметом согласования.</w:t>
+        <w:t xml:space="preserve"> 24 октября 2026 года пользователь потребовал разместить мультичат и его настройки в одной вкладке, слева ленту и справа параметры на широком окне, с обязательной адаптацией под 520 × 360 и сохранением узнаваемого общего UI; это внесено в D41-REQ-25. В следующем ответе 24 октября 2026 года пользователь окончательно утвердил минимальную компоновку: чат сверху, настройки снизу с собственной вертикальной прокруткой, а чат остаётся без ручной прокрутки.</w:t>
       </w:r>
     </w:p>
     <w:p>

</xml_diff>

<commit_message>
docs: agree collapsible multichat settings and hide disconnected service options (D41-REQ-26)
</commit_message>
<xml_diff>
--- a/docs/Правила_и_дальнейший_распорядок_работ.docx
+++ b/docs/Правила_и_дальнейший_распорядок_работ.docx
@@ -18100,6 +18100,12 @@
       </w:r>
     </w:p>
     <w:p>
+      <w:pPr/>
+      <w:r>
+        <w:t>D41-REQ-26. Организация панели настроек «Мультичата» внутри единой вкладки: четыре раскрываемых и сворачиваемых блока: «Общие настройки» (задержка, лимит сообщений, показ времени), «Подключения и OBS» (состояния сервисов, галочки отображения чата каждого подключённого сервиса в OBS, быстрые кнопки «Копировать URL» и «Открыть предпросмотр»), «Оформление Twitch», «Оформление YouTube» (независимые варианты оригинального/настраиваемого оформления и соответствующие параметры). Для будущих подключаемых платформ формируется аналогичный собственный блок оформления без отдельного окна или новой вкладки. Если учётная запись сервиса не подключена в существующем центре подключений, блок её настроек оформления НЕ ОТОБРАЖАЕТСЯ целиком, включая подпись и внутренние контролы; настройки не удаляются и после повторного подключения возвращаются сохранёнными. Общие настройки остаются доступными независимо от наличия подключений; в блоке «Подключения и OBS» остаются сведения о состоянии подключений, чтобы оператор понимал отсутствие источника. При временной сетевой ошибке или ожидании авторизации ранее подключённого аккаунта блок не скрывается только по причине временной недоступности сервиса: сохраняется возможность видеть настройки и состояние. Автоматическая видимость блоков не изменяет уже принятые D41-REQ-22/24 правила очистки или сохранения ранее показанных сообщений. Группировка и скрытие неприменимых настроек напрямую приняты пользователем 24 октября 2026 года; применять общий GLOBAL-UI-001 и компактное перестроение D41-REQ-25. Реализация, ручная проверка Windows и QA не выполнены.</w:t>
+      </w:r>
+    </w:p>
+    <w:p>
       <w:pPr>
         <w:pStyle w:val="Heading3"/>
         <w:keepNext/>
@@ -18133,6 +18139,9 @@
       </w:r>
       <w:r>
         <w:t xml:space="preserve"> 24 октября 2026 года пользователь потребовал разместить мультичат и его настройки в одной вкладке, слева ленту и справа параметры на широком окне, с обязательной адаптацией под 520 × 360 и сохранением узнаваемого общего UI; это внесено в D41-REQ-25. В следующем ответе 24 октября 2026 года пользователь окончательно утвердил минимальную компоновку: чат сверху, настройки снизу с собственной вертикальной прокруткой, а чат остаётся без ручной прокрутки.</w:t>
+      </w:r>
+      <w:r>
+        <w:t xml:space="preserve"> 24 октября 2026 года пользователь принял группировку настроек мультичата в раскрывающиеся блоки и потребовал скрывать настройки неподключённых сервисов; зафиксировано D41-REQ-26.</w:t>
       </w:r>
     </w:p>
     <w:p>

</xml_diff>

<commit_message>
docs: accept local-only multichat style test preview D41-REQ-27
</commit_message>
<xml_diff>
--- a/docs/Правила_и_дальнейший_распорядок_работ.docx
+++ b/docs/Правила_и_дальнейший_распорядок_работ.docx
@@ -18106,6 +18106,12 @@
       </w:r>
     </w:p>
     <w:p>
+      <w:pPr/>
+      <w:r>
+        <w:t>D41-REQ-27. Тестовое сообщение для проверки оформления мультичата без необходимости ждать реального сообщения или начинать трансляцию. Пользователь может по своей инициативе показать тестовое сообщение в области предпросмотра внутри программы и оценить фактически выбранные параметры оформления: шрифты, цвета, фон, рамки и другие согласованные настройки соответствующей платформы. Тестовое сообщение строго отделено от настоящей операторской ленты и общего потока сообщений: не становится полученным сообщением, не проходит обычную очередь и задержку, не засчитывается в лимит RAM-ленты, не появляется в OBS-виджете, не попадает в историю или экспорт и не создаёт событий сервиса. Проверка доступна до начала эфира и при отсутствии входящих сообщений. Сам предпросмотр работает в рамках ранее принятой единой вкладки «Мультичат» и должен сохранять адаптивность на 520 × 360. Точный состав тестового текста/медиа, кнопки и способ закрытия ещё не выбирались; отдельно не считать их согласованными. Основание: прямое принятие предложения пользователем 24 октября 2026 года. Статус: требование согласовано; реализация и Windows QA ещё не выполнялись.</w:t>
+      </w:r>
+    </w:p>
+    <w:p>
       <w:pPr>
         <w:pStyle w:val="Heading3"/>
         <w:keepNext/>
@@ -18118,6 +18124,9 @@
       <w:pPr/>
       <w:r>
         <w:t>Не решено и требует технической проверки: точные пределы ручного значения задержки и лимита памяти; поведение при экстремальной нагрузке и весе медиа; факт доступности всех типовых и нестандартных эмодзи YouTube/стикеров и других платформ; полнота событий удаления и подключения; точные пропорции и точки адаптивного перестроения принятой двухрежимной компоновки вкладки «Мультичат», положение регуляторов и URL-кнопок; штатное сохранение признака «разрешено в OBS» на момент готовности сообщения для надёжного восстановления нескольких браузерных экземпляров.</w:t>
+      </w:r>
+      <w:r>
+        <w:t xml:space="preserve"> Для D41-REQ-27 остаются несогласованными состав тестового сообщения, механизм его вызова и закрытия; не считать их уже выбранными.</w:t>
       </w:r>
     </w:p>
     <w:p>
@@ -18142,6 +18151,9 @@
       </w:r>
       <w:r>
         <w:t xml:space="preserve"> 24 октября 2026 года пользователь принял группировку настроек мультичата в раскрывающиеся блоки и потребовал скрывать настройки неподключённых сервисов; зафиксировано D41-REQ-26.</w:t>
+      </w:r>
+      <w:r>
+        <w:t xml:space="preserve"> 24 октября 2026 года принято D41-REQ-27: отдельное тестовое сообщение только для локального предпросмотра оформления, без добавления в настоящий чат, OBS и историю.</w:t>
       </w:r>
     </w:p>
     <w:p>

</xml_diff>

<commit_message>
docs: accept D41-REQ-28 local preview button and continuous chat capture
</commit_message>
<xml_diff>
--- a/docs/Правила_и_дальнейший_распорядок_работ.docx
+++ b/docs/Правила_и_дальнейший_распорядок_работ.docx
@@ -18108,7 +18108,13 @@
     <w:p>
       <w:pPr/>
       <w:r>
-        <w:t>D41-REQ-27. Тестовое сообщение для проверки оформления мультичата без необходимости ждать реального сообщения или начинать трансляцию. Пользователь может по своей инициативе показать тестовое сообщение в области предпросмотра внутри программы и оценить фактически выбранные параметры оформления: шрифты, цвета, фон, рамки и другие согласованные настройки соответствующей платформы. Тестовое сообщение строго отделено от настоящей операторской ленты и общего потока сообщений: не становится полученным сообщением, не проходит обычную очередь и задержку, не засчитывается в лимит RAM-ленты, не появляется в OBS-виджете, не попадает в историю или экспорт и не создаёт событий сервиса. Проверка доступна до начала эфира и при отсутствии входящих сообщений. Сам предпросмотр работает в рамках ранее принятой единой вкладки «Мультичат» и должен сохранять адаптивность на 520 × 360. Точный состав тестового текста/медиа, кнопки и способ закрытия ещё не выбирались; отдельно не считать их согласованными. Основание: прямое принятие предложения пользователем 24 октября 2026 года. Статус: требование согласовано; реализация и Windows QA ещё не выполнялись.</w:t>
+        <w:t>D41-REQ-27. Тестовое сообщение для проверки оформления мультичата без необходимости ждать реального сообщения или начинать трансляцию. Пользователь может по своей инициативе показать тестовое сообщение в области предпросмотра внутри программы и оценить фактически выбранные параметры оформления: шрифты, цвета, фон, рамки и другие согласованные настройки соответствующей платформы. Тестовое сообщение строго отделено от настоящей операторской ленты и общего потока сообщений: не становится полученным сообщением, не проходит обычную очередь и задержку, не засчитывается в лимит RAM-ленты, не появляется в OBS-виджете, не попадает в историю или экспорт и не создаёт событий сервиса. Проверка доступна до начала эфира и при отсутствии входящих сообщений. Сам предпросмотр работает в рамках ранее принятой единой вкладки «Мультичат» и должен сохранять адаптивность на 520 × 360. Место кнопки и способ закрытия уточнены следующим принятым правилом D41-REQ-28; дальнейшее расширение тестового содержимого отдельно не согласовано. Основание: прямое принятие предложения пользователем 24 октября 2026 года. Статус: требование согласовано; реализация и Windows QA ещё не выполнялись.</w:t>
+      </w:r>
+    </w:p>
+    <w:p>
+      <w:pPr/>
+      <w:r>
+        <w:t>D41-REQ-28. Запуск и завершение локального предпросмотра тестового сообщения. Внутри раскрываемого блока оформления каждой подключённой платформы («Оформление Twitch», «Оформление YouTube» и аналогичного блока будущего сервиса) размещается кнопка «Показать тестовое сообщение». По нажатию открывается локальная область предпросмотра с образцом сообщения выбранной платформы: никнеймом, текстом, аватаром, значком платформы и примерами эмодзи; всё оформляется текущими настройками этой платформы и обновляется при их изменении. Кнопка «Закрыть предпросмотр» возвращает отображение к обычной актуальной живой ленте сообщений, без повторного воспроизведения или догрузки уже полученного. Пока предпросмотр открыт, InOneLine продолжает без остановки получать и обрабатывать настоящие сообщения всех подключённых платформ, поддерживая RAM-ленту и вывод в OBS по ранее согласованным правилам. Тестовый образец не выдаётся за реальное сообщение, не добавляется в настоящую ленту, буфер, OBS, историю или другие внешние события и не влияет на ограничение RAM (D41-REQ-27). Окно предпросмотра находится внутри принятой единой вкладки, не создаёт отдельного подключения к сервисам и сохраняет адаптацию интерфейса 520 × 360 (D41-REQ-25/26). Основание: прямое принятие пользователем 24 октября 2026 года. Статус: согласовано к реализации; код и Windows QA отсутствуют.</w:t>
       </w:r>
     </w:p>
     <w:p>
@@ -18123,10 +18129,7 @@
     <w:p>
       <w:pPr/>
       <w:r>
-        <w:t>Не решено и требует технической проверки: точные пределы ручного значения задержки и лимита памяти; поведение при экстремальной нагрузке и весе медиа; факт доступности всех типовых и нестандартных эмодзи YouTube/стикеров и других платформ; полнота событий удаления и подключения; точные пропорции и точки адаптивного перестроения принятой двухрежимной компоновки вкладки «Мультичат», положение регуляторов и URL-кнопок; штатное сохранение признака «разрешено в OBS» на момент готовности сообщения для надёжного восстановления нескольких браузерных экземпляров.</w:t>
-      </w:r>
-      <w:r>
-        <w:t xml:space="preserve"> Для D41-REQ-27 остаются несогласованными состав тестового сообщения, механизм его вызова и закрытия; не считать их уже выбранными.</w:t>
+        <w:t>Не решено и требует технической проверки: точные пределы ручного значения задержки и лимита памяти; поведение при экстремальной нагрузке и весе медиа; факт доступности всех типовых и нестандартных эмодзи YouTube/стикеров и других платформ; полнота событий удаления и подключения; точные пропорции и точки адаптивного перестроения принятой двухрежимной компоновки вкладки «Мультичат», положение регуляторов и URL-кнопок; штатное сохранение признака «разрешено в OBS» на момент готовности сообщения для надёжного восстановления нескольких браузерных экземпляров. Для D41-REQ-27/28 согласованы место кнопки, образец с текстом, никнеймом, аватаром, знаком платформы и эмодзи, способ закрытия и непрерывный приём настоящего чата; более широкие наборы тестовых медиа не утверждены.</w:t>
       </w:r>
     </w:p>
     <w:p>
@@ -18154,6 +18157,9 @@
       </w:r>
       <w:r>
         <w:t xml:space="preserve"> 24 октября 2026 года принято D41-REQ-27: отдельное тестовое сообщение только для локального предпросмотра оформления, без добавления в настоящий чат, OBS и историю.</w:t>
+      </w:r>
+      <w:r>
+        <w:t xml:space="preserve"> 24 октября 2026 года принято D41-REQ-28: кнопка тестового сообщения внутри оформления соответствующей подключённой платформы, локальный образец с текстом и графическими элементами, закрытие кнопкой «Закрыть предпросмотр» и возврат к текущей живой ленте без остановки получения сообщений.</w:t>
       </w:r>
     </w:p>
     <w:p>

</xml_diff>

<commit_message>
docs: allow simultaneous per-platform chat style test messages (D41-REQ-29)
</commit_message>
<xml_diff>
--- a/docs/Правила_и_дальнейший_распорядок_работ.docx
+++ b/docs/Правила_и_дальнейший_распорядок_работ.docx
@@ -18114,7 +18114,13 @@
     <w:p>
       <w:pPr/>
       <w:r>
-        <w:t>D41-REQ-28. Запуск и завершение локального предпросмотра тестового сообщения. Внутри раскрываемого блока оформления каждой подключённой платформы («Оформление Twitch», «Оформление YouTube» и аналогичного блока будущего сервиса) размещается кнопка «Показать тестовое сообщение». По нажатию открывается локальная область предпросмотра с образцом сообщения выбранной платформы: никнеймом, текстом, аватаром, значком платформы и примерами эмодзи; всё оформляется текущими настройками этой платформы и обновляется при их изменении. Кнопка «Закрыть предпросмотр» возвращает отображение к обычной актуальной живой ленте сообщений, без повторного воспроизведения или догрузки уже полученного. Пока предпросмотр открыт, InOneLine продолжает без остановки получать и обрабатывать настоящие сообщения всех подключённых платформ, поддерживая RAM-ленту и вывод в OBS по ранее согласованным правилам. Тестовый образец не выдаётся за реальное сообщение, не добавляется в настоящую ленту, буфер, OBS, историю или другие внешние события и не влияет на ограничение RAM (D41-REQ-27). Окно предпросмотра находится внутри принятой единой вкладки, не создаёт отдельного подключения к сервисам и сохраняет адаптацию интерфейса 520 × 360 (D41-REQ-25/26). Основание: прямое принятие пользователем 24 октября 2026 года. Статус: согласовано к реализации; код и Windows QA отсутствуют.</w:t>
+        <w:t>D41-REQ-28. Запуск и завершение локального предпросмотра тестового сообщения. Внутри раскрываемого блока оформления каждой подключённой платформы («Оформление Twitch», «Оформление YouTube» и аналогичного блока будущего сервиса) размещается кнопка «Показать тестовое сообщение». По нажатию открывается локальная область предпросмотра с образцом сообщения выбранной платформы: никнеймом, текстом, аватаром, значком платформы и примерами эмодзи; всё оформляется текущими настройками этой платформы и обновляется при их изменении. Кнопка «Закрыть предпросмотр» завершает тестовый показ соответствующей платформы; когда выключены тестовые сообщения всех платформ, область отображения возвращается к обычной актуальной живой ленте без повторного воспроизведения или догрузки уже полученного. Независимые одновременные тестовые сообщения нескольких платформ уточнены в D41-REQ-29. Пока предпросмотр открыт, InOneLine продолжает без остановки получать и обрабатывать настоящие сообщения всех подключённых платформ, поддерживая RAM-ленту и вывод в OBS по ранее согласованным правилам. Тестовый образец не выдаётся за реальное сообщение, не добавляется в настоящую ленту, буфер, OBS, историю или другие внешние события и не влияет на ограничение RAM (D41-REQ-27). Окно предпросмотра находится внутри принятой единой вкладки, не создаёт отдельного подключения к сервисам и сохраняет адаптацию интерфейса 520 × 360 (D41-REQ-25/26). Основание: прямое принятие пользователем 24 октября 2026 года. Статус: согласовано к реализации; код и Windows QA отсутствуют.</w:t>
+      </w:r>
+    </w:p>
+    <w:p>
+      <w:pPr/>
+      <w:r>
+        <w:t>D41-REQ-29. Независимый одновременный предпросмотр оформления разных платформ. Для каждого подключённого сервиса предусмотрен СВОЙ тестовый образец сообщения, включаемый и выключаемый отдельно через настройки оформления этого сервиса. Когда активировано несколько тестовых сообщений (например, Twitch и YouTube), в области предпросмотра вкладки «Мультичат» ОДНОВРЕМЕННО отображаются ВСЕ включённые образцы, каждый со своим источником и собственными выбранными параметрами оформления, чтобы пользователь мог непосредственно сравнить их внешний вид. Включение теста другого сервиса не заменяет уже открытый образец и не выключает его; выключение одного сервиса не скрывает тесты остальных. После выключения последнего тестового образца возвращается актуальная живая лента согласно D41-REQ-28. Тесты остаются локальными и никак не добавляются в действительные сообщения, RAM-буфер, OBS или историю по D41-REQ-27. Поведение распространяется на все будущие сервисы, а не только Twitch/YouTube. Расположение одновременных образцов должно оставаться пригодным для визуального сравнения и соблюдать адаптивную компоновку 520 × 360 (D41-REQ-25); конкретную геометрию проверить при реализации. Пользователь 24 октября 2026 года прямо ОТКЛОНИЛ предложенное ограничение одним тестовым сообщением и автоматическую замену образца при выборе другой платформы. Статус: требование согласовано, код и Windows QA отсутствуют.</w:t>
       </w:r>
     </w:p>
     <w:p>
@@ -18129,7 +18135,7 @@
     <w:p>
       <w:pPr/>
       <w:r>
-        <w:t>Не решено и требует технической проверки: точные пределы ручного значения задержки и лимита памяти; поведение при экстремальной нагрузке и весе медиа; факт доступности всех типовых и нестандартных эмодзи YouTube/стикеров и других платформ; полнота событий удаления и подключения; точные пропорции и точки адаптивного перестроения принятой двухрежимной компоновки вкладки «Мультичат», положение регуляторов и URL-кнопок; штатное сохранение признака «разрешено в OBS» на момент готовности сообщения для надёжного восстановления нескольких браузерных экземпляров. Для D41-REQ-27/28 согласованы место кнопки, образец с текстом, никнеймом, аватаром, знаком платформы и эмодзи, способ закрытия и непрерывный приём настоящего чата; более широкие наборы тестовых медиа не утверждены.</w:t>
+        <w:t>Не решено и требует технической проверки: точные пределы ручного значения задержки и лимита памяти; поведение при экстремальной нагрузке и весе медиа; факт доступности всех типовых и нестандартных эмодзи YouTube/стикеров и других платформ; полнота событий удаления и подключения; точные пропорции и точки адаптивного перестроения принятой двухрежимной компоновки вкладки «Мультичат», положение регуляторов и URL-кнопок; штатное сохранение признака «разрешено в OBS» на момент готовности сообщения для надёжного восстановления нескольких браузерных экземпляров. Для D41-REQ-27/28 согласованы место кнопки, образец с текстом, никнеймом, аватаром, знаком платформы и эмодзи, способ закрытия и непрерывный приём настоящего чата; более широкие наборы тестовых медиа не утверждены. D41-REQ-29: одновременное отображение нескольких тестовых образцов принято; визуальное размещение и удобство сравнения на минимальной ширине проверяются при UI-реализации. Не возвращаться к отвергнутому режиму автоматической замены образца одного сервиса другим.</w:t>
       </w:r>
     </w:p>
     <w:p>
@@ -18160,6 +18166,9 @@
       </w:r>
       <w:r>
         <w:t xml:space="preserve"> 24 октября 2026 года принято D41-REQ-28: кнопка тестового сообщения внутри оформления соответствующей подключённой платформы, локальный образец с текстом и графическими элементами, закрытие кнопкой «Закрыть предпросмотр» и возврат к текущей живой ленте без остановки получения сообщений.</w:t>
+      </w:r>
+      <w:r>
+        <w:t xml:space="preserve"> 24 октября 2026 года принято D41-REQ-29: независимый одновременный показ тестовых сообщений каждой подключённой платформы; предложенная замена одного образца другим явно отклонена. При этом не создаются настоящие сообщения или OBS-события.</w:t>
       </w:r>
     </w:p>
     <w:p>

</xml_diff>

<commit_message>
docs: pin test messages below live chat and require save before OBS styling updates (D41-REQ-30/31)
</commit_message>
<xml_diff>
--- a/docs/Правила_и_дальнейший_распорядок_работ.docx
+++ b/docs/Правила_и_дальнейший_распорядок_работ.docx
@@ -18000,7 +18000,7 @@
     <w:p>
       <w:pPr/>
       <w:r>
-        <w:t>D41-REQ-12. Вкладка InOneLine и OBS используют один и тот же набор параметров оформления. Изменения применяются сразу ко всем сообщениям нужной платформы, которые ещё находятся в текущей ленте; платформы друг на друга не влияют. Переключение оригинального/пользовательского режима тоже немедленно. Настройки сохраняются после перезапуска.</w:t>
+        <w:t>D41-REQ-12. Каждая платформа имеет независимо редактируемые параметры оформления. В операторской вкладке InOneLine изменение параметров (включая переключение оригинального/настраиваемого режима) немедленно отображается на настоящих сообщениях этой платформы и включённых тестовых образцах; подтверждение для локального предпросмотра не требуется. OBS использует последний сохранённый набор параметров и НЕ меняется от чернового изменения в программе. Нажатие «Сохранить» применяет выбранное оформление к OBS-виджету для данной платформы, включая уже отображённые там сообщения, без изменения их содержимого, порядка и меток времени. Сохранённые параметры оформления переживают перезапуск. Это более позднее прямое уточнение пользователя от 24 октября 2026 года, отменяющее прежний мгновенный перенос черновых изменений оформления в OBS; глобальные настройки доставки сообщений не затрагиваются. Дополнительные правила черновика см. D41-REQ-31.</w:t>
       </w:r>
     </w:p>
     <w:p>
@@ -18114,13 +18114,25 @@
     <w:p>
       <w:pPr/>
       <w:r>
-        <w:t>D41-REQ-28. Запуск и завершение локального предпросмотра тестового сообщения. Внутри раскрываемого блока оформления каждой подключённой платформы («Оформление Twitch», «Оформление YouTube» и аналогичного блока будущего сервиса) размещается кнопка «Показать тестовое сообщение». По нажатию открывается локальная область предпросмотра с образцом сообщения выбранной платформы: никнеймом, текстом, аватаром, значком платформы и примерами эмодзи; всё оформляется текущими настройками этой платформы и обновляется при их изменении. Кнопка «Закрыть предпросмотр» завершает тестовый показ соответствующей платформы; когда выключены тестовые сообщения всех платформ, область отображения возвращается к обычной актуальной живой ленте без повторного воспроизведения или догрузки уже полученного. Независимые одновременные тестовые сообщения нескольких платформ уточнены в D41-REQ-29. Пока предпросмотр открыт, InOneLine продолжает без остановки получать и обрабатывать настоящие сообщения всех подключённых платформ, поддерживая RAM-ленту и вывод в OBS по ранее согласованным правилам. Тестовый образец не выдаётся за реальное сообщение, не добавляется в настоящую ленту, буфер, OBS, историю или другие внешние события и не влияет на ограничение RAM (D41-REQ-27). Окно предпросмотра находится внутри принятой единой вкладки, не создаёт отдельного подключения к сервисам и сохраняет адаптацию интерфейса 520 × 360 (D41-REQ-25/26). Основание: прямое принятие пользователем 24 октября 2026 года. Статус: согласовано к реализации; код и Windows QA отсутствуют.</w:t>
+        <w:t>D41-REQ-28. Запуск и завершение локального предпросмотра тестового сообщения. Внутри раскрываемого блока оформления каждой подключённой платформы («Оформление Twitch», «Оформление YouTube» и аналогичного блока будущего сервиса) размещается кнопка «Показать тестовое сообщение». По нажатию тестовый образец появляется внизу ОБЩЕЙ области чата под настоящими сообщениями без отдельного режима/окна: никнеймом, текстом, аватаром, значком платформы и примерами эмодзи; всё оформляется текущими настройками этой платформы и обновляется при их изменении. Кнопка «Закрыть предпросмотр» завершает тестовый показ соответствующей платформы; при выключении последнего тестового образца он исчезает снизу общей области сообщений, а настоящая лента, которая всё это время оставалась видимой, продолжает отображаться без повторного воспроизведения или догрузки уже полученного. Независимые одновременные тестовые сообщения нескольких платформ уточнены в D41-REQ-29. Пока предпросмотр открыт, InOneLine продолжает без остановки получать и обрабатывать настоящие сообщения всех подключённых платформ, поддерживая RAM-ленту и вывод в OBS по ранее согласованным правилам. Тестовый образец не выдаётся за реальное сообщение, не добавляется в настоящую ленту, буфер, OBS, историю или другие внешние события и не влияет на ограничение RAM (D41-REQ-27). Окно предпросмотра находится внутри принятой единой вкладки, не создаёт отдельного подключения к сервисам и сохраняет адаптацию интерфейса 520 × 360 (D41-REQ-25/26). Основание: прямое принятие пользователем 24 октября 2026 года. Статус: согласовано к реализации; код и Windows QA отсутствуют.</w:t>
       </w:r>
     </w:p>
     <w:p>
       <w:pPr/>
       <w:r>
-        <w:t>D41-REQ-29. Независимый одновременный предпросмотр оформления разных платформ. Для каждого подключённого сервиса предусмотрен СВОЙ тестовый образец сообщения, включаемый и выключаемый отдельно через настройки оформления этого сервиса. Когда активировано несколько тестовых сообщений (например, Twitch и YouTube), в области предпросмотра вкладки «Мультичат» ОДНОВРЕМЕННО отображаются ВСЕ включённые образцы, каждый со своим источником и собственными выбранными параметрами оформления, чтобы пользователь мог непосредственно сравнить их внешний вид. Включение теста другого сервиса не заменяет уже открытый образец и не выключает его; выключение одного сервиса не скрывает тесты остальных. После выключения последнего тестового образца возвращается актуальная живая лента согласно D41-REQ-28. Тесты остаются локальными и никак не добавляются в действительные сообщения, RAM-буфер, OBS или историю по D41-REQ-27. Поведение распространяется на все будущие сервисы, а не только Twitch/YouTube. Расположение одновременных образцов должно оставаться пригодным для визуального сравнения и соблюдать адаптивную компоновку 520 × 360 (D41-REQ-25); конкретную геометрию проверить при реализации. Пользователь 24 октября 2026 года прямо ОТКЛОНИЛ предложенное ограничение одним тестовым сообщением и автоматическую замену образца при выборе другой платформы. Статус: требование согласовано, код и Windows QA отсутствуют.</w:t>
+        <w:t>D41-REQ-29. Независимый одновременный предпросмотр оформления разных платформ. Для каждого подключённого сервиса предусмотрен СВОЙ тестовый образец сообщения, включаемый и выключаемый отдельно через настройки оформления этого сервиса. Когда активировано несколько тестовых сообщений (например, Twitch и YouTube), в нижней закреплённой части общей области чата вкладки «Мультичат» ОДНОВРЕМЕННО отображаются ВСЕ включённые образцы, каждый со своим источником и собственными выбранными параметрами оформления, чтобы пользователь мог непосредственно сравнить их внешний вид. Включение теста другого сервиса не заменяет уже открытый образец и не выключает его; выключение одного сервиса не скрывает тесты остальных. При выключении последнего тестового образца остаётся уже видимая над ним актуальная живая лента без переключения режима согласно D41-REQ-28 и D41-REQ-30. Тесты остаются локальными и никак не добавляются в действительные сообщения, RAM-буфер, OBS или историю по D41-REQ-27. Поведение распространяется на все будущие сервисы, а не только Twitch/YouTube. Расположение одновременных образцов должно оставаться пригодным для визуального сравнения и соблюдать адаптивную компоновку 520 × 360 (D41-REQ-25); конкретную геометрию проверить при реализации. Пользователь 24 октября 2026 года прямо ОТКЛОНИЛ предложенное ограничение одним тестовым сообщением и автоматическую замену образца при выборе другой платформы. Статус: требование согласовано, код и Windows QA отсутствуют.</w:t>
+      </w:r>
+    </w:p>
+    <w:p>
+      <w:pPr/>
+      <w:r>
+        <w:t>D41-REQ-30. Совмещение живого чата с тестовыми образцами. ЕДИНАЯ область сообщений на вкладке «Мультичат» одновременно отображает настоящие полученные сообщения и включённые тестовые образцы. Настоящие сообщения занимают верхнюю часть области, поступают и обновляются непрерывно по ранее принятому порядку. Каждый включённый тестовый образец отдельного подключённого сервиса всегда расположен НИЖЕ настоящих сообщений и закреплён внизу той же области; несколько тестов показываются одновременно, чтобы непосредственно сравнивать оформление разных платформ. Тестовые образцы не вытесняются входящими настоящими сообщениями и не вытесняют содержимое RAM-ленты: они являются отдельным локальным слоем представления, а не полученными событиями. Отключение теста просто убирает соответствующий образец без изменения/повторной загрузки действительной ленты. Тесты никогда не попадают в OBS. Сохранить общую компактную компоновку и проверить отображение на минимальном окне 520 × 360. Прямое предложение пользователя от 24 октября 2026 года; отменяет неутверждённую альтернативу заменять настоящие сообщения на тестовые при предпросмотре. Код и Windows QA отсутствуют.</w:t>
+      </w:r>
+    </w:p>
+    <w:p>
+      <w:pPr/>
+      <w:r>
+        <w:t>D41-REQ-31. Редактирование оформления с локальным немедленным предпросмотром и отдельным применением в OBS. Область чата самой программы одновременно служит живой лентой и предпросмотром внешнего вида. При изменении оформления конкретной платформы (цвет, шрифт, рамка, фон, размеры, исходный/настраиваемый режим) новые значения БЕЗ кнопки подтверждения немедленно применяются к отображаемым в программе настоящим и тестовым сообщениям этой платформы. В браузерном виджете OBS до нажатия «Сохранить» продолжает использоваться последнее сохранённое оформление. После нажатия «Сохранить» новые параметры оформления соответствующей платформы сохраняются и передаются в OBS: меняется оформление всех ещё отображаемых сообщений этой платформы, а содержание и порядок остаются прежними; изменения других платформ не затрагиваются. Применение через «Сохранить» относится именно к настройкам ВНЕШНЕГО ВИДА, а не отменяет немедленную работу ранее согласованных параметров задержки, лимита RAM и фильтров вывода. Поведение несохранённого черновика при закрытии программы либо уходе с вкладки уточнить отдельно, не придумывать автосохранение или автооткат. Прямое предложение пользователя от 24 октября 2026 года; уточняет и частично заменяет прежние D41-REQ-12/25/27–29; код и Windows QA отсутствуют.</w:t>
       </w:r>
     </w:p>
     <w:p>
@@ -18135,7 +18147,7 @@
     <w:p>
       <w:pPr/>
       <w:r>
-        <w:t>Не решено и требует технической проверки: точные пределы ручного значения задержки и лимита памяти; поведение при экстремальной нагрузке и весе медиа; факт доступности всех типовых и нестандартных эмодзи YouTube/стикеров и других платформ; полнота событий удаления и подключения; точные пропорции и точки адаптивного перестроения принятой двухрежимной компоновки вкладки «Мультичат», положение регуляторов и URL-кнопок; штатное сохранение признака «разрешено в OBS» на момент готовности сообщения для надёжного восстановления нескольких браузерных экземпляров. Для D41-REQ-27/28 согласованы место кнопки, образец с текстом, никнеймом, аватаром, знаком платформы и эмодзи, способ закрытия и непрерывный приём настоящего чата; более широкие наборы тестовых медиа не утверждены. D41-REQ-29: одновременное отображение нескольких тестовых образцов принято; визуальное размещение и удобство сравнения на минимальной ширине проверяются при UI-реализации. Не возвращаться к отвергнутому режиму автоматической замены образца одного сервиса другим.</w:t>
+        <w:t>Не решено и требует технической проверки: точные пределы ручного значения задержки и лимита памяти; поведение при экстремальной нагрузке и весе медиа; факт доступности всех типовых и нестандартных эмодзи YouTube/стикеров и других платформ; полнота событий удаления и подключения; точные пропорции и точки адаптивного перестроения принятой двухрежимной компоновки вкладки «Мультичат», положение регуляторов и URL-кнопок; штатное сохранение признака «разрешено в OBS» на момент готовности сообщения для надёжного восстановления нескольких браузерных экземпляров. Для D41-REQ-27/28 согласованы место кнопки, образец с текстом, никнеймом, аватаром, знаком платформы и эмодзи, способ закрытия и непрерывный приём настоящего чата; более широкие наборы тестовых медиа не утверждены. D41-REQ-29: одновременное отображение нескольких тестовых образцов принято; визуальное размещение и удобство сравнения на минимальной ширине проверяются при UI-реализации. Не возвращаться к отвергнутому режиму автоматической замены образца одного сервиса другим. Для D41-REQ-30/31 проверить геометрию закреплённых снизу тестовых сообщений при высокой нагрузке и малой высоте; отдельно согласовать судьбу несохранённого черновика оформления при выходе из программы и переключении вкладок. Мгновенное локальное предпросмотр-оформление не следует путать с сохранённым стилем OBS; изменение OBS только по явной кнопке «Сохранить».</w:t>
       </w:r>
     </w:p>
     <w:p>
@@ -18169,6 +18181,10 @@
       </w:r>
       <w:r>
         <w:t xml:space="preserve"> 24 октября 2026 года принято D41-REQ-29: независимый одновременный показ тестовых сообщений каждой подключённой платформы; предложенная замена одного образца другим явно отклонена. При этом не создаются настоящие сообщения или OBS-события.</w:t>
+      </w:r>
+      <w:r>
+        <w:rPr/>
+        <w:t xml:space="preserve"> 24 октября 2026 года пользователь предложил D41-REQ-30/31: настоящие сообщения остаются выше закреплённых снизу тестовых образцов; область чата является немедленным локальным предпросмотром изменений внешнего вида, а опубликованное оформление OBS обновляется только по нажатию «Сохранить». Ранее согласованное мгновенное применение черновых изменений оформления в OBS этим уточнением заменено.</w:t>
       </w:r>
     </w:p>
     <w:p>

</xml_diff>

<commit_message>
docs: preserve unsaved D41 appearance drafts and apply local preview to real/test messages
</commit_message>
<xml_diff>
--- a/docs/Правила_и_дальнейший_распорядок_работ.docx
+++ b/docs/Правила_и_дальнейший_распорядок_работ.docx
@@ -18000,7 +18000,7 @@
     <w:p>
       <w:pPr/>
       <w:r>
-        <w:t>D41-REQ-12. Каждая платформа имеет независимо редактируемые параметры оформления. В операторской вкладке InOneLine изменение параметров (включая переключение оригинального/настраиваемого режима) немедленно отображается на настоящих сообщениях этой платформы и включённых тестовых образцах; подтверждение для локального предпросмотра не требуется. OBS использует последний сохранённый набор параметров и НЕ меняется от чернового изменения в программе. Нажатие «Сохранить» применяет выбранное оформление к OBS-виджету для данной платформы, включая уже отображённые там сообщения, без изменения их содержимого, порядка и меток времени. Сохранённые параметры оформления переживают перезапуск. Это более позднее прямое уточнение пользователя от 24 октября 2026 года, отменяющее прежний мгновенный перенос черновых изменений оформления в OBS; глобальные настройки доставки сообщений не затрагиваются. Дополнительные правила черновика см. D41-REQ-31.</w:t>
+        <w:t>D41-REQ-12. Каждая платформа имеет независимо редактируемые параметры оформления. В операторской вкладке InOneLine изменение параметров (включая переключение оригинального/настраиваемого режима) немедленно отображается одновременно на ВСЕХ настоящих сообщениях этой платформы (включая новые входящие) и на ВСЕХ включённых тестовых образцах; подтверждение для локального предпросмотра не требуется. OBS использует последний сохранённый набор параметров и НЕ меняется от чернового изменения в программе. Нажатие «Сохранить» применяет выбранное оформление к OBS-виджету для данной платформы, включая уже отображённые там сообщения, без изменения их содержимого, порядка и меток времени. Сохранённые параметры оформления переживают перезапуск. Это более позднее прямое уточнение пользователя от 24 октября 2026 года, отменяющее прежний мгновенный перенос черновых изменений оформления в OBS; глобальные настройки доставки сообщений не затрагиваются. Дополнительные правила черновика см. D41-REQ-31.</w:t>
       </w:r>
     </w:p>
     <w:p>
@@ -18132,7 +18132,13 @@
     <w:p>
       <w:pPr/>
       <w:r>
-        <w:t>D41-REQ-31. Редактирование оформления с локальным немедленным предпросмотром и отдельным применением в OBS. Область чата самой программы одновременно служит живой лентой и предпросмотром внешнего вида. При изменении оформления конкретной платформы (цвет, шрифт, рамка, фон, размеры, исходный/настраиваемый режим) новые значения БЕЗ кнопки подтверждения немедленно применяются к отображаемым в программе настоящим и тестовым сообщениям этой платформы. В браузерном виджете OBS до нажатия «Сохранить» продолжает использоваться последнее сохранённое оформление. После нажатия «Сохранить» новые параметры оформления соответствующей платформы сохраняются и передаются в OBS: меняется оформление всех ещё отображаемых сообщений этой платформы, а содержание и порядок остаются прежними; изменения других платформ не затрагиваются. Применение через «Сохранить» относится именно к настройкам ВНЕШНЕГО ВИДА, а не отменяет немедленную работу ранее согласованных параметров задержки, лимита RAM и фильтров вывода. Поведение несохранённого черновика при закрытии программы либо уходе с вкладки уточнить отдельно, не придумывать автосохранение или автооткат. Прямое предложение пользователя от 24 октября 2026 года; уточняет и частично заменяет прежние D41-REQ-12/25/27–29; код и Windows QA отсутствуют.</w:t>
+        <w:t>D41-REQ-31. Редактирование оформления с локальным немедленным предпросмотром и отдельным применением в OBS. Область чата самой программы одновременно служит живой лентой и предпросмотром внешнего вида. При изменении оформления конкретной платформы (цвет, шрифт, рамка, фон, размеры, исходный/настраиваемый режим) новые значения БЕЗ кнопки подтверждения немедленно применяются КО ВСЕМ отображаемым в программе реальным сообщениям (в том числе получаемым после изменения оформления) И ко всем включённым тестовым сообщениям этой платформы одновременно. Локальный предпросмотр не требует подтверждения или нажатия «Сохранить». В браузерном виджете OBS до нажатия «Сохранить» продолжает использоваться последнее сохранённое оформление. После нажатия «Сохранить» новые параметры оформления соответствующей платформы сохраняются и передаются в OBS: меняется оформление всех ещё отображаемых сообщений этой платформы, а содержание и порядок остаются прежними; изменения других платформ не затрагиваются. Применение через «Сохранить» относится именно к настройкам ВНЕШНЕГО ВИДА, а не отменяет немедленную работу ранее согласованных параметров задержки, лимита RAM и фильтров вывода. Поведение несохранённого черновика при переключении вкладок и закрытии программы окончательно согласовано в D41-REQ-32; сам черновик не публикуется в OBS и не сохраняется на диск до явного подтверждения. Прямое предложение и отдельное уточнение пользователя от 24 октября 2026 года о том, что предпросмотр одновременно обновляет реальные и тестовые сообщения; уточняет и частично заменяет прежние D41-REQ-12/25/27–29; код и Windows QA отсутствуют.</w:t>
+      </w:r>
+    </w:p>
+    <w:p>
+      <w:pPr/>
+      <w:r>
+        <w:t>D41-REQ-32. Несохранённый черновик оформления и закрытие InOneLine. Если пользователь редактирует оформление платформы и переключается на другую вкладку программы, все несохранённые изменения продолжают храниться в оперативной памяти текущего сеанса. При возвращении на вкладку «Мультичат» черновик и его мгновенный локальный предпросмотр сохраняются; переключение вкладок не сохраняет его автоматически и не применяет к OBS. Если пользователь пытается закрыть программу при наличии несохранённых изменений оформления, показывать диалог с тремя вариантами: «Сохранить» — сохранить черновик оформления и применить его к OBS, затем закрыть программу; «Выйти без сохранения» — отбросить черновик, сохранить прежнее оформление OBS и завершить программу; «Отмена» — не закрывать программу и оставить черновик доступным для продолжения работы. При следующем запуске программы применяется последнее явно сохранённое оформление, а несохранённый черновик не восстанавливается. Это правило относится именно к настройкам оформления; уже принятые немедленные правила доставки, задержки, RAM-лимита и фильтрации не изменяются. Пользователь прямо принял предложенное поведение 24 октября 2026 года. Статус: согласовано как требование D41; код и Windows QA не выполнялись.</w:t>
       </w:r>
     </w:p>
     <w:p>
@@ -18147,7 +18153,7 @@
     <w:p>
       <w:pPr/>
       <w:r>
-        <w:t>Не решено и требует технической проверки: точные пределы ручного значения задержки и лимита памяти; поведение при экстремальной нагрузке и весе медиа; факт доступности всех типовых и нестандартных эмодзи YouTube/стикеров и других платформ; полнота событий удаления и подключения; точные пропорции и точки адаптивного перестроения принятой двухрежимной компоновки вкладки «Мультичат», положение регуляторов и URL-кнопок; штатное сохранение признака «разрешено в OBS» на момент готовности сообщения для надёжного восстановления нескольких браузерных экземпляров. Для D41-REQ-27/28 согласованы место кнопки, образец с текстом, никнеймом, аватаром, знаком платформы и эмодзи, способ закрытия и непрерывный приём настоящего чата; более широкие наборы тестовых медиа не утверждены. D41-REQ-29: одновременное отображение нескольких тестовых образцов принято; визуальное размещение и удобство сравнения на минимальной ширине проверяются при UI-реализации. Не возвращаться к отвергнутому режиму автоматической замены образца одного сервиса другим. Для D41-REQ-30/31 проверить геометрию закреплённых снизу тестовых сообщений при высокой нагрузке и малой высоте; отдельно согласовать судьбу несохранённого черновика оформления при выходе из программы и переключении вкладок. Мгновенное локальное предпросмотр-оформление не следует путать с сохранённым стилем OBS; изменение OBS только по явной кнопке «Сохранить».</w:t>
+        <w:t>Не решено и требует технической проверки: точные пределы ручного значения задержки и лимита памяти; поведение при экстремальной нагрузке и весе медиа; факт доступности всех типовых и нестандартных эмодзи YouTube/стикеров и других платформ; полнота событий удаления и подключения; точные пропорции и точки адаптивного перестроения принятой двухрежимной компоновки вкладки «Мультичат», положение регуляторов и URL-кнопок; штатное сохранение признака «разрешено в OBS» на момент готовности сообщения для надёжного восстановления нескольких браузерных экземпляров. Для D41-REQ-27/28 согласованы место кнопки, образец с текстом, никнеймом, аватаром, знаком платформы и эмодзи, способ закрытия и непрерывный приём настоящего чата; более широкие наборы тестовых медиа не утверждены. D41-REQ-29: одновременное отображение нескольких тестовых образцов принято; визуальное размещение и удобство сравнения на минимальной ширине проверяются при UI-реализации. Не возвращаться к отвергнутому режиму автоматической замены образца одного сервиса другим. Для D41-REQ-30/31/32 проверить геометрию закреплённых снизу тестовых сообщений при высокой нагрузке и малой высоте; отдельно согласовать судьбу несохранённого черновика оформления при выходе из программы и переключении вкладок. Мгновенное локальное предпросмотр-оформление не следует путать с сохранённым стилем OBS; изменение OBS только по явной кнопке «Сохранить».</w:t>
       </w:r>
     </w:p>
     <w:p>
@@ -18159,32 +18165,7 @@
     <w:p>
       <w:pPr/>
       <w:r>
-        <w:t>Источники решений: «Программа для стриминга 70» и продолжение 23–24 октября 2026 года. Отдельные ответы «принимаю», «принимаем», «вариант 2», «так и делаем» относятся к конкретным перечисленным выше вопросам. Последнее решение о мгновенном изменении оформления всех уже отображённых сообщений принято 24 октября 2026 года.</w:t>
-      </w:r>
-      <w:r>
-        <w:t xml:space="preserve"> После этой записи принято дополнительное правило D41-REQ-23: запуск InOneLine посреди эфира не загружает предыдущую переписку. В тот же день пользователь потребовал регистрировать каждое принятое решение в этом документе и синхронизировать его копию на GitHub; правило закреплено в §1.7.</w:t>
-      </w:r>
-      <w:r>
-        <w:t xml:space="preserve"> Дополнение от 24 октября 2026 года: принято D41-REQ-24 — при обычном отключении аккаунта без замены уже отображённые сообщения остаются до обычного вытеснения; ожидавшие в буфере сообщения не выводятся. Отличать это от смены аккаунта по D41-REQ-22.</w:t>
-      </w:r>
-      <w:r>
-        <w:t xml:space="preserve"> 24 октября 2026 года пользователь потребовал разместить мультичат и его настройки в одной вкладке, слева ленту и справа параметры на широком окне, с обязательной адаптацией под 520 × 360 и сохранением узнаваемого общего UI; это внесено в D41-REQ-25. В следующем ответе 24 октября 2026 года пользователь окончательно утвердил минимальную компоновку: чат сверху, настройки снизу с собственной вертикальной прокруткой, а чат остаётся без ручной прокрутки.</w:t>
-      </w:r>
-      <w:r>
-        <w:t xml:space="preserve"> 24 октября 2026 года пользователь принял группировку настроек мультичата в раскрывающиеся блоки и потребовал скрывать настройки неподключённых сервисов; зафиксировано D41-REQ-26.</w:t>
-      </w:r>
-      <w:r>
-        <w:t xml:space="preserve"> 24 октября 2026 года принято D41-REQ-27: отдельное тестовое сообщение только для локального предпросмотра оформления, без добавления в настоящий чат, OBS и историю.</w:t>
-      </w:r>
-      <w:r>
-        <w:t xml:space="preserve"> 24 октября 2026 года принято D41-REQ-28: кнопка тестового сообщения внутри оформления соответствующей подключённой платформы, локальный образец с текстом и графическими элементами, закрытие кнопкой «Закрыть предпросмотр» и возврат к текущей живой ленте без остановки получения сообщений.</w:t>
-      </w:r>
-      <w:r>
-        <w:t xml:space="preserve"> 24 октября 2026 года принято D41-REQ-29: независимый одновременный показ тестовых сообщений каждой подключённой платформы; предложенная замена одного образца другим явно отклонена. При этом не создаются настоящие сообщения или OBS-события.</w:t>
-      </w:r>
-      <w:r>
-        <w:rPr/>
-        <w:t xml:space="preserve"> 24 октября 2026 года пользователь предложил D41-REQ-30/31: настоящие сообщения остаются выше закреплённых снизу тестовых образцов; область чата является немедленным локальным предпросмотром изменений внешнего вида, а опубликованное оформление OBS обновляется только по нажатию «Сохранить». Ранее согласованное мгновенное применение черновых изменений оформления в OBS этим уточнением заменено.</w:t>
+        <w:t>Источники решений: «Программа для стриминга 70» и продолжение 23–24 октября 2026 года. Отдельные ответы «принимаю», «принимаем», «вариант 2», «так и делаем» относятся к конкретным перечисленным выше вопросам. Последнее решение о мгновенном изменении оформления всех уже отображённых сообщений принято 24 октября 2026 года. После этой записи принято дополнительное правило D41-REQ-23: запуск InOneLine посреди эфира не загружает предыдущую переписку. В тот же день пользователь потребовал регистрировать каждое принятое решение в этом документе и синхронизировать его копию на GitHub; правило закреплено в §1.7. Дополнение от 24 октября 2026 года: принято D41-REQ-24 — при обычном отключении аккаунта без замены уже отображённые сообщения остаются до обычного вытеснения; ожидавшие в буфере сообщения не выводятся. Отличать это от смены аккаунта по D41-REQ-22. 24 октября 2026 года пользователь потребовал разместить мультичат и его настройки в одной вкладке, слева ленту и справа параметры на широком окне, с обязательной адаптацией под 520 × 360 и сохранением узнаваемого общего UI; это внесено в D41-REQ-25. В следующем ответе 24 октября 2026 года пользователь окончательно утвердил минимальную компоновку: чат сверху, настройки снизу с собственной вертикальной прокруткой, а чат остаётся без ручной прокрутки. 24 октября 2026 года пользователь принял группировку настроек мультичата в раскрывающиеся блоки и потребовал скрывать настройки неподключённых сервисов; зафиксировано D41-REQ-26. 24 октября 2026 года принято D41-REQ-27: отдельное тестовое сообщение только для локального предпросмотра оформления, без добавления в настоящий чат, OBS и историю. 24 октября 2026 года принято D41-REQ-28: кнопка тестового сообщения внутри оформления соответствующей подключённой платформы, локальный образец с текстом и графическими элементами, закрытие кнопкой «Закрыть предпросмотр» и возврат к текущей живой ленте без остановки получения сообщений. 24 октября 2026 года принято D41-REQ-29: независимый одновременный показ тестовых сообщений каждой подключённой платформы; предложенная замена одного образца другим явно отклонена. При этом не создаются настоящие сообщения или OBS-события. 24 октября 2026 года пользователь предложил D41-REQ-30/31: настоящие сообщения остаются выше закреплённых снизу тестовых образцов; область чата является немедленным локальным предпросмотром изменений внешнего вида, а опубликованное оформление OBS обновляется только по нажатию «Сохранить». Ранее согласованное мгновенное применение черновых изменений оформления в OBS этим уточнением заменено. 24 октября 2026 года пользователь принял сохранение черновика при смене вкладки и диалог закрытия из D41-REQ-32, а также отдельно подчеркнул обязательное одновременное мгновенное изменение ВСЕХ тестовых и реальных сообщений в локальном предпросмотре D41-REQ-12/31; OBS по-прежнему обновляется только после «Сохранить».</w:t>
       </w:r>
     </w:p>
     <w:p>

</xml_diff>

<commit_message>
docs: align multichat browser preview with rules editor; accept background and glow (D41-REQ-33/34)
</commit_message>
<xml_diff>
--- a/docs/Правила_и_дальнейший_распорядок_работ.docx
+++ b/docs/Правила_и_дальнейший_распорядок_работ.docx
@@ -18045,7 +18045,7 @@
     <w:p>
       <w:pPr/>
       <w:r>
-        <w:t>D41-REQ-18. Один стабильный локальный URL и одно состояние для любого количества одинаковых браузерных источников OBS. Даже если сцена неактивна, программа продолжает принимать/обрабатывать сообщения и поддерживать текущую ленту. При возвращении на сцену или пересоздании источника показывается актуальный разрешённый для OBS срез RAM, а не замороженная лента прошлого состояния и не ускоренная прокрутка пропущенного. Экземпляры могут быть разного размера, но имеют одинаковое содержание и настройки. Предусмотреть существующие кнопки «Копировать URL» и «Открыть предпросмотр».</w:t>
+        <w:t>D41-REQ-18. Один стабильный локальный URL и одно состояние для любого количества одинаковых браузерных источников OBS. Даже если сцена неактивна, программа продолжает принимать/обрабатывать сообщения и поддерживать текущую ленту. При возвращении на сцену или пересоздании источника показывается актуальный разрешённый для OBS срез RAM, а не замороженная лента прошлого состояния и не ускоренная прокрутка пропущенного. Экземпляры могут быть разного размера, но имеют одинаковое содержание и настройки. Предусмотреть существующие кнопки «Копировать URL» и «Проверить в браузере» (точное поведение второго действия — D41-REQ-33).</w:t>
       </w:r>
     </w:p>
     <w:p>
@@ -18102,7 +18102,7 @@
     <w:p>
       <w:pPr/>
       <w:r>
-        <w:t>D41-REQ-26. Организация панели настроек «Мультичата» внутри единой вкладки: четыре раскрываемых и сворачиваемых блока: «Общие настройки» (задержка, лимит сообщений, показ времени), «Подключения и OBS» (состояния сервисов, галочки отображения чата каждого подключённого сервиса в OBS, быстрые кнопки «Копировать URL» и «Открыть предпросмотр»), «Оформление Twitch», «Оформление YouTube» (независимые варианты оригинального/настраиваемого оформления и соответствующие параметры). Для будущих подключаемых платформ формируется аналогичный собственный блок оформления без отдельного окна или новой вкладки. Если учётная запись сервиса не подключена в существующем центре подключений, блок её настроек оформления НЕ ОТОБРАЖАЕТСЯ целиком, включая подпись и внутренние контролы; настройки не удаляются и после повторного подключения возвращаются сохранёнными. Общие настройки остаются доступными независимо от наличия подключений; в блоке «Подключения и OBS» остаются сведения о состоянии подключений, чтобы оператор понимал отсутствие источника. При временной сетевой ошибке или ожидании авторизации ранее подключённого аккаунта блок не скрывается только по причине временной недоступности сервиса: сохраняется возможность видеть настройки и состояние. Автоматическая видимость блоков не изменяет уже принятые D41-REQ-22/24 правила очистки или сохранения ранее показанных сообщений. Группировка и скрытие неприменимых настроек напрямую приняты пользователем 24 октября 2026 года; применять общий GLOBAL-UI-001 и компактное перестроение D41-REQ-25. Реализация, ручная проверка Windows и QA не выполнены.</w:t>
+        <w:t>D41-REQ-26. Организация панели настроек «Мультичата» внутри единой вкладки: четыре раскрываемых и сворачиваемых блока: «Общие настройки» (задержка, лимит сообщений, показ времени), «Подключения и OBS» (состояния сервисов, галочки отображения чата каждого подключённого сервиса в OBS, быстрые кнопки «Копировать URL» и «Проверить в браузере»), «Оформление Twitch», «Оформление YouTube» (независимые варианты оригинального/настраиваемого оформления и соответствующие параметры). Для будущих подключаемых платформ формируется аналогичный собственный блок оформления без отдельного окна или новой вкладки. Если учётная запись сервиса не подключена в существующем центре подключений, блок её настроек оформления НЕ ОТОБРАЖАЕТСЯ целиком, включая подпись и внутренние контролы; настройки не удаляются и после повторного подключения возвращаются сохранёнными. Общие настройки остаются доступными независимо от наличия подключений; в блоке «Подключения и OBS» остаются сведения о состоянии подключений, чтобы оператор понимал отсутствие источника. При временной сетевой ошибке или ожидании авторизации ранее подключённого аккаунта блок не скрывается только по причине временной недоступности сервиса: сохраняется возможность видеть настройки и состояние. Автоматическая видимость блоков не изменяет уже принятые D41-REQ-22/24 правила очистки или сохранения ранее показанных сообщений. Группировка и скрытие неприменимых настроек напрямую приняты пользователем 24 октября 2026 года; применять общий GLOBAL-UI-001 и компактное перестроение D41-REQ-25. Реализация, ручная проверка Windows и QA не выполнены.</w:t>
       </w:r>
     </w:p>
     <w:p>
@@ -18132,13 +18132,25 @@
     <w:p>
       <w:pPr/>
       <w:r>
-        <w:t>D41-REQ-31. Редактирование оформления с локальным немедленным предпросмотром и отдельным применением в OBS. Область чата самой программы одновременно служит живой лентой и предпросмотром внешнего вида. При изменении оформления конкретной платформы (цвет, шрифт, рамка, фон, размеры, исходный/настраиваемый режим) новые значения БЕЗ кнопки подтверждения немедленно применяются КО ВСЕМ отображаемым в программе реальным сообщениям (в том числе получаемым после изменения оформления) И ко всем включённым тестовым сообщениям этой платформы одновременно. Локальный предпросмотр не требует подтверждения или нажатия «Сохранить». В браузерном виджете OBS до нажатия «Сохранить» продолжает использоваться последнее сохранённое оформление. После нажатия «Сохранить» новые параметры оформления соответствующей платформы сохраняются и передаются в OBS: меняется оформление всех ещё отображаемых сообщений этой платформы, а содержание и порядок остаются прежними; изменения других платформ не затрагиваются. Применение через «Сохранить» относится именно к настройкам ВНЕШНЕГО ВИДА, а не отменяет немедленную работу ранее согласованных параметров задержки, лимита RAM и фильтров вывода. Поведение несохранённого черновика при переключении вкладок и закрытии программы окончательно согласовано в D41-REQ-32; сам черновик не публикуется в OBS и не сохраняется на диск до явного подтверждения. Прямое предложение и отдельное уточнение пользователя от 24 октября 2026 года о том, что предпросмотр одновременно обновляет реальные и тестовые сообщения; уточняет и частично заменяет прежние D41-REQ-12/25/27–29; код и Windows QA отсутствуют.</w:t>
+        <w:t>D41-REQ-31. Редактирование оформления с локальным немедленным предпросмотром и отдельным применением в OBS. Область чата самой программы одновременно служит живой лентой и предпросмотром внешнего вида. При изменении оформления конкретной платформы (цвет, шрифт, рамка отдельного сообщения, фон сообщений, общий фон/контур мультичата, размеры, исходный/настраиваемый режим) новые значения БЕЗ кнопки подтверждения немедленно применяются КО ВСЕМ отображаемым в программе реальным сообщениям (в том числе получаемым после изменения оформления) И ко всем включённым тестовым сообщениям этой платформы одновременно. Локальный предпросмотр не требует подтверждения или нажатия «Сохранить». В браузерном виджете OBS до нажатия «Сохранить» продолжает использоваться последнее сохранённое оформление. После нажатия «Сохранить» новые параметры оформления соответствующей платформы сохраняются и передаются в OBS: меняется оформление всех ещё отображаемых сообщений этой платформы, а содержание и порядок остаются прежними; изменения других платформ не затрагиваются. Применение через «Сохранить» относится именно к настройкам ВНЕШНЕГО ВИДА, а не отменяет немедленную работу ранее согласованных параметров задержки, лимита RAM и фильтров вывода. Поведение несохранённого черновика при переключении вкладок и закрытии программы окончательно согласовано в D41-REQ-32; сам черновик не публикуется в OBS и не сохраняется на диск до явного подтверждения. Прямое предложение и отдельное уточнение пользователя от 24 октября 2026 года о том, что предпросмотр одновременно обновляет реальные и тестовые сообщения; уточняет и частично заменяет прежние D41-REQ-12/25/27–29; код и Windows QA отсутствуют.</w:t>
       </w:r>
     </w:p>
     <w:p>
       <w:pPr/>
       <w:r>
         <w:t>D41-REQ-32. Несохранённый черновик оформления и закрытие InOneLine. Если пользователь редактирует оформление платформы и переключается на другую вкладку программы, все несохранённые изменения продолжают храниться в оперативной памяти текущего сеанса. При возвращении на вкладку «Мультичат» черновик и его мгновенный локальный предпросмотр сохраняются; переключение вкладок не сохраняет его автоматически и не применяет к OBS. Если пользователь пытается закрыть программу при наличии несохранённых изменений оформления, показывать диалог с тремя вариантами: «Сохранить» — сохранить черновик оформления и применить его к OBS, затем закрыть программу; «Выйти без сохранения» — отбросить черновик, сохранить прежнее оформление OBS и завершить программу; «Отмена» — не закрывать программу и оставить черновик доступным для продолжения работы. При следующем запуске программы применяется последнее явно сохранённое оформление, а несохранённый черновик не восстанавливается. Это правило относится именно к настройкам оформления; уже принятые немедленные правила доставки, задержки, RAM-лимита и фильтрации не изменяются. Пользователь прямо принял предложенное поведение 24 октября 2026 года. Статус: согласовано как требование D41; код и Windows QA не выполнялись.</w:t>
+      </w:r>
+    </w:p>
+    <w:p>
+      <w:pPr/>
+      <w:r>
+        <w:t>D41-REQ-33. Проверка в браузере по принятой схеме редактора правил аукциона (прямое предложение пользователя 24 октября 2026 года). Вкладка «Мультичат» сама служит операторским редактором и живым предпросмотром чернового оформления, а не требует отдельного окна редактора: все изменения немедленно видны на реальных и включённых тестовых сообщениях (D41-REQ-30/31). В блоке управления OBS предусмотреть кнопку «Проверить в браузере», которая открывает самостоятельный браузерный просмотр локального виджета по существующей инфраструктуре; в браузере показывается ПОСЛЕДНЕЕ СОХРАНЁННОЕ оформление, как сейчас в редакторе правил, а не несохранённый черновик. После «Сохранить» эта же браузерная страница и реальный OBS-виджет используют новое оформление. Прежнее рабочее название кнопки «Открыть предпросмотр» в D41-REQ-18/26 заменяется на «Проверить в браузере»; отдельные браузерные URL для черновика и новая система предпросмотра автоматически не утверждаются. Переиспользовать существующую схему редактора правил аукциона и проверить одинаковость сохранённых данных в OBS и браузере.</w:t>
+      </w:r>
+    </w:p>
+    <w:p>
+      <w:pPr/>
+      <w:r>
+        <w:t>D41-REQ-34. Дополнительное оформление общего мультичата (прямое предложение пользователя 24 октября 2026 года). В настройках мультичата добавить выбор ФОНА для области/виджета мультичата, отдельно от уже принятого фона карточек отдельных сообщений (D41-REQ-11). Добавить СВЕТЯЩИЙСЯ КОНТУР общего виджета чата, с настройкой его цвета и отдельной возможностью полностью ВЫКЛЮЧИТЬ свечение. Значения относятся к редактируемому оформлению: в локальной области предпросмотра видны сразу, а в браузере и OBS применяются после «Сохранить» по D41-REQ-31/33; несохранённые изменения подчиняются D41-REQ-32. В первую очередь переиспользовать действующие элементы редактора правил (выбор фонового медиа, переключение glow и цвет контура) и общую библиотеку медиа; не заводить ещё один импортёр/формат хранения без доказанной необходимости. Точные допустимые фоновые форматы, параметры прозрачности и поведения фона/контура при отсутствии сообщений, размеры/толщина контура и место соответствующих контролов определить отдельно при продолжении согласования и технической проверке. Это предложение пользователя относится к внешнему виду D41, а не к изменению поведения уже реализованного редактора правил.</w:t>
       </w:r>
     </w:p>
     <w:p>
@@ -18153,7 +18165,7 @@
     <w:p>
       <w:pPr/>
       <w:r>
-        <w:t>Не решено и требует технической проверки: точные пределы ручного значения задержки и лимита памяти; поведение при экстремальной нагрузке и весе медиа; факт доступности всех типовых и нестандартных эмодзи YouTube/стикеров и других платформ; полнота событий удаления и подключения; точные пропорции и точки адаптивного перестроения принятой двухрежимной компоновки вкладки «Мультичат», положение регуляторов и URL-кнопок; штатное сохранение признака «разрешено в OBS» на момент готовности сообщения для надёжного восстановления нескольких браузерных экземпляров. Для D41-REQ-27/28 согласованы место кнопки, образец с текстом, никнеймом, аватаром, знаком платформы и эмодзи, способ закрытия и непрерывный приём настоящего чата; более широкие наборы тестовых медиа не утверждены. D41-REQ-29: одновременное отображение нескольких тестовых образцов принято; визуальное размещение и удобство сравнения на минимальной ширине проверяются при UI-реализации. Не возвращаться к отвергнутому режиму автоматической замены образца одного сервиса другим. Для D41-REQ-30/31/32 проверить геометрию закреплённых снизу тестовых сообщений при высокой нагрузке и малой высоте; отдельно согласовать судьбу несохранённого черновика оформления при выходе из программы и переключении вкладок. Мгновенное локальное предпросмотр-оформление не следует путать с сохранённым стилем OBS; изменение OBS только по явной кнопке «Сохранить».</w:t>
+        <w:t>Не решено и требует технической проверки: точные пределы ручного значения задержки и лимита памяти; поведение при экстремальной нагрузке и весе медиа; факт доступности всех типовых и нестандартных эмодзи YouTube/стикеров и других платформ; полнота событий удаления и подключения; точные пропорции и точки адаптивного перестроения принятой двухрежимной компоновки вкладки «Мультичат», положение регуляторов и URL-кнопок; штатное сохранение признака «разрешено в OBS» на момент готовности сообщения для надёжного восстановления нескольких браузерных экземпляров. Для D41-REQ-27/28 согласованы место кнопки, образец с текстом, никнеймом, аватаром, знаком платформы и эмодзи, способ закрытия и непрерывный приём настоящего чата; более широкие наборы тестовых медиа не утверждены. D41-REQ-29: одновременное отображение нескольких тестовых образцов принято; визуальное размещение и удобство сравнения на минимальной ширине проверяются при UI-реализации. Не возвращаться к отвергнутому режиму автоматической замены образца одного сервиса другим. Для D41-REQ-30/31/32 проверить геометрию закреплённых снизу тестовых сообщений при высокой нагрузке и малой высоте; отдельно согласовать судьбу несохранённого черновика оформления при выходе из программы и переключении вкладок. Мгновенное локальное предпросмотр-оформление не следует путать с сохранённым стилем OBS; изменение OBS только по явной кнопке «Сохранить». Дополнение D41-REQ-33/34: проверить фактическую реализацию сохранённого browser preview редактора правил, перенос уже существующих фоновых медиа и светящегося контура в мультичат, варианты изображения/анимации, отсутствие сообщений при включённом фоне/контуре (с учётом прежнего D41-REQ-17 «пустой OBS прозрачен»), поведение общей рамки в окне минимального размера. До отдельного решения не считать это изменение отменой прозрачности пустого OBS-виджета.</w:t>
       </w:r>
     </w:p>
     <w:p>
@@ -18165,7 +18177,7 @@
     <w:p>
       <w:pPr/>
       <w:r>
-        <w:t>Источники решений: «Программа для стриминга 70» и продолжение 23–24 октября 2026 года. Отдельные ответы «принимаю», «принимаем», «вариант 2», «так и делаем» относятся к конкретным перечисленным выше вопросам. Последнее решение о мгновенном изменении оформления всех уже отображённых сообщений принято 24 октября 2026 года. После этой записи принято дополнительное правило D41-REQ-23: запуск InOneLine посреди эфира не загружает предыдущую переписку. В тот же день пользователь потребовал регистрировать каждое принятое решение в этом документе и синхронизировать его копию на GitHub; правило закреплено в §1.7. Дополнение от 24 октября 2026 года: принято D41-REQ-24 — при обычном отключении аккаунта без замены уже отображённые сообщения остаются до обычного вытеснения; ожидавшие в буфере сообщения не выводятся. Отличать это от смены аккаунта по D41-REQ-22. 24 октября 2026 года пользователь потребовал разместить мультичат и его настройки в одной вкладке, слева ленту и справа параметры на широком окне, с обязательной адаптацией под 520 × 360 и сохранением узнаваемого общего UI; это внесено в D41-REQ-25. В следующем ответе 24 октября 2026 года пользователь окончательно утвердил минимальную компоновку: чат сверху, настройки снизу с собственной вертикальной прокруткой, а чат остаётся без ручной прокрутки. 24 октября 2026 года пользователь принял группировку настроек мультичата в раскрывающиеся блоки и потребовал скрывать настройки неподключённых сервисов; зафиксировано D41-REQ-26. 24 октября 2026 года принято D41-REQ-27: отдельное тестовое сообщение только для локального предпросмотра оформления, без добавления в настоящий чат, OBS и историю. 24 октября 2026 года принято D41-REQ-28: кнопка тестового сообщения внутри оформления соответствующей подключённой платформы, локальный образец с текстом и графическими элементами, закрытие кнопкой «Закрыть предпросмотр» и возврат к текущей живой ленте без остановки получения сообщений. 24 октября 2026 года принято D41-REQ-29: независимый одновременный показ тестовых сообщений каждой подключённой платформы; предложенная замена одного образца другим явно отклонена. При этом не создаются настоящие сообщения или OBS-события. 24 октября 2026 года пользователь предложил D41-REQ-30/31: настоящие сообщения остаются выше закреплённых снизу тестовых образцов; область чата является немедленным локальным предпросмотром изменений внешнего вида, а опубликованное оформление OBS обновляется только по нажатию «Сохранить». Ранее согласованное мгновенное применение черновых изменений оформления в OBS этим уточнением заменено. 24 октября 2026 года пользователь принял сохранение черновика при смене вкладки и диалог закрытия из D41-REQ-32, а также отдельно подчеркнул обязательное одновременное мгновенное изменение ВСЕХ тестовых и реальных сообщений в локальном предпросмотре D41-REQ-12/31; OBS по-прежнему обновляется только после «Сохранить».</w:t>
+        <w:t>Источники решений: «Программа для стриминга 70» и продолжение 23–24 октября 2026 года. Отдельные ответы «принимаю», «принимаем», «вариант 2», «так и делаем» относятся к конкретным перечисленным выше вопросам. Последнее решение о мгновенном изменении оформления всех уже отображённых сообщений принято 24 октября 2026 года. После этой записи принято дополнительное правило D41-REQ-23: запуск InOneLine посреди эфира не загружает предыдущую переписку. В тот же день пользователь потребовал регистрировать каждое принятое решение в этом документе и синхронизировать его копию на GitHub; правило закреплено в §1.7. Дополнение от 24 октября 2026 года: принято D41-REQ-24 — при обычном отключении аккаунта без замены уже отображённые сообщения остаются до обычного вытеснения; ожидавшие в буфере сообщения не выводятся. Отличать это от смены аккаунта по D41-REQ-22. 24 октября 2026 года пользователь потребовал разместить мультичат и его настройки в одной вкладке, слева ленту и справа параметры на широком окне, с обязательной адаптацией под 520 × 360 и сохранением узнаваемого общего UI; это внесено в D41-REQ-25. В следующем ответе 24 октября 2026 года пользователь окончательно утвердил минимальную компоновку: чат сверху, настройки снизу с собственной вертикальной прокруткой, а чат остаётся без ручной прокрутки. 24 октября 2026 года пользователь принял группировку настроек мультичата в раскрывающиеся блоки и потребовал скрывать настройки неподключённых сервисов; зафиксировано D41-REQ-26. 24 октября 2026 года принято D41-REQ-27: отдельное тестовое сообщение только для локального предпросмотра оформления, без добавления в настоящий чат, OBS и историю. 24 октября 2026 года принято D41-REQ-28: кнопка тестового сообщения внутри оформления соответствующей подключённой платформы, локальный образец с текстом и графическими элементами, закрытие кнопкой «Закрыть предпросмотр» и возврат к текущей живой ленте без остановки получения сообщений. 24 октября 2026 года принято D41-REQ-29: независимый одновременный показ тестовых сообщений каждой подключённой платформы; предложенная замена одного образца другим явно отклонена. При этом не создаются настоящие сообщения или OBS-события. 24 октября 2026 года пользователь предложил D41-REQ-30/31: настоящие сообщения остаются выше закреплённых снизу тестовых образцов; область чата является немедленным локальным предпросмотром изменений внешнего вида, а опубликованное оформление OBS обновляется только по нажатию «Сохранить». Ранее согласованное мгновенное применение черновых изменений оформления в OBS этим уточнением заменено. 24 октября 2026 года пользователь принял сохранение черновика при смене вкладки и диалог закрытия из D41-REQ-32, а также отдельно подчеркнул обязательное одновременное мгновенное изменение ВСЕХ тестовых и реальных сообщений в локальном предпросмотре D41-REQ-12/31; OBS по-прежнему обновляется только после «Сохранить». 24 октября 2026 года пользователь прямо предложил сопоставить локальную область редактирования/предпросмотра мультичата с редактором правил аукциона, добавить кнопку браузерной проверки, возможность выбора фона и светящийся контур с регулируемым цветом и полным отключением; записано как D41-REQ-33/34. Детали, перечисленные в §13.6.7, ещё не согласованы.</w:t>
       </w:r>
     </w:p>
     <w:p>

</xml_diff>

<commit_message>
docs: approve both empty-chat overlay visibility modes (D41-REQ-35)
</commit_message>
<xml_diff>
--- a/docs/Правила_и_дальнейший_распорядок_работ.docx
+++ b/docs/Правила_и_дальнейший_распорядок_работ.docx
@@ -18039,7 +18039,7 @@
     <w:p>
       <w:pPr/>
       <w:r>
-        <w:t>D41-REQ-17. Пустая вкладка программы показывает «Ожидание сообщений», а статусы подключений видны только в программе. Пустой OBS-виджет полностью прозрачный, без сообщений о соединении, ошибках или ожидании. Появление сообщения соответствует задержке, но без декоративной анимации.</w:t>
+        <w:t>D41-REQ-17. Пустая вкладка программы показывает «Ожидание сообщений», а статусы подключений видны только в программе. Пустой OBS-виджет не выводит сообщений о соединении, ошибках или ожидании. Ранее принятая обязательная полная прозрачность пустого OBS-виджета уточнена более поздним прямым решением пользователя от 24 октября 2026 года: прозрачность или постоянный показ фона/контура теперь выбирает сам пользователь по D41-REQ-35. Новые сообщения поступают с принятой задержкой и без анимации отдельных сообщений (D41-REQ-13); способ появления и исчезновения области всего виджета отдельно согласовывается.</w:t>
       </w:r>
     </w:p>
     <w:p>
@@ -18150,7 +18150,13 @@
     <w:p>
       <w:pPr/>
       <w:r>
-        <w:t>D41-REQ-34. Дополнительное оформление общего мультичата (прямое предложение пользователя 24 октября 2026 года). В настройках мультичата добавить выбор ФОНА для области/виджета мультичата, отдельно от уже принятого фона карточек отдельных сообщений (D41-REQ-11). Добавить СВЕТЯЩИЙСЯ КОНТУР общего виджета чата, с настройкой его цвета и отдельной возможностью полностью ВЫКЛЮЧИТЬ свечение. Значения относятся к редактируемому оформлению: в локальной области предпросмотра видны сразу, а в браузере и OBS применяются после «Сохранить» по D41-REQ-31/33; несохранённые изменения подчиняются D41-REQ-32. В первую очередь переиспользовать действующие элементы редактора правил (выбор фонового медиа, переключение glow и цвет контура) и общую библиотеку медиа; не заводить ещё один импортёр/формат хранения без доказанной необходимости. Точные допустимые фоновые форматы, параметры прозрачности и поведения фона/контура при отсутствии сообщений, размеры/толщина контура и место соответствующих контролов определить отдельно при продолжении согласования и технической проверке. Это предложение пользователя относится к внешнему виду D41, а не к изменению поведения уже реализованного редактора правил.</w:t>
+        <w:t>D41-REQ-34. Дополнительное оформление общего мультичата (прямое предложение пользователя 24 октября 2026 года). В настройках мультичата добавить выбор ФОНА для области/виджета мультичата, отдельно от уже принятого фона карточек отдельных сообщений (D41-REQ-11). Добавить СВЕТЯЩИЙСЯ КОНТУР общего виджета чата, с настройкой его цвета и отдельной возможностью полностью ВЫКЛЮЧИТЬ свечение. Значения относятся к редактируемому оформлению: в локальной области предпросмотра видны сразу, а в браузере и OBS применяются после «Сохранить» по D41-REQ-31/33; несохранённые изменения подчиняются D41-REQ-32. В первую очередь переиспользовать действующие элементы редактора правил (выбор фонового медиа, переключение glow и цвет контура) и общую библиотеку медиа; не заводить ещё один импортёр/формат хранения без доказанной необходимости. Точные допустимые фоновые форматы, параметры прозрачности, размеры/толщина контура и место соответствующих контролов определить отдельно при продолжении согласования и технической проверке. Поведение фона и контура при отсутствии сообщений утверждено отдельно в D41-REQ-35. Это предложение пользователя относится к внешнему виду D41, а не к изменению поведения уже реализованного редактора правил.</w:t>
+      </w:r>
+    </w:p>
+    <w:p>
+      <w:pPr/>
+      <w:r>
+        <w:t>D41-REQ-35. РЕЖИМ ВИДИМОСТИ ПУСТОГО OBS-ВИДЖЕТА (прямое решение пользователя от 24 октября 2026 года; статус: требования согласованы, код не реализован). В настройках общего мультичата пользователь выбирает один из ДВУХ режимов поведения браузерного OBS-виджета в состоянии без отображаемых сообщений: (1) «Скрывать, когда чат пуст» — весь виджет, включая выбранный общий фон и светящийся контур, полностью прозрачен; при появлении первого допущенного к показу сообщения виджет вновь становится видимым. (2) «Показывать постоянно» — выбранные общий фон и контур продолжают отображаться и при отсутствии сообщений, новые сообщения показываются внутри. Это выбор одного общего режима виджета, а не платформенных настроек Twitch/YouTube; режим распространяется на все экземпляры одного OBS URL и не меняет приём, очередность, буфер, RAM-историю и отдельные правила допуска платформ по D41-REQ-15/16. Параметр относится к оформлению: локальный предпросмотр реагирует на изменения сразу, OBS и браузер применяют сохранённый выбор после «Сохранить» (D41-REQ-31/33). Данное более позднее решение заменяет категорическое правило полной прозрачности пустого OBS-виджета в старой редакции D41-REQ-17, не отменяя отсутствия служебных надписей в OBS. ОТКРЫТО ДЛЯ ОТДЕЛЬНОГО СОГЛАСОВАНИЯ: что именно считать моментом «чат пуст», если ранее полученные сообщения ещё хранятся в RAM; нужен ли тайм-аут неактивности для скрытия без удаления из RAM; как визуально появляется/исчезает вся область виджета (мгновенно, плавно и т. п.) и каковы параметры эффекта. Пользователь потребовал проработать появление виджета из скрытого состояния, но конкретную анимацию ещё не утверждал. Запрет анимации отдельных сообщений по D41-REQ-13 сохраняется.</w:t>
       </w:r>
     </w:p>
     <w:p>
@@ -18165,7 +18171,7 @@
     <w:p>
       <w:pPr/>
       <w:r>
-        <w:t>Не решено и требует технической проверки: точные пределы ручного значения задержки и лимита памяти; поведение при экстремальной нагрузке и весе медиа; факт доступности всех типовых и нестандартных эмодзи YouTube/стикеров и других платформ; полнота событий удаления и подключения; точные пропорции и точки адаптивного перестроения принятой двухрежимной компоновки вкладки «Мультичат», положение регуляторов и URL-кнопок; штатное сохранение признака «разрешено в OBS» на момент готовности сообщения для надёжного восстановления нескольких браузерных экземпляров. Для D41-REQ-27/28 согласованы место кнопки, образец с текстом, никнеймом, аватаром, знаком платформы и эмодзи, способ закрытия и непрерывный приём настоящего чата; более широкие наборы тестовых медиа не утверждены. D41-REQ-29: одновременное отображение нескольких тестовых образцов принято; визуальное размещение и удобство сравнения на минимальной ширине проверяются при UI-реализации. Не возвращаться к отвергнутому режиму автоматической замены образца одного сервиса другим. Для D41-REQ-30/31/32 проверить геометрию закреплённых снизу тестовых сообщений при высокой нагрузке и малой высоте; отдельно согласовать судьбу несохранённого черновика оформления при выходе из программы и переключении вкладок. Мгновенное локальное предпросмотр-оформление не следует путать с сохранённым стилем OBS; изменение OBS только по явной кнопке «Сохранить». Дополнение D41-REQ-33/34: проверить фактическую реализацию сохранённого browser preview редактора правил, перенос уже существующих фоновых медиа и светящегося контура в мультичат, варианты изображения/анимации, отсутствие сообщений при включённом фоне/контуре (с учётом прежнего D41-REQ-17 «пустой OBS прозрачен»), поведение общей рамки в окне минимального размера. До отдельного решения не считать это изменение отменой прозрачности пустого OBS-виджета.</w:t>
+        <w:t>Не решено и требует технической проверки: точные пределы ручного значения задержки и лимита памяти; поведение при экстремальной нагрузке и весе медиа; факт доступности всех типовых и нестандартных эмодзи YouTube/стикеров и других платформ; полнота событий удаления и подключения; точные пропорции и точки адаптивного перестроения принятой двухрежимной компоновки вкладки «Мультичат», положение регуляторов и URL-кнопок; штатное сохранение признака «разрешено в OBS» на момент готовности сообщения для надёжного восстановления нескольких браузерных экземпляров. Для D41-REQ-27/28 согласованы место кнопки, образец с текстом, никнеймом, аватаром, знаком платформы и эмодзи, способ закрытия и непрерывный приём настоящего чата; более широкие наборы тестовых медиа не утверждены. D41-REQ-29: одновременное отображение нескольких тестовых образцов принято; визуальное размещение и удобство сравнения на минимальной ширине проверяются при UI-реализации. Не возвращаться к отвергнутому режиму автоматической замены образца одного сервиса другим. Для D41-REQ-30/31/32 проверить геометрию закреплённых снизу тестовых сообщений при высокой нагрузке и малой высоте; отдельно согласовать судьбу несохранённого черновика оформления при выходе из программы и переключении вкладок. Мгновенное локальное предпросмотр-оформление не следует путать с сохранённым стилем OBS; изменение OBS только по явной кнопке «Сохранить». Дополнение D41-REQ-33/34: проверить фактическую реализацию сохранённого browser preview редактора правил, перенос уже существующих фоновых медиа и светящегося контура в мультичат, варианты изображения/анимации, два принятых режима пустого виджета по D41-REQ-35, поведение общей рамки в окне минимального размера. Полная прозрачность пустого OBS больше не обязательна во всех случаях: пользователь выбирает режим по D41-REQ-35. Требуют отдельного согласования критерий пустоты/тайм-аут скрытия при неактивности и анимация появления/исчезновения всего виджета, а не отдельных сообщений.</w:t>
       </w:r>
     </w:p>
     <w:p>
@@ -18177,7 +18183,7 @@
     <w:p>
       <w:pPr/>
       <w:r>
-        <w:t>Источники решений: «Программа для стриминга 70» и продолжение 23–24 октября 2026 года. Отдельные ответы «принимаю», «принимаем», «вариант 2», «так и делаем» относятся к конкретным перечисленным выше вопросам. Последнее решение о мгновенном изменении оформления всех уже отображённых сообщений принято 24 октября 2026 года. После этой записи принято дополнительное правило D41-REQ-23: запуск InOneLine посреди эфира не загружает предыдущую переписку. В тот же день пользователь потребовал регистрировать каждое принятое решение в этом документе и синхронизировать его копию на GitHub; правило закреплено в §1.7. Дополнение от 24 октября 2026 года: принято D41-REQ-24 — при обычном отключении аккаунта без замены уже отображённые сообщения остаются до обычного вытеснения; ожидавшие в буфере сообщения не выводятся. Отличать это от смены аккаунта по D41-REQ-22. 24 октября 2026 года пользователь потребовал разместить мультичат и его настройки в одной вкладке, слева ленту и справа параметры на широком окне, с обязательной адаптацией под 520 × 360 и сохранением узнаваемого общего UI; это внесено в D41-REQ-25. В следующем ответе 24 октября 2026 года пользователь окончательно утвердил минимальную компоновку: чат сверху, настройки снизу с собственной вертикальной прокруткой, а чат остаётся без ручной прокрутки. 24 октября 2026 года пользователь принял группировку настроек мультичата в раскрывающиеся блоки и потребовал скрывать настройки неподключённых сервисов; зафиксировано D41-REQ-26. 24 октября 2026 года принято D41-REQ-27: отдельное тестовое сообщение только для локального предпросмотра оформления, без добавления в настоящий чат, OBS и историю. 24 октября 2026 года принято D41-REQ-28: кнопка тестового сообщения внутри оформления соответствующей подключённой платформы, локальный образец с текстом и графическими элементами, закрытие кнопкой «Закрыть предпросмотр» и возврат к текущей живой ленте без остановки получения сообщений. 24 октября 2026 года принято D41-REQ-29: независимый одновременный показ тестовых сообщений каждой подключённой платформы; предложенная замена одного образца другим явно отклонена. При этом не создаются настоящие сообщения или OBS-события. 24 октября 2026 года пользователь предложил D41-REQ-30/31: настоящие сообщения остаются выше закреплённых снизу тестовых образцов; область чата является немедленным локальным предпросмотром изменений внешнего вида, а опубликованное оформление OBS обновляется только по нажатию «Сохранить». Ранее согласованное мгновенное применение черновых изменений оформления в OBS этим уточнением заменено. 24 октября 2026 года пользователь принял сохранение черновика при смене вкладки и диалог закрытия из D41-REQ-32, а также отдельно подчеркнул обязательное одновременное мгновенное изменение ВСЕХ тестовых и реальных сообщений в локальном предпросмотре D41-REQ-12/31; OBS по-прежнему обновляется только после «Сохранить». 24 октября 2026 года пользователь прямо предложил сопоставить локальную область редактирования/предпросмотра мультичата с редактором правил аукциона, добавить кнопку браузерной проверки, возможность выбора фона и светящийся контур с регулируемым цветом и полным отключением; записано как D41-REQ-33/34. Детали, перечисленные в §13.6.7, ещё не согласованы.</w:t>
+        <w:t>Источники решений: «Программа для стриминга 70» и продолжение 23–24 октября 2026 года. Отдельные ответы «принимаю», «принимаем», «вариант 2», «так и делаем» относятся к конкретным перечисленным выше вопросам. Последнее решение о мгновенном изменении оформления всех уже отображённых сообщений принято 24 октября 2026 года. После этой записи принято дополнительное правило D41-REQ-23: запуск InOneLine посреди эфира не загружает предыдущую переписку. В тот же день пользователь потребовал регистрировать каждое принятое решение в этом документе и синхронизировать его копию на GitHub; правило закреплено в §1.7. Дополнение от 24 октября 2026 года: принято D41-REQ-24 — при обычном отключении аккаунта без замены уже отображённые сообщения остаются до обычного вытеснения; ожидавшие в буфере сообщения не выводятся. Отличать это от смены аккаунта по D41-REQ-22. 24 октября 2026 года пользователь потребовал разместить мультичат и его настройки в одной вкладке, слева ленту и справа параметры на широком окне, с обязательной адаптацией под 520 × 360 и сохранением узнаваемого общего UI; это внесено в D41-REQ-25. В следующем ответе 24 октября 2026 года пользователь окончательно утвердил минимальную компоновку: чат сверху, настройки снизу с собственной вертикальной прокруткой, а чат остаётся без ручной прокрутки. 24 октября 2026 года пользователь принял группировку настроек мультичата в раскрывающиеся блоки и потребовал скрывать настройки неподключённых сервисов; зафиксировано D41-REQ-26. 24 октября 2026 года принято D41-REQ-27: отдельное тестовое сообщение только для локального предпросмотра оформления, без добавления в настоящий чат, OBS и историю. 24 октября 2026 года принято D41-REQ-28: кнопка тестового сообщения внутри оформления соответствующей подключённой платформы, локальный образец с текстом и графическими элементами, закрытие кнопкой «Закрыть предпросмотр» и возврат к текущей живой ленте без остановки получения сообщений. 24 октября 2026 года принято D41-REQ-29: независимый одновременный показ тестовых сообщений каждой подключённой платформы; предложенная замена одного образца другим явно отклонена. При этом не создаются настоящие сообщения или OBS-события. 24 октября 2026 года пользователь предложил D41-REQ-30/31: настоящие сообщения остаются выше закреплённых снизу тестовых образцов; область чата является немедленным локальным предпросмотром изменений внешнего вида, а опубликованное оформление OBS обновляется только по нажатию «Сохранить». Ранее согласованное мгновенное применение черновых изменений оформления в OBS этим уточнением заменено. 24 октября 2026 года пользователь принял сохранение черновика при смене вкладки и диалог закрытия из D41-REQ-32, а также отдельно подчеркнул обязательное одновременное мгновенное изменение ВСЕХ тестовых и реальных сообщений в локальном предпросмотре D41-REQ-12/31; OBS по-прежнему обновляется только после «Сохранить». 24 октября 2026 года пользователь прямо предложил сопоставить локальную область редактирования/предпросмотра мультичата с редактором правил аукциона, добавить кнопку браузерной проверки, возможность выбора фона и светящийся контур с регулируемым цветом и полным отключением; записано как D41-REQ-33/34. Детали, перечисленные в §13.6.7, ещё не согласованы. Дополнение от 24 октября 2026 года: D41-REQ-35 — два пользовательских режима видимости пустого OBS-виджета («скрывать» или «показывать фон и контур постоянно»); способ появления скрытого виджета при новых сообщениях и критерий пустоты пока не утверждены.</w:t>
       </w:r>
     </w:p>
     <w:p>

</xml_diff>

<commit_message>
docs: reject timeout and animation, grow multichat from bottom instantly (D41-REQ-36)
</commit_message>
<xml_diff>
--- a/docs/Правила_и_дальнейший_распорядок_работ.docx
+++ b/docs/Правила_и_дальнейший_распорядок_работ.docx
@@ -18006,7 +18006,7 @@
     <w:p>
       <w:pPr/>
       <w:r>
-        <w:t>D41-REQ-13. Новые сообщения появляются снизу мгновенно, старые сдвигаются вверх без анимации. Ручной прокрутки нет ни в программе, ни в OBS. Анимаций появления/исчезновения не добавлять; это не запрещает анимацию внутри оригинальных GIF и эмодзи. Текст переносить по доступной ширине; изображения/GIF уменьшать с сохранением пропорций. Без горизонтальной прокрутки и намеренного обрезания содержания.</w:t>
+        <w:t>D41-REQ-13. Новые сообщения появляются снизу мгновенно, старые сдвигаются вверх без анимации. Ручной прокрутки нет ни в программе, ни в OBS. Анимаций появления/исчезновения не добавлять; это не запрещает анимацию внутри оригинальных GIF и эмодзи. Текст переносить по доступной ширине; изображения/GIF уменьшать с сохранением пропорций. Без горизонтальной прокрутки и намеренного обрезания содержания. По позднему уточнению D41-REQ-36 в скрытом режиме OBS общая оболочка виджета также появляется и растёт вверх мгновенно, без анимации; это не отменяет уже принятого направления потока сообщений.</w:t>
       </w:r>
     </w:p>
     <w:p>
@@ -18039,7 +18039,7 @@
     <w:p>
       <w:pPr/>
       <w:r>
-        <w:t>D41-REQ-17. Пустая вкладка программы показывает «Ожидание сообщений», а статусы подключений видны только в программе. Пустой OBS-виджет не выводит сообщений о соединении, ошибках или ожидании. Ранее принятая обязательная полная прозрачность пустого OBS-виджета уточнена более поздним прямым решением пользователя от 24 октября 2026 года: прозрачность или постоянный показ фона/контура теперь выбирает сам пользователь по D41-REQ-35. Новые сообщения поступают с принятой задержкой и без анимации отдельных сообщений (D41-REQ-13); способ появления и исчезновения области всего виджета отдельно согласовывается.</w:t>
+        <w:t>D41-REQ-17. Пустая вкладка программы показывает «Ожидание сообщений», а статусы подключений видны только в программе. Пустой OBS-виджет не выводит сообщений о соединении, ошибках или ожидании. Ранее принятая обязательная полная прозрачность пустого OBS-виджета уточнена более поздним прямым решением пользователя от 24 октября 2026 года: прозрачность или постоянный показ фона/контура теперь выбирает сам пользователь по D41-REQ-35. Новые сообщения поступают с принятой задержкой и без анимации отдельных сообщений (D41-REQ-13); в скрытом режиме начало показа области после первого сообщения происходит мгновенно, без анимации и без таймера; подробности D41-REQ-36.</w:t>
       </w:r>
     </w:p>
     <w:p>
@@ -18066,7 +18066,7 @@
     <w:p>
       <w:pPr/>
       <w:r>
-        <w:t>D41-REQ-20. Закрытие InOneLine очищает RAM-ленту и буфер; при следующем запуске прежние сообщения не появляются. Сохраняются только пользовательские настройки. Завершение трансляции само по себе не прекращает чтение: если чат платформы доступен без эфира, он продолжает работать. После окончания эфира сообщения могут оставаться видимыми; только достоверное начало новой трансляции вызывает очистку старых сообщений и буфера соответствующей платформы, не затрагивая другие платформы. Простое переподключение не означает новый эфир.</w:t>
+        <w:t>D41-REQ-20. Закрытие InOneLine очищает RAM-ленту и буфер; при следующем запуске прежние сообщения не появляются. Сохраняются только пользовательские настройки. Завершение трансляции само по себе не прекращает чтение: если чат платформы доступен без эфира, он продолжает работать. После окончания эфира сообщения могут оставаться видимыми; только достоверное начало новой трансляции вызывает очистку старых сообщений и буфера соответствующей платформы, не затрагивая другие платформы. Простое переподключение не означает новый эфир. Уточнение D41-REQ-36: уже отображаемые сообщения не должны пропадать из OBS из-за простоя чата или истечения какого-либо времени; цель — показывать их во время эфира вплоть до его завершения, насколько допускают область браузерного источника, RAM-лимит и ранее согласованные события удаления. Это не является согласием автоматически очищать ленту при окончании эфира: точное поведение при окончании одной/всех платформенных трансляций ещё требуется согласовать; ранее принятое правило очистки при достоверном начале нового эфира остаётся действующим.</w:t>
       </w:r>
     </w:p>
     <w:p>
@@ -18156,7 +18156,13 @@
     <w:p>
       <w:pPr/>
       <w:r>
-        <w:t>D41-REQ-35. РЕЖИМ ВИДИМОСТИ ПУСТОГО OBS-ВИДЖЕТА (прямое решение пользователя от 24 октября 2026 года; статус: требования согласованы, код не реализован). В настройках общего мультичата пользователь выбирает один из ДВУХ режимов поведения браузерного OBS-виджета в состоянии без отображаемых сообщений: (1) «Скрывать, когда чат пуст» — весь виджет, включая выбранный общий фон и светящийся контур, полностью прозрачен; при появлении первого допущенного к показу сообщения виджет вновь становится видимым. (2) «Показывать постоянно» — выбранные общий фон и контур продолжают отображаться и при отсутствии сообщений, новые сообщения показываются внутри. Это выбор одного общего режима виджета, а не платформенных настроек Twitch/YouTube; режим распространяется на все экземпляры одного OBS URL и не меняет приём, очередность, буфер, RAM-историю и отдельные правила допуска платформ по D41-REQ-15/16. Параметр относится к оформлению: локальный предпросмотр реагирует на изменения сразу, OBS и браузер применяют сохранённый выбор после «Сохранить» (D41-REQ-31/33). Данное более позднее решение заменяет категорическое правило полной прозрачности пустого OBS-виджета в старой редакции D41-REQ-17, не отменяя отсутствия служебных надписей в OBS. ОТКРЫТО ДЛЯ ОТДЕЛЬНОГО СОГЛАСОВАНИЯ: что именно считать моментом «чат пуст», если ранее полученные сообщения ещё хранятся в RAM; нужен ли тайм-аут неактивности для скрытия без удаления из RAM; как визуально появляется/исчезает вся область виджета (мгновенно, плавно и т. п.) и каковы параметры эффекта. Пользователь потребовал проработать появление виджета из скрытого состояния, но конкретную анимацию ещё не утверждал. Запрет анимации отдельных сообщений по D41-REQ-13 сохраняется.</w:t>
+        <w:t>D41-REQ-35. РЕЖИМ ВИДИМОСТИ ПУСТОГО OBS-ВИДЖЕТА (прямое решение пользователя от 24 октября 2026 года; статус: требования согласованы, код не реализован). В настройках общего мультичата пользователь выбирает один из ДВУХ режимов поведения браузерного OBS-виджета в состоянии без отображаемых сообщений: (1) «Скрывать, когда чат пуст» — весь виджет, включая выбранный общий фон и светящийся контур, полностью прозрачен; при появлении первого допущенного к показу сообщения виджет вновь становится видимым. (2) «Показывать постоянно» — выбранные общий фон и контур продолжают отображаться и при отсутствии сообщений, новые сообщения показываются внутри. Это выбор одного общего режима виджета, а не платформенных настроек Twitch/YouTube; режим распространяется на все экземпляры одного OBS URL и не меняет приём, очередность, буфер, RAM-историю и отдельные правила допуска платформ по D41-REQ-15/16. Параметр относится к оформлению: локальный предпросмотр реагирует на изменения сразу, OBS и браузер применяют сохранённый выбор после «Сохранить» (D41-REQ-31/33). Данное более позднее решение заменяет категорическое правило полной прозрачности пустого OBS-виджета в старой редакции D41-REQ-17, не отменяя отсутствия служебных надписей в OBS. Более позднее прямое решение пользователя D41-REQ-36 уточнило скрытый режим: пустота означает отсутствие реально отображаемых сообщений в OBS, таймер отсутствия активности исключён, первое сообщение и оболочка появляются мгновенно без анимации; дальнейшие сообщения мгновенно расширяют оболочку вверх до фактической высоты браузерного источника. Не путать видимое окно браузерного источника с общим RAM-лимитом сообщений. Поведение при завершении одной или нескольких трансляций отдельно уточняется с учётом D41-REQ-20.</w:t>
+      </w:r>
+    </w:p>
+    <w:p>
+      <w:pPr/>
+      <w:r>
+        <w:t>D41-REQ-36. МГНОВЕННОЕ ПОЯВЛЕНИЕ И РОСТ ОБЛАСТИ МУЛЬТИЧАТА В OBS (прямое уточнение пользователя от 24 октября 2026 года; требования согласованы, код не реализован). Для выбранного общего режима «Скрывать, когда чат пуст» первоначально при отсутствии реально отображаемых в OBS сообщений вся оформленная область (сообщения, общий фон, светящийся контур) невидима/прозрачна. Как только первое допущенное по D41-REQ-15/16 сообщение становится готовым после общей задержки, одновременно МГНОВЕННО, БЕЗ АНИМАЦИИ, появляются и само сообщение, и оформленная оболочка его фактической высоты. Следующее сообщение появляется СНИЗУ предыдущего: старые сообщения перемещаются ВВЕРХ без анимации, а оформленная область расширяется ВВЕРХ, охватывая все текущие видимые сообщения. С каждым новым сообщением повторяется тот же принцип до предела доступной ВЫСОТЫ браузерного источника OBS; после заполнения области новые сообщения поступают снизу, а более старые вытесняются за верхнюю границу видимой области, не создавая ручную прокрутку и не превышая размеры источника. Не вводить ни тайм-аут неактивности, ни настройку длительности показа, ни плавные/декоративные эффекты появления, роста или исчезновения. Отсутствие новых сообщений НЕ скрывает уже видимую область: показанные сообщения остаются на экране без ограничения по времени во время трансляции, за исключением уже утверждённых причин их удаления/замены (платформенное удаление, очистка при смене аккаунта или достоверном начале нового эфира, вытеснение по ограничению RAM или видимой высоты, закрытие приложения). Это уточнение не отменяет второй режим D41-REQ-35 «Показывать постоянно», где фон и контур видны также при нуле сообщений, а новые сообщения добавляются по общим правилам. Конец эфира НЕ трактовать без отдельного решения как автоматическую очистку: D41-REQ-20 пока сохраняет очистку при достоверном начале нового эфира, а не по сигналу завершения. Отдельный следующий вопрос — что считать окончанием показа после завершения одной платформенной трансляции при одновременной работе Twitch и YouTube. Предыдущее предложение помощника о таймере скрытия и плавной анимации ОТКЛОНЕНО пользователем. Связи: D41-REQ-13/14/15/16/17/18/19/20/35, GLOBAL-OBS-VISIBILITY-001.</w:t>
       </w:r>
     </w:p>
     <w:p>
@@ -18171,7 +18177,7 @@
     <w:p>
       <w:pPr/>
       <w:r>
-        <w:t>Не решено и требует технической проверки: точные пределы ручного значения задержки и лимита памяти; поведение при экстремальной нагрузке и весе медиа; факт доступности всех типовых и нестандартных эмодзи YouTube/стикеров и других платформ; полнота событий удаления и подключения; точные пропорции и точки адаптивного перестроения принятой двухрежимной компоновки вкладки «Мультичат», положение регуляторов и URL-кнопок; штатное сохранение признака «разрешено в OBS» на момент готовности сообщения для надёжного восстановления нескольких браузерных экземпляров. Для D41-REQ-27/28 согласованы место кнопки, образец с текстом, никнеймом, аватаром, знаком платформы и эмодзи, способ закрытия и непрерывный приём настоящего чата; более широкие наборы тестовых медиа не утверждены. D41-REQ-29: одновременное отображение нескольких тестовых образцов принято; визуальное размещение и удобство сравнения на минимальной ширине проверяются при UI-реализации. Не возвращаться к отвергнутому режиму автоматической замены образца одного сервиса другим. Для D41-REQ-30/31/32 проверить геометрию закреплённых снизу тестовых сообщений при высокой нагрузке и малой высоте; отдельно согласовать судьбу несохранённого черновика оформления при выходе из программы и переключении вкладок. Мгновенное локальное предпросмотр-оформление не следует путать с сохранённым стилем OBS; изменение OBS только по явной кнопке «Сохранить». Дополнение D41-REQ-33/34: проверить фактическую реализацию сохранённого browser preview редактора правил, перенос уже существующих фоновых медиа и светящегося контура в мультичат, варианты изображения/анимации, два принятых режима пустого виджета по D41-REQ-35, поведение общей рамки в окне минимального размера. Полная прозрачность пустого OBS больше не обязательна во всех случаях: пользователь выбирает режим по D41-REQ-35. Требуют отдельного согласования критерий пустоты/тайм-аут скрытия при неактивности и анимация появления/исчезновения всего виджета, а не отдельных сообщений.</w:t>
+        <w:t>Не решено и требует технической проверки: точные пределы ручного значения задержки и лимита памяти; поведение при экстремальной нагрузке и весе медиа; факт доступности всех типовых и нестандартных эмодзи YouTube/стикеров и других платформ; полнота событий удаления и подключения; точные пропорции и точки адаптивного перестроения принятой двухрежимной компоновки вкладки «Мультичат», положение регуляторов и URL-кнопок; штатное сохранение признака «разрешено в OBS» на момент готовности сообщения для надёжного восстановления нескольких браузерных экземпляров. Для D41-REQ-27/28 согласованы место кнопки, образец с текстом, никнеймом, аватаром, знаком платформы и эмодзи, способ закрытия и непрерывный приём настоящего чата; более широкие наборы тестовых медиа не утверждены. D41-REQ-29: одновременное отображение нескольких тестовых образцов принято; визуальное размещение и удобство сравнения на минимальной ширине проверяются при UI-реализации. Не возвращаться к отвергнутому режиму автоматической замены образца одного сервиса другим. Для D41-REQ-30/31/32 проверить геометрию закреплённых снизу тестовых сообщений при высокой нагрузке и малой высоте; отдельно согласовать судьбу несохранённого черновика оформления при выходе из программы и переключении вкладок. Мгновенное локальное предпросмотр-оформление не следует путать с сохранённым стилем OBS; изменение OBS только по явной кнопке «Сохранить». Дополнение D41-REQ-33/34: проверить фактическую реализацию сохранённого browser preview редактора правил, перенос уже существующих фоновых медиа и светящегося контура в мультичат, варианты изображения/анимации, два принятых режима пустого виджета по D41-REQ-35, поведение общей рамки в окне минимального размера. Полная прозрачность пустого OBS больше не обязательна во всех случаях: пользователь выбирает режим по D41-REQ-35. D41-REQ-36 окончательно исключает таймер скрытия при отсутствии активности и любую анимацию появления или роста OBS-виджета в режиме «Скрывать, когда чат пуст». Проверить нижнюю привязку, рост вверх при длинном тексте/крупных GIF, обрезку сверху на границе источника, поведение при изменении OBS размера и сохранение старых сообщений при отсутствии новых. ОТКРЫТО: фактическое окончание показа при завершении одной платформенной трансляции или обеих; прежнее правило D41-REQ-20 о сохранении до нового эфира пока не заменять предположением об очистке при окончании.</w:t>
       </w:r>
     </w:p>
     <w:p>
@@ -18183,7 +18189,7 @@
     <w:p>
       <w:pPr/>
       <w:r>
-        <w:t>Источники решений: «Программа для стриминга 70» и продолжение 23–24 октября 2026 года. Отдельные ответы «принимаю», «принимаем», «вариант 2», «так и делаем» относятся к конкретным перечисленным выше вопросам. Последнее решение о мгновенном изменении оформления всех уже отображённых сообщений принято 24 октября 2026 года. После этой записи принято дополнительное правило D41-REQ-23: запуск InOneLine посреди эфира не загружает предыдущую переписку. В тот же день пользователь потребовал регистрировать каждое принятое решение в этом документе и синхронизировать его копию на GitHub; правило закреплено в §1.7. Дополнение от 24 октября 2026 года: принято D41-REQ-24 — при обычном отключении аккаунта без замены уже отображённые сообщения остаются до обычного вытеснения; ожидавшие в буфере сообщения не выводятся. Отличать это от смены аккаунта по D41-REQ-22. 24 октября 2026 года пользователь потребовал разместить мультичат и его настройки в одной вкладке, слева ленту и справа параметры на широком окне, с обязательной адаптацией под 520 × 360 и сохранением узнаваемого общего UI; это внесено в D41-REQ-25. В следующем ответе 24 октября 2026 года пользователь окончательно утвердил минимальную компоновку: чат сверху, настройки снизу с собственной вертикальной прокруткой, а чат остаётся без ручной прокрутки. 24 октября 2026 года пользователь принял группировку настроек мультичата в раскрывающиеся блоки и потребовал скрывать настройки неподключённых сервисов; зафиксировано D41-REQ-26. 24 октября 2026 года принято D41-REQ-27: отдельное тестовое сообщение только для локального предпросмотра оформления, без добавления в настоящий чат, OBS и историю. 24 октября 2026 года принято D41-REQ-28: кнопка тестового сообщения внутри оформления соответствующей подключённой платформы, локальный образец с текстом и графическими элементами, закрытие кнопкой «Закрыть предпросмотр» и возврат к текущей живой ленте без остановки получения сообщений. 24 октября 2026 года принято D41-REQ-29: независимый одновременный показ тестовых сообщений каждой подключённой платформы; предложенная замена одного образца другим явно отклонена. При этом не создаются настоящие сообщения или OBS-события. 24 октября 2026 года пользователь предложил D41-REQ-30/31: настоящие сообщения остаются выше закреплённых снизу тестовых образцов; область чата является немедленным локальным предпросмотром изменений внешнего вида, а опубликованное оформление OBS обновляется только по нажатию «Сохранить». Ранее согласованное мгновенное применение черновых изменений оформления в OBS этим уточнением заменено. 24 октября 2026 года пользователь принял сохранение черновика при смене вкладки и диалог закрытия из D41-REQ-32, а также отдельно подчеркнул обязательное одновременное мгновенное изменение ВСЕХ тестовых и реальных сообщений в локальном предпросмотре D41-REQ-12/31; OBS по-прежнему обновляется только после «Сохранить». 24 октября 2026 года пользователь прямо предложил сопоставить локальную область редактирования/предпросмотра мультичата с редактором правил аукциона, добавить кнопку браузерной проверки, возможность выбора фона и светящийся контур с регулируемым цветом и полным отключением; записано как D41-REQ-33/34. Детали, перечисленные в §13.6.7, ещё не согласованы. Дополнение от 24 октября 2026 года: D41-REQ-35 — два пользовательских режима видимости пустого OBS-виджета («скрывать» или «показывать фон и контур постоянно»); способ появления скрытого виджета при новых сообщениях и критерий пустоты пока не утверждены.</w:t>
+        <w:t>Источники решений: «Программа для стриминга 70» и продолжение 23–24 октября 2026 года. Отдельные ответы «принимаю», «принимаем», «вариант 2», «так и делаем» относятся к конкретным перечисленным выше вопросам. Последнее решение о мгновенном изменении оформления всех уже отображённых сообщений принято 24 октября 2026 года. После этой записи принято дополнительное правило D41-REQ-23: запуск InOneLine посреди эфира не загружает предыдущую переписку. В тот же день пользователь потребовал регистрировать каждое принятое решение в этом документе и синхронизировать его копию на GitHub; правило закреплено в §1.7. Дополнение от 24 октября 2026 года: принято D41-REQ-24 — при обычном отключении аккаунта без замены уже отображённые сообщения остаются до обычного вытеснения; ожидавшие в буфере сообщения не выводятся. Отличать это от смены аккаунта по D41-REQ-22. 24 октября 2026 года пользователь потребовал разместить мультичат и его настройки в одной вкладке, слева ленту и справа параметры на широком окне, с обязательной адаптацией под 520 × 360 и сохранением узнаваемого общего UI; это внесено в D41-REQ-25. В следующем ответе 24 октября 2026 года пользователь окончательно утвердил минимальную компоновку: чат сверху, настройки снизу с собственной вертикальной прокруткой, а чат остаётся без ручной прокрутки. 24 октября 2026 года пользователь принял группировку настроек мультичата в раскрывающиеся блоки и потребовал скрывать настройки неподключённых сервисов; зафиксировано D41-REQ-26. 24 октября 2026 года принято D41-REQ-27: отдельное тестовое сообщение только для локального предпросмотра оформления, без добавления в настоящий чат, OBS и историю. 24 октября 2026 года принято D41-REQ-28: кнопка тестового сообщения внутри оформления соответствующей подключённой платформы, локальный образец с текстом и графическими элементами, закрытие кнопкой «Закрыть предпросмотр» и возврат к текущей живой ленте без остановки получения сообщений. 24 октября 2026 года принято D41-REQ-29: независимый одновременный показ тестовых сообщений каждой подключённой платформы; предложенная замена одного образца другим явно отклонена. При этом не создаются настоящие сообщения или OBS-события. 24 октября 2026 года пользователь предложил D41-REQ-30/31: настоящие сообщения остаются выше закреплённых снизу тестовых образцов; область чата является немедленным локальным предпросмотром изменений внешнего вида, а опубликованное оформление OBS обновляется только по нажатию «Сохранить». Ранее согласованное мгновенное применение черновых изменений оформления в OBS этим уточнением заменено. 24 октября 2026 года пользователь принял сохранение черновика при смене вкладки и диалог закрытия из D41-REQ-32, а также отдельно подчеркнул обязательное одновременное мгновенное изменение ВСЕХ тестовых и реальных сообщений в локальном предпросмотре D41-REQ-12/31; OBS по-прежнему обновляется только после «Сохранить». 24 октября 2026 года пользователь прямо предложил сопоставить локальную область редактирования/предпросмотра мультичата с редактором правил аукциона, добавить кнопку браузерной проверки, возможность выбора фона и светящийся контур с регулируемым цветом и полным отключением; записано как D41-REQ-33/34. Детали, перечисленные в §13.6.7, ещё не согласованы. Дополнение от 24 октября 2026 года: D41-REQ-35 — два пользовательских режима видимости пустого OBS-виджета («скрывать» или «показывать фон и контур постоянно»); способ появления скрытого виджета при новых сообщениях и критерий пустоты пока не утверждены. Дополнение от 24 октября 2026 года: пользователь отверг предложение о скрытии после тайм-аута, не принял анимацию и прямо установил последовательное мгновенное появление сообщений снизу с ростом общего виджета вверх до границы OBS браузерного источника; сообщения не исчезают по времени и должны оставаться показанными на протяжении эфира. Зафиксировано как D41-REQ-36, уточнение D41-REQ-13/17/20/35. Автоматическое удаление при окончании эфира не утверждалось: требуется отдельно уточнить взаимодействие с прежним D41-REQ-20 для нескольких платформ.</w:t>
       </w:r>
     </w:p>
     <w:p>

</xml_diff>

<commit_message>
docs: clarify D41 multichat messages persist after streams end
</commit_message>
<xml_diff>
--- a/docs/Правила_и_дальнейший_распорядок_работ.docx
+++ b/docs/Правила_и_дальнейший_распорядок_работ.docx
@@ -18066,7 +18066,7 @@
     <w:p>
       <w:pPr/>
       <w:r>
-        <w:t>D41-REQ-20. Закрытие InOneLine очищает RAM-ленту и буфер; при следующем запуске прежние сообщения не появляются. Сохраняются только пользовательские настройки. Завершение трансляции само по себе не прекращает чтение: если чат платформы доступен без эфира, он продолжает работать. После окончания эфира сообщения могут оставаться видимыми; только достоверное начало новой трансляции вызывает очистку старых сообщений и буфера соответствующей платформы, не затрагивая другие платформы. Простое переподключение не означает новый эфир. Уточнение D41-REQ-36: уже отображаемые сообщения не должны пропадать из OBS из-за простоя чата или истечения какого-либо времени; цель — показывать их во время эфира вплоть до его завершения, насколько допускают область браузерного источника, RAM-лимит и ранее согласованные события удаления. Это не является согласием автоматически очищать ленту при окончании эфира: точное поведение при окончании одной/всех платформенных трансляций ещё требуется согласовать; ранее принятое правило очистки при достоверном начале нового эфира остаётся действующим.</w:t>
+        <w:t>D41-REQ-20. Закрытие InOneLine очищает RAM-ленту и буфер; при следующем запуске прежние сообщения не появляются. Сохраняются только пользовательские настройки. Завершение трансляции само по себе не прекращает чтение: если чат платформы доступен без эфира, он продолжает работать. После окончания эфира ранее выведенные сообщения продолжают отображаться и НЕ удаляются по факту завершения; если чат доступен вне эфира, его новые сообщения продолжают поступать в общий поток. Только достоверное начало новой трансляции вызывает очистку старых сообщений и буфера соответствующей платформы, не затрагивая другие платформы. Простое переподключение не означает новый эфир. Уточнение D41-REQ-36 и прямое повторное подтверждение пользователя 24 октября 2026 года: уже отображаемые сообщения не должны пропадать из OBS из-за простоя чата, истечения времени или завершения одной либо всех платформенных трансляций. Показ сохраняется после завершения эфира в пределах высоты OBS-источника, RAM-лимита и ранее принятых событий удаления/очистки. Если Twitch закончил трансляцию, а YouTube продолжает, сообщения Twitch не удаляются; новые сообщения YouTube продолжают появляться в общей ленте. Никакой дополнительной автоматической очистки по событию завершения трансляции не вводить; ранее принятое правило очистки при достоверном начале нового эфира остаётся действующим.</w:t>
       </w:r>
     </w:p>
     <w:p>
@@ -18156,13 +18156,13 @@
     <w:p>
       <w:pPr/>
       <w:r>
-        <w:t>D41-REQ-35. РЕЖИМ ВИДИМОСТИ ПУСТОГО OBS-ВИДЖЕТА (прямое решение пользователя от 24 октября 2026 года; статус: требования согласованы, код не реализован). В настройках общего мультичата пользователь выбирает один из ДВУХ режимов поведения браузерного OBS-виджета в состоянии без отображаемых сообщений: (1) «Скрывать, когда чат пуст» — весь виджет, включая выбранный общий фон и светящийся контур, полностью прозрачен; при появлении первого допущенного к показу сообщения виджет вновь становится видимым. (2) «Показывать постоянно» — выбранные общий фон и контур продолжают отображаться и при отсутствии сообщений, новые сообщения показываются внутри. Это выбор одного общего режима виджета, а не платформенных настроек Twitch/YouTube; режим распространяется на все экземпляры одного OBS URL и не меняет приём, очередность, буфер, RAM-историю и отдельные правила допуска платформ по D41-REQ-15/16. Параметр относится к оформлению: локальный предпросмотр реагирует на изменения сразу, OBS и браузер применяют сохранённый выбор после «Сохранить» (D41-REQ-31/33). Данное более позднее решение заменяет категорическое правило полной прозрачности пустого OBS-виджета в старой редакции D41-REQ-17, не отменяя отсутствия служебных надписей в OBS. Более позднее прямое решение пользователя D41-REQ-36 уточнило скрытый режим: пустота означает отсутствие реально отображаемых сообщений в OBS, таймер отсутствия активности исключён, первое сообщение и оболочка появляются мгновенно без анимации; дальнейшие сообщения мгновенно расширяют оболочку вверх до фактической высоты браузерного источника. Не путать видимое окно браузерного источника с общим RAM-лимитом сообщений. Поведение при завершении одной или нескольких трансляций отдельно уточняется с учётом D41-REQ-20.</w:t>
+        <w:t>D41-REQ-35. РЕЖИМ ВИДИМОСТИ ПУСТОГО OBS-ВИДЖЕТА (прямое решение пользователя от 24 октября 2026 года; статус: требования согласованы, код не реализован). В настройках общего мультичата пользователь выбирает один из ДВУХ режимов поведения браузерного OBS-виджета в состоянии без отображаемых сообщений: (1) «Скрывать, когда чат пуст» — весь виджет, включая выбранный общий фон и светящийся контур, полностью прозрачен; при появлении первого допущенного к показу сообщения виджет вновь становится видимым. (2) «Показывать постоянно» — выбранные общий фон и контур продолжают отображаться и при отсутствии сообщений, новые сообщения показываются внутри. Это выбор одного общего режима виджета, а не платформенных настроек Twitch/YouTube; режим распространяется на все экземпляры одного OBS URL и не меняет приём, очередность, буфер, RAM-историю и отдельные правила допуска платформ по D41-REQ-15/16. Параметр относится к оформлению: локальный предпросмотр реагирует на изменения сразу, OBS и браузер применяют сохранённый выбор после «Сохранить» (D41-REQ-31/33). Данное более позднее решение заменяет категорическое правило полной прозрачности пустого OBS-виджета в старой редакции D41-REQ-17, не отменяя отсутствия служебных надписей в OBS. Более позднее прямое решение пользователя D41-REQ-36 уточнило скрытый режим: пустота означает отсутствие реально отображаемых сообщений в OBS, таймер отсутствия активности исключён, первое сообщение и оболочка появляются мгновенно без анимации; дальнейшие сообщения мгновенно расширяют оболочку вверх до фактической высоты браузерного источника. Не путать видимое окно браузерного источника с общим RAM-лимитом сообщений. При завершении одной или нескольких трансляций сообщения не скрываются и не удаляются автоматически; действует D41-REQ-20.</w:t>
       </w:r>
     </w:p>
     <w:p>
       <w:pPr/>
       <w:r>
-        <w:t>D41-REQ-36. МГНОВЕННОЕ ПОЯВЛЕНИЕ И РОСТ ОБЛАСТИ МУЛЬТИЧАТА В OBS (прямое уточнение пользователя от 24 октября 2026 года; требования согласованы, код не реализован). Для выбранного общего режима «Скрывать, когда чат пуст» первоначально при отсутствии реально отображаемых в OBS сообщений вся оформленная область (сообщения, общий фон, светящийся контур) невидима/прозрачна. Как только первое допущенное по D41-REQ-15/16 сообщение становится готовым после общей задержки, одновременно МГНОВЕННО, БЕЗ АНИМАЦИИ, появляются и само сообщение, и оформленная оболочка его фактической высоты. Следующее сообщение появляется СНИЗУ предыдущего: старые сообщения перемещаются ВВЕРХ без анимации, а оформленная область расширяется ВВЕРХ, охватывая все текущие видимые сообщения. С каждым новым сообщением повторяется тот же принцип до предела доступной ВЫСОТЫ браузерного источника OBS; после заполнения области новые сообщения поступают снизу, а более старые вытесняются за верхнюю границу видимой области, не создавая ручную прокрутку и не превышая размеры источника. Не вводить ни тайм-аут неактивности, ни настройку длительности показа, ни плавные/декоративные эффекты появления, роста или исчезновения. Отсутствие новых сообщений НЕ скрывает уже видимую область: показанные сообщения остаются на экране без ограничения по времени во время трансляции, за исключением уже утверждённых причин их удаления/замены (платформенное удаление, очистка при смене аккаунта или достоверном начале нового эфира, вытеснение по ограничению RAM или видимой высоты, закрытие приложения). Это уточнение не отменяет второй режим D41-REQ-35 «Показывать постоянно», где фон и контур видны также при нуле сообщений, а новые сообщения добавляются по общим правилам. Конец эфира НЕ трактовать без отдельного решения как автоматическую очистку: D41-REQ-20 пока сохраняет очистку при достоверном начале нового эфира, а не по сигналу завершения. Отдельный следующий вопрос — что считать окончанием показа после завершения одной платформенной трансляции при одновременной работе Twitch и YouTube. Предыдущее предложение помощника о таймере скрытия и плавной анимации ОТКЛОНЕНО пользователем. Связи: D41-REQ-13/14/15/16/17/18/19/20/35, GLOBAL-OBS-VISIBILITY-001.</w:t>
+        <w:t>D41-REQ-36. МГНОВЕННОЕ ПОЯВЛЕНИЕ И РОСТ ОБЛАСТИ МУЛЬТИЧАТА В OBS (прямое уточнение пользователя от 24 октября 2026 года; требования согласованы, код не реализован). Для выбранного общего режима «Скрывать, когда чат пуст» первоначально при отсутствии реально отображаемых в OBS сообщений вся оформленная область (сообщения, общий фон, светящийся контур) невидима/прозрачна. Как только первое допущенное по D41-REQ-15/16 сообщение становится готовым после общей задержки, одновременно МГНОВЕННО, БЕЗ АНИМАЦИИ, появляются и само сообщение, и оформленная оболочка его фактической высоты. Следующее сообщение появляется СНИЗУ предыдущего: старые сообщения перемещаются ВВЕРХ без анимации, а оформленная область расширяется ВВЕРХ, охватывая все текущие видимые сообщения. С каждым новым сообщением повторяется тот же принцип до предела доступной ВЫСОТЫ браузерного источника OBS; после заполнения области новые сообщения поступают снизу, а более старые вытесняются за верхнюю границу видимой области, не создавая ручную прокрутку и не превышая размеры источника. Не вводить ни тайм-аут неактивности, ни настройку длительности показа, ни плавные/декоративные эффекты появления, роста или исчезновения. Отсутствие новых сообщений и завершение трансляции НЕ скрывают уже видимую область: показанные сообщения остаются на экране без ограничения по времени, в том числе после окончания эфира, за исключением уже утверждённых причин их удаления/замены (платформенное удаление, очистка при смене аккаунта или достоверном начале нового эфира, вытеснение по ограничению RAM или видимой высоты, закрытие приложения). Это уточнение не отменяет второй режим D41-REQ-35 «Показывать постоянно», где фон и контур видны также при нуле сообщений, а новые сообщения добавляются по общим правилам. Конец эфира НЕ является основанием очистки или скрытия, что повторно подтверждено пользователем 24 октября 2026 года: при окончании Twitch и продолжении YouTube старые сообщения Twitch остаются в общей ленте, а YouTube продолжает поступать. Правило D41-REQ-20 допускает очистку при достоверном начале нового эфира, но НЕ при завершении предыдущего. Предыдущее предложение помощника о таймере скрытия и плавной анимации ОТКЛОНЕНО пользователем. Связи: D41-REQ-13/14/15/16/17/18/19/20/35, GLOBAL-OBS-VISIBILITY-001.</w:t>
       </w:r>
     </w:p>
     <w:p>
@@ -18177,7 +18177,7 @@
     <w:p>
       <w:pPr/>
       <w:r>
-        <w:t>Не решено и требует технической проверки: точные пределы ручного значения задержки и лимита памяти; поведение при экстремальной нагрузке и весе медиа; факт доступности всех типовых и нестандартных эмодзи YouTube/стикеров и других платформ; полнота событий удаления и подключения; точные пропорции и точки адаптивного перестроения принятой двухрежимной компоновки вкладки «Мультичат», положение регуляторов и URL-кнопок; штатное сохранение признака «разрешено в OBS» на момент готовности сообщения для надёжного восстановления нескольких браузерных экземпляров. Для D41-REQ-27/28 согласованы место кнопки, образец с текстом, никнеймом, аватаром, знаком платформы и эмодзи, способ закрытия и непрерывный приём настоящего чата; более широкие наборы тестовых медиа не утверждены. D41-REQ-29: одновременное отображение нескольких тестовых образцов принято; визуальное размещение и удобство сравнения на минимальной ширине проверяются при UI-реализации. Не возвращаться к отвергнутому режиму автоматической замены образца одного сервиса другим. Для D41-REQ-30/31/32 проверить геометрию закреплённых снизу тестовых сообщений при высокой нагрузке и малой высоте; отдельно согласовать судьбу несохранённого черновика оформления при выходе из программы и переключении вкладок. Мгновенное локальное предпросмотр-оформление не следует путать с сохранённым стилем OBS; изменение OBS только по явной кнопке «Сохранить». Дополнение D41-REQ-33/34: проверить фактическую реализацию сохранённого browser preview редактора правил, перенос уже существующих фоновых медиа и светящегося контура в мультичат, варианты изображения/анимации, два принятых режима пустого виджета по D41-REQ-35, поведение общей рамки в окне минимального размера. Полная прозрачность пустого OBS больше не обязательна во всех случаях: пользователь выбирает режим по D41-REQ-35. D41-REQ-36 окончательно исключает таймер скрытия при отсутствии активности и любую анимацию появления или роста OBS-виджета в режиме «Скрывать, когда чат пуст». Проверить нижнюю привязку, рост вверх при длинном тексте/крупных GIF, обрезку сверху на границе источника, поведение при изменении OBS размера и сохранение старых сообщений при отсутствии новых. ОТКРЫТО: фактическое окончание показа при завершении одной платформенной трансляции или обеих; прежнее правило D41-REQ-20 о сохранении до нового эфира пока не заменять предположением об очистке при окончании.</w:t>
+        <w:t>Не решено и требует технической проверки: точные пределы ручного значения задержки и лимита памяти; поведение при экстремальной нагрузке и весе медиа; факт доступности всех типовых и нестандартных эмодзи YouTube/стикеров и других платформ; полнота событий удаления и подключения; точные пропорции и точки адаптивного перестроения принятой двухрежимной компоновки вкладки «Мультичат», положение регуляторов и URL-кнопок; штатное сохранение признака «разрешено в OBS» на момент готовности сообщения для надёжного восстановления нескольких браузерных экземпляров. Для D41-REQ-27/28 согласованы место кнопки, образец с текстом, никнеймом, аватаром, знаком платформы и эмодзи, способ закрытия и непрерывный приём настоящего чата; более широкие наборы тестовых медиа не утверждены. D41-REQ-29: одновременное отображение нескольких тестовых образцов принято; визуальное размещение и удобство сравнения на минимальной ширине проверяются при UI-реализации. Не возвращаться к отвергнутому режиму автоматической замены образца одного сервиса другим. Для D41-REQ-30/31/32 проверить геометрию закреплённых снизу тестовых сообщений при высокой нагрузке и малой высоте; отдельно согласовать судьбу несохранённого черновика оформления при выходе из программы и переключении вкладок. Мгновенное локальное предпросмотр-оформление не следует путать с сохранённым стилем OBS; изменение OBS только по явной кнопке «Сохранить». Дополнение D41-REQ-33/34: проверить фактическую реализацию сохранённого browser preview редактора правил, перенос уже существующих фоновых медиа и светящегося контура в мультичат, варианты изображения/анимации, два принятых режима пустого виджета по D41-REQ-35, поведение общей рамки в окне минимального размера. Полная прозрачность пустого OBS больше не обязательна во всех случаях: пользователь выбирает режим по D41-REQ-35. D41-REQ-36 окончательно исключает таймер скрытия при отсутствии активности и любую анимацию появления или роста OBS-виджета в режиме «Скрывать, когда чат пуст». Проверить нижнюю привязку, рост вверх при длинном тексте/крупных GIF, обрезку сверху на границе источника, поведение при изменении OBS размера и сохранение старых сообщений при отсутствии новых. ЗАКРЫТО ПОВТОРНЫМ ПОДТВЕРЖДЕНИЕМ: окончание трансляции одной или обеих платформ не удаляет и не скрывает сообщения автоматически; поведение уже определено D41-REQ-20 и уточнено D41-REQ-36. Проверить этот сценарий в Windows/OBS QA без добавления нового режима очистки.</w:t>
       </w:r>
     </w:p>
     <w:p>
@@ -18189,7 +18189,7 @@
     <w:p>
       <w:pPr/>
       <w:r>
-        <w:t>Источники решений: «Программа для стриминга 70» и продолжение 23–24 октября 2026 года. Отдельные ответы «принимаю», «принимаем», «вариант 2», «так и делаем» относятся к конкретным перечисленным выше вопросам. Последнее решение о мгновенном изменении оформления всех уже отображённых сообщений принято 24 октября 2026 года. После этой записи принято дополнительное правило D41-REQ-23: запуск InOneLine посреди эфира не загружает предыдущую переписку. В тот же день пользователь потребовал регистрировать каждое принятое решение в этом документе и синхронизировать его копию на GitHub; правило закреплено в §1.7. Дополнение от 24 октября 2026 года: принято D41-REQ-24 — при обычном отключении аккаунта без замены уже отображённые сообщения остаются до обычного вытеснения; ожидавшие в буфере сообщения не выводятся. Отличать это от смены аккаунта по D41-REQ-22. 24 октября 2026 года пользователь потребовал разместить мультичат и его настройки в одной вкладке, слева ленту и справа параметры на широком окне, с обязательной адаптацией под 520 × 360 и сохранением узнаваемого общего UI; это внесено в D41-REQ-25. В следующем ответе 24 октября 2026 года пользователь окончательно утвердил минимальную компоновку: чат сверху, настройки снизу с собственной вертикальной прокруткой, а чат остаётся без ручной прокрутки. 24 октября 2026 года пользователь принял группировку настроек мультичата в раскрывающиеся блоки и потребовал скрывать настройки неподключённых сервисов; зафиксировано D41-REQ-26. 24 октября 2026 года принято D41-REQ-27: отдельное тестовое сообщение только для локального предпросмотра оформления, без добавления в настоящий чат, OBS и историю. 24 октября 2026 года принято D41-REQ-28: кнопка тестового сообщения внутри оформления соответствующей подключённой платформы, локальный образец с текстом и графическими элементами, закрытие кнопкой «Закрыть предпросмотр» и возврат к текущей живой ленте без остановки получения сообщений. 24 октября 2026 года принято D41-REQ-29: независимый одновременный показ тестовых сообщений каждой подключённой платформы; предложенная замена одного образца другим явно отклонена. При этом не создаются настоящие сообщения или OBS-события. 24 октября 2026 года пользователь предложил D41-REQ-30/31: настоящие сообщения остаются выше закреплённых снизу тестовых образцов; область чата является немедленным локальным предпросмотром изменений внешнего вида, а опубликованное оформление OBS обновляется только по нажатию «Сохранить». Ранее согласованное мгновенное применение черновых изменений оформления в OBS этим уточнением заменено. 24 октября 2026 года пользователь принял сохранение черновика при смене вкладки и диалог закрытия из D41-REQ-32, а также отдельно подчеркнул обязательное одновременное мгновенное изменение ВСЕХ тестовых и реальных сообщений в локальном предпросмотре D41-REQ-12/31; OBS по-прежнему обновляется только после «Сохранить». 24 октября 2026 года пользователь прямо предложил сопоставить локальную область редактирования/предпросмотра мультичата с редактором правил аукциона, добавить кнопку браузерной проверки, возможность выбора фона и светящийся контур с регулируемым цветом и полным отключением; записано как D41-REQ-33/34. Детали, перечисленные в §13.6.7, ещё не согласованы. Дополнение от 24 октября 2026 года: D41-REQ-35 — два пользовательских режима видимости пустого OBS-виджета («скрывать» или «показывать фон и контур постоянно»); способ появления скрытого виджета при новых сообщениях и критерий пустоты пока не утверждены. Дополнение от 24 октября 2026 года: пользователь отверг предложение о скрытии после тайм-аута, не принял анимацию и прямо установил последовательное мгновенное появление сообщений снизу с ростом общего виджета вверх до границы OBS браузерного источника; сообщения не исчезают по времени и должны оставаться показанными на протяжении эфира. Зафиксировано как D41-REQ-36, уточнение D41-REQ-13/17/20/35. Автоматическое удаление при окончании эфира не утверждалось: требуется отдельно уточнить взаимодействие с прежним D41-REQ-20 для нескольких платформ.</w:t>
+        <w:t>Источники решений: «Программа для стриминга 70» и продолжение 23–24 октября 2026 года. Отдельные ответы «принимаю», «принимаем», «вариант 2», «так и делаем» относятся к конкретным перечисленным выше вопросам. Последнее решение о мгновенном изменении оформления всех уже отображённых сообщений принято 24 октября 2026 года. После этой записи принято дополнительное правило D41-REQ-23: запуск InOneLine посреди эфира не загружает предыдущую переписку. В тот же день пользователь потребовал регистрировать каждое принятое решение в этом документе и синхронизировать его копию на GitHub; правило закреплено в §1.7. Дополнение от 24 октября 2026 года: принято D41-REQ-24 — при обычном отключении аккаунта без замены уже отображённые сообщения остаются до обычного вытеснения; ожидавшие в буфере сообщения не выводятся. Отличать это от смены аккаунта по D41-REQ-22. 24 октября 2026 года пользователь потребовал разместить мультичат и его настройки в одной вкладке, слева ленту и справа параметры на широком окне, с обязательной адаптацией под 520 × 360 и сохранением узнаваемого общего UI; это внесено в D41-REQ-25. В следующем ответе 24 октября 2026 года пользователь окончательно утвердил минимальную компоновку: чат сверху, настройки снизу с собственной вертикальной прокруткой, а чат остаётся без ручной прокрутки. 24 октября 2026 года пользователь принял группировку настроек мультичата в раскрывающиеся блоки и потребовал скрывать настройки неподключённых сервисов; зафиксировано D41-REQ-26. 24 октября 2026 года принято D41-REQ-27: отдельное тестовое сообщение только для локального предпросмотра оформления, без добавления в настоящий чат, OBS и историю. 24 октября 2026 года принято D41-REQ-28: кнопка тестового сообщения внутри оформления соответствующей подключённой платформы, локальный образец с текстом и графическими элементами, закрытие кнопкой «Закрыть предпросмотр» и возврат к текущей живой ленте без остановки получения сообщений. 24 октября 2026 года принято D41-REQ-29: независимый одновременный показ тестовых сообщений каждой подключённой платформы; предложенная замена одного образца другим явно отклонена. При этом не создаются настоящие сообщения или OBS-события. 24 октября 2026 года пользователь предложил D41-REQ-30/31: настоящие сообщения остаются выше закреплённых снизу тестовых образцов; область чата является немедленным локальным предпросмотром изменений внешнего вида, а опубликованное оформление OBS обновляется только по нажатию «Сохранить». Ранее согласованное мгновенное применение черновых изменений оформления в OBS этим уточнением заменено. 24 октября 2026 года пользователь принял сохранение черновика при смене вкладки и диалог закрытия из D41-REQ-32, а также отдельно подчеркнул обязательное одновременное мгновенное изменение ВСЕХ тестовых и реальных сообщений в локальном предпросмотре D41-REQ-12/31; OBS по-прежнему обновляется только после «Сохранить». 24 октября 2026 года пользователь прямо предложил сопоставить локальную область редактирования/предпросмотра мультичата с редактором правил аукциона, добавить кнопку браузерной проверки, возможность выбора фона и светящийся контур с регулируемым цветом и полным отключением; записано как D41-REQ-33/34. Детали, перечисленные в §13.6.7, ещё не согласованы. Дополнение от 24 октября 2026 года: D41-REQ-35 — два пользовательских режима видимости пустого OBS-виджета («скрывать» или «показывать фон и контур постоянно»); способ мгновенного появления без таймера окончательно установлен более поздним D41-REQ-36. Дополнение от 24 октября 2026 года: пользователь отверг предложение о скрытии после тайм-аута, не принял анимацию и прямо установил последовательное мгновенное появление сообщений снизу с ростом общего виджета вверх до границы OBS браузерного источника; сообщения не исчезают по времени и должны оставаться показанными на протяжении эфира. Зафиксировано как D41-REQ-36, уточнение D41-REQ-13/17/20/35. 24 октября 2026 года пользователь повторно подтвердил ранее согласованный D41-REQ-20: завершение трансляции любой платформы не удаляет и не скрывает её уже отображённые сообщения, поскольку некоторые чаты доступны и вне эфира; автоматически очищать при окончании нельзя. Правило о достоверном начале нового эфира и остальные ограничения памяти/отображения сохраняются. Предыдущее предложение ассистента выбрать между удалением и сохранением сообщений после окончания Twitch было ошибочным повторным открытием уже решённого вопроса.</w:t>
       </w:r>
     </w:p>
     <w:p>

</xml_diff>

<commit_message>
docs: D41-REQ-37 fixed full-size multichat overlay for always-visible mode
</commit_message>
<xml_diff>
--- a/docs/Правила_и_дальнейший_распорядок_работ.docx
+++ b/docs/Правила_и_дальнейший_распорядок_работ.docx
@@ -18158,11 +18158,20 @@
       <w:r>
         <w:t>D41-REQ-35. РЕЖИМ ВИДИМОСТИ ПУСТОГО OBS-ВИДЖЕТА (прямое решение пользователя от 24 октября 2026 года; статус: требования согласованы, код не реализован). В настройках общего мультичата пользователь выбирает один из ДВУХ режимов поведения браузерного OBS-виджета в состоянии без отображаемых сообщений: (1) «Скрывать, когда чат пуст» — весь виджет, включая выбранный общий фон и светящийся контур, полностью прозрачен; при появлении первого допущенного к показу сообщения виджет вновь становится видимым. (2) «Показывать постоянно» — выбранные общий фон и контур продолжают отображаться и при отсутствии сообщений, новые сообщения показываются внутри. Это выбор одного общего режима виджета, а не платформенных настроек Twitch/YouTube; режим распространяется на все экземпляры одного OBS URL и не меняет приём, очередность, буфер, RAM-историю и отдельные правила допуска платформ по D41-REQ-15/16. Параметр относится к оформлению: локальный предпросмотр реагирует на изменения сразу, OBS и браузер применяют сохранённый выбор после «Сохранить» (D41-REQ-31/33). Данное более позднее решение заменяет категорическое правило полной прозрачности пустого OBS-виджета в старой редакции D41-REQ-17, не отменяя отсутствия служебных надписей в OBS. Более позднее прямое решение пользователя D41-REQ-36 уточнило скрытый режим: пустота означает отсутствие реально отображаемых сообщений в OBS, таймер отсутствия активности исключён, первое сообщение и оболочка появляются мгновенно без анимации; дальнейшие сообщения мгновенно расширяют оболочку вверх до фактической высоты браузерного источника. Не путать видимое окно браузерного источника с общим RAM-лимитом сообщений. При завершении одной или нескольких трансляций сообщения не скрываются и не удаляются автоматически; действует D41-REQ-20.</w:t>
       </w:r>
+      <w:r>
+        <w:t xml:space="preserve"> Для режима «Показывать постоянно» полный постоянный размер оформленной области (без динамического роста) выбран пользователем 24 октября 2026 года; подробности D41-REQ-37.</w:t>
+      </w:r>
     </w:p>
     <w:p>
       <w:pPr/>
       <w:r>
         <w:t>D41-REQ-36. МГНОВЕННОЕ ПОЯВЛЕНИЕ И РОСТ ОБЛАСТИ МУЛЬТИЧАТА В OBS (прямое уточнение пользователя от 24 октября 2026 года; требования согласованы, код не реализован). Для выбранного общего режима «Скрывать, когда чат пуст» первоначально при отсутствии реально отображаемых в OBS сообщений вся оформленная область (сообщения, общий фон, светящийся контур) невидима/прозрачна. Как только первое допущенное по D41-REQ-15/16 сообщение становится готовым после общей задержки, одновременно МГНОВЕННО, БЕЗ АНИМАЦИИ, появляются и само сообщение, и оформленная оболочка его фактической высоты. Следующее сообщение появляется СНИЗУ предыдущего: старые сообщения перемещаются ВВЕРХ без анимации, а оформленная область расширяется ВВЕРХ, охватывая все текущие видимые сообщения. С каждым новым сообщением повторяется тот же принцип до предела доступной ВЫСОТЫ браузерного источника OBS; после заполнения области новые сообщения поступают снизу, а более старые вытесняются за верхнюю границу видимой области, не создавая ручную прокрутку и не превышая размеры источника. Не вводить ни тайм-аут неактивности, ни настройку длительности показа, ни плавные/декоративные эффекты появления, роста или исчезновения. Отсутствие новых сообщений и завершение трансляции НЕ скрывают уже видимую область: показанные сообщения остаются на экране без ограничения по времени, в том числе после окончания эфира, за исключением уже утверждённых причин их удаления/замены (платформенное удаление, очистка при смене аккаунта или достоверном начале нового эфира, вытеснение по ограничению RAM или видимой высоты, закрытие приложения). Это уточнение не отменяет второй режим D41-REQ-35 «Показывать постоянно», где фон и контур видны также при нуле сообщений, а новые сообщения добавляются по общим правилам. Конец эфира НЕ является основанием очистки или скрытия, что повторно подтверждено пользователем 24 октября 2026 года: при окончании Twitch и продолжении YouTube старые сообщения Twitch остаются в общей ленте, а YouTube продолжает поступать. Правило D41-REQ-20 допускает очистку при достоверном начале нового эфира, но НЕ при завершении предыдущего. Предыдущее предложение помощника о таймере скрытия и плавной анимации ОТКЛОНЕНО пользователем. Связи: D41-REQ-13/14/15/16/17/18/19/20/35, GLOBAL-OBS-VISIBILITY-001.</w:t>
+      </w:r>
+    </w:p>
+    <w:p>
+      <w:pPr/>
+      <w:r>
+        <w:t>D41-REQ-37. ПОСТОЯННЫЙ ПОЛНЫЙ РАЗМЕР ОБЛАСТИ В РЕЖИМЕ «ПОКАЗЫВАТЬ ПОСТОЯННО» (прямой выбор пользователем варианта 1 от 24 октября 2026 года; требование согласовано, код не реализован). В режиме D41-REQ-35 «Показывать постоянно» общая оформленная область мультичата изначально занимает ВСЮ доступную ширину и высоту браузерного источника OBS независимо от наличия и количества сообщений. Общий фон и светящийся контур, если они выбраны и включены в сохранённом оформлении, рисуются по границам этой полной области в том числе при нуле сообщений; никаких служебных надписей и фиктивных сообщений при пустом чате не добавлять. Полученные сообщения появляются МГНОВЕННО СНИЗУ и постепенно заполняют область вверх; ранее выведенные сообщения сдвигаются вверх без анимации. Размер самого общего фона/контура при этом НЕ растёт и НЕ уменьшается от поступления либо удаления сообщений. После заполнения высоты браузерного источника новые сообщения добавляются снизу, старые выходят за верхнюю границу видимой области по уже согласованному правилу D41-REQ-13/14/36; ручной прокрутки, задержки исчезновения или таймеров показа нет. Размер полной области соответствует фактическим размерам источника OBS при его изменении, а не новому самостоятельному пользовательскому параметру ширины/высоты. Выбор режима и оформление применяются в OBS только после «Сохранить»; во вкладке программы черновые изменения видны немедленно (D41-REQ-31/33/35). Это фиксирует ВАРИАНТ 1 из двух предложенных, вариант 2 (постоянная маленькая область с динамическим ростом) НЕ принят. Режим «Скрывать, когда чат пуст» с динамическим мгновенным ростом по D41-REQ-36 сохраняется без изменений. Содержимое сообщений и поведение после завершения трансляции остаются по D41-REQ-20.</w:t>
       </w:r>
     </w:p>
     <w:p>
@@ -18190,6 +18199,9 @@
       <w:pPr/>
       <w:r>
         <w:t>Источники решений: «Программа для стриминга 70» и продолжение 23–24 октября 2026 года. Отдельные ответы «принимаю», «принимаем», «вариант 2», «так и делаем» относятся к конкретным перечисленным выше вопросам. Последнее решение о мгновенном изменении оформления всех уже отображённых сообщений принято 24 октября 2026 года. После этой записи принято дополнительное правило D41-REQ-23: запуск InOneLine посреди эфира не загружает предыдущую переписку. В тот же день пользователь потребовал регистрировать каждое принятое решение в этом документе и синхронизировать его копию на GitHub; правило закреплено в §1.7. Дополнение от 24 октября 2026 года: принято D41-REQ-24 — при обычном отключении аккаунта без замены уже отображённые сообщения остаются до обычного вытеснения; ожидавшие в буфере сообщения не выводятся. Отличать это от смены аккаунта по D41-REQ-22. 24 октября 2026 года пользователь потребовал разместить мультичат и его настройки в одной вкладке, слева ленту и справа параметры на широком окне, с обязательной адаптацией под 520 × 360 и сохранением узнаваемого общего UI; это внесено в D41-REQ-25. В следующем ответе 24 октября 2026 года пользователь окончательно утвердил минимальную компоновку: чат сверху, настройки снизу с собственной вертикальной прокруткой, а чат остаётся без ручной прокрутки. 24 октября 2026 года пользователь принял группировку настроек мультичата в раскрывающиеся блоки и потребовал скрывать настройки неподключённых сервисов; зафиксировано D41-REQ-26. 24 октября 2026 года принято D41-REQ-27: отдельное тестовое сообщение только для локального предпросмотра оформления, без добавления в настоящий чат, OBS и историю. 24 октября 2026 года принято D41-REQ-28: кнопка тестового сообщения внутри оформления соответствующей подключённой платформы, локальный образец с текстом и графическими элементами, закрытие кнопкой «Закрыть предпросмотр» и возврат к текущей живой ленте без остановки получения сообщений. 24 октября 2026 года принято D41-REQ-29: независимый одновременный показ тестовых сообщений каждой подключённой платформы; предложенная замена одного образца другим явно отклонена. При этом не создаются настоящие сообщения или OBS-события. 24 октября 2026 года пользователь предложил D41-REQ-30/31: настоящие сообщения остаются выше закреплённых снизу тестовых образцов; область чата является немедленным локальным предпросмотром изменений внешнего вида, а опубликованное оформление OBS обновляется только по нажатию «Сохранить». Ранее согласованное мгновенное применение черновых изменений оформления в OBS этим уточнением заменено. 24 октября 2026 года пользователь принял сохранение черновика при смене вкладки и диалог закрытия из D41-REQ-32, а также отдельно подчеркнул обязательное одновременное мгновенное изменение ВСЕХ тестовых и реальных сообщений в локальном предпросмотре D41-REQ-12/31; OBS по-прежнему обновляется только после «Сохранить». 24 октября 2026 года пользователь прямо предложил сопоставить локальную область редактирования/предпросмотра мультичата с редактором правил аукциона, добавить кнопку браузерной проверки, возможность выбора фона и светящийся контур с регулируемым цветом и полным отключением; записано как D41-REQ-33/34. Детали, перечисленные в §13.6.7, ещё не согласованы. Дополнение от 24 октября 2026 года: D41-REQ-35 — два пользовательских режима видимости пустого OBS-виджета («скрывать» или «показывать фон и контур постоянно»); способ мгновенного появления без таймера окончательно установлен более поздним D41-REQ-36. Дополнение от 24 октября 2026 года: пользователь отверг предложение о скрытии после тайм-аута, не принял анимацию и прямо установил последовательное мгновенное появление сообщений снизу с ростом общего виджета вверх до границы OBS браузерного источника; сообщения не исчезают по времени и должны оставаться показанными на протяжении эфира. Зафиксировано как D41-REQ-36, уточнение D41-REQ-13/17/20/35. 24 октября 2026 года пользователь повторно подтвердил ранее согласованный D41-REQ-20: завершение трансляции любой платформы не удаляет и не скрывает её уже отображённые сообщения, поскольку некоторые чаты доступны и вне эфира; автоматически очищать при окончании нельзя. Правило о достоверном начале нового эфира и остальные ограничения памяти/отображения сохраняются. Предыдущее предложение ассистента выбрать между удалением и сохранением сообщений после окончания Twitch было ошибочным повторным открытием уже решённого вопроса.</w:t>
+      </w:r>
+      <w:r>
+        <w:t xml:space="preserve"> 24 октября 2026 года пользователь выбрал вариант 1 для режима «Показывать постоянно»: полный размер общего фона/контура по всей области браузерного источника OBS с самого начала, даже без сообщений, и без динамического расширения области от новых сообщений. Это D41-REQ-37; предложенный вариант 2 отклонён. Скрываемый режим D41-REQ-36 не меняется.</w:t>
       </w:r>
     </w:p>
     <w:p>

</xml_diff>

<commit_message>
docs: approve D41-REQ-38 transparent solid image GIF video chat backgrounds
</commit_message>
<xml_diff>
--- a/docs/Правила_и_дальнейший_распорядок_работ.docx
+++ b/docs/Правила_и_дальнейший_распорядок_работ.docx
@@ -18150,7 +18150,7 @@
     <w:p>
       <w:pPr/>
       <w:r>
-        <w:t>D41-REQ-34. Дополнительное оформление общего мультичата (прямое предложение пользователя 24 октября 2026 года). В настройках мультичата добавить выбор ФОНА для области/виджета мультичата, отдельно от уже принятого фона карточек отдельных сообщений (D41-REQ-11). Добавить СВЕТЯЩИЙСЯ КОНТУР общего виджета чата, с настройкой его цвета и отдельной возможностью полностью ВЫКЛЮЧИТЬ свечение. Значения относятся к редактируемому оформлению: в локальной области предпросмотра видны сразу, а в браузере и OBS применяются после «Сохранить» по D41-REQ-31/33; несохранённые изменения подчиняются D41-REQ-32. В первую очередь переиспользовать действующие элементы редактора правил (выбор фонового медиа, переключение glow и цвет контура) и общую библиотеку медиа; не заводить ещё один импортёр/формат хранения без доказанной необходимости. Точные допустимые фоновые форматы, параметры прозрачности, размеры/толщина контура и место соответствующих контролов определить отдельно при продолжении согласования и технической проверке. Поведение фона и контура при отсутствии сообщений утверждено отдельно в D41-REQ-35. Это предложение пользователя относится к внешнему виду D41, а не к изменению поведения уже реализованного редактора правил.</w:t>
+        <w:t>D41-REQ-34. Дополнительное оформление общего мультичата (прямое предложение пользователя 24 октября 2026 года). В настройках мультичата добавить выбор ФОНА для области/виджета мультичата, отдельно от уже принятого фона карточек отдельных сообщений (D41-REQ-11). Добавить СВЕТЯЩИЙСЯ КОНТУР общего виджета чата, с настройкой его цвета и отдельной возможностью полностью ВЫКЛЮЧИТЬ свечение. Значения относятся к редактируемому оформлению: в локальной области предпросмотра видны сразу, а в браузере и OBS применяются после «Сохранить» по D41-REQ-31/33; несохранённые изменения подчиняются D41-REQ-32. В первую очередь переиспользовать действующие элементы редактора правил (выбор фонового медиа, переключение glow и цвет контура) и общую библиотеку медиа; не заводить ещё один импортёр/формат хранения без доказанной необходимости. Допустимые варианты общего фона утверждены отдельно в D41-REQ-38. Точные диапазоны прозрачности, масштабирование и позиционирование фоновых медиа, размеры/толщина контура и размещение соответствующих контролов требуют проверки и/или отдельного уточнения. Поведение фона и контура при отсутствии сообщений утверждено отдельно в D41-REQ-35. Это предложение пользователя относится к внешнему виду D41, а не к изменению поведения уже реализованного редактора правил.</w:t>
       </w:r>
     </w:p>
     <w:p>
@@ -18175,6 +18175,12 @@
       </w:r>
     </w:p>
     <w:p>
+      <w:pPr/>
+      <w:r>
+        <w:t>D41-REQ-38. ДОПУСТИМЫЕ ВАРИАНТЫ ОБЩЕГО ФОНА МУЛЬТИЧАТА (прямое принятие пользователем 24 октября 2026 года; требование согласовано, код не реализован). Для общего фона области чата во вкладке программы и отдельного браузерного OBS-виджета пользователь выбирает один из согласованных вариантов: (1) полностью прозрачный фон; (2) однотонная заливка с выбором цвета и степени прозрачности; (3) статическое изображение; (4) анимированное изображение GIF; (5) видео. Для изображений, GIF и видео использовать существующую библиотеку фонов/общую медиа-инфраструктуру InOneLine по образцу редактора правил аукциона; не создавать второй параллельный импортёр, каталог или механизм хранения при наличии пригодной существующей реализации. Общий фон отличается от независимо настраиваемого фона карточек сообщений Twitch/YouTube (D41-REQ-11/34). Черновая смена общего фона немедленно видна в локальной области чата вместе с реальными и включёнными тестовыми сообщениями; браузер и OBS получают только сохранённый выбор после «Сохранить» (D41-REQ-31/33). Два режима видимости пустого виджета (D41-REQ-35), мгновенный рост скрываемой оболочки (D41-REQ-36) и полный фиксированный размер постоянно видимой области (D41-REQ-37) сохраняются. Фоновое GIF/видео вправе воспроизводить свою собственную анимацию: запрет анимации относится к появлению сообщений и оболочки чата, а не к содержимому выбранного медиа. Точные способы размещения/масштабирования фонового изображения или видео, параметры цикличности/воспроизведения, поддержанные контейнеры/кодеки и диапазоны численных настроек не выбирались данным решением и подлежат отдельной проверке; не выдавать их за утверждённые. Связи: D41-REQ-11/31/32/33/34/35/36/37 и GLOBAL-UI-001, общая библиотека фонов.</w:t>
+      </w:r>
+    </w:p>
+    <w:p>
       <w:pPr>
         <w:pStyle w:val="Heading3"/>
         <w:keepNext/>
@@ -18186,7 +18192,7 @@
     <w:p>
       <w:pPr/>
       <w:r>
-        <w:t>Не решено и требует технической проверки: точные пределы ручного значения задержки и лимита памяти; поведение при экстремальной нагрузке и весе медиа; факт доступности всех типовых и нестандартных эмодзи YouTube/стикеров и других платформ; полнота событий удаления и подключения; точные пропорции и точки адаптивного перестроения принятой двухрежимной компоновки вкладки «Мультичат», положение регуляторов и URL-кнопок; штатное сохранение признака «разрешено в OBS» на момент готовности сообщения для надёжного восстановления нескольких браузерных экземпляров. Для D41-REQ-27/28 согласованы место кнопки, образец с текстом, никнеймом, аватаром, знаком платформы и эмодзи, способ закрытия и непрерывный приём настоящего чата; более широкие наборы тестовых медиа не утверждены. D41-REQ-29: одновременное отображение нескольких тестовых образцов принято; визуальное размещение и удобство сравнения на минимальной ширине проверяются при UI-реализации. Не возвращаться к отвергнутому режиму автоматической замены образца одного сервиса другим. Для D41-REQ-30/31/32 проверить геометрию закреплённых снизу тестовых сообщений при высокой нагрузке и малой высоте; отдельно согласовать судьбу несохранённого черновика оформления при выходе из программы и переключении вкладок. Мгновенное локальное предпросмотр-оформление не следует путать с сохранённым стилем OBS; изменение OBS только по явной кнопке «Сохранить». Дополнение D41-REQ-33/34: проверить фактическую реализацию сохранённого browser preview редактора правил, перенос уже существующих фоновых медиа и светящегося контура в мультичат, варианты изображения/анимации, два принятых режима пустого виджета по D41-REQ-35, поведение общей рамки в окне минимального размера. Полная прозрачность пустого OBS больше не обязательна во всех случаях: пользователь выбирает режим по D41-REQ-35. D41-REQ-36 окончательно исключает таймер скрытия при отсутствии активности и любую анимацию появления или роста OBS-виджета в режиме «Скрывать, когда чат пуст». Проверить нижнюю привязку, рост вверх при длинном тексте/крупных GIF, обрезку сверху на границе источника, поведение при изменении OBS размера и сохранение старых сообщений при отсутствии новых. ЗАКРЫТО ПОВТОРНЫМ ПОДТВЕРЖДЕНИЕМ: окончание трансляции одной или обеих платформ не удаляет и не скрывает сообщения автоматически; поведение уже определено D41-REQ-20 и уточнено D41-REQ-36. Проверить этот сценарий в Windows/OBS QA без добавления нового режима очистки.</w:t>
+        <w:t>Не решено и требует технической проверки: точные пределы ручного значения задержки и лимита памяти; поведение при экстремальной нагрузке и весе медиа; факт доступности всех типовых и нестандартных эмодзи YouTube/стикеров и других платформ; полнота событий удаления и подключения; точные пропорции и точки адаптивного перестроения принятой двухрежимной компоновки вкладки «Мультичат», положение регуляторов и URL-кнопок; штатное сохранение признака «разрешено в OBS» на момент готовности сообщения для надёжного восстановления нескольких браузерных экземпляров. Для D41-REQ-27/28 согласованы место кнопки, образец с текстом, никнеймом, аватаром, знаком платформы и эмодзи, способ закрытия и непрерывный приём настоящего чата; более широкие наборы тестовых медиа не утверждены. D41-REQ-29: одновременное отображение нескольких тестовых образцов принято; визуальное размещение и удобство сравнения на минимальной ширине проверяются при UI-реализации. Не возвращаться к отвергнутому режиму автоматической замены образца одного сервиса другим. Для D41-REQ-30/31/32 проверить геометрию закреплённых снизу тестовых сообщений при высокой нагрузке и малой высоте; отдельно согласовать судьбу несохранённого черновика оформления при выходе из программы и переключении вкладок. Мгновенное локальное предпросмотр-оформление не следует путать с сохранённым стилем OBS; изменение OBS только по явной кнопке «Сохранить». Дополнение D41-REQ-33/34: проверить фактическую реализацию сохранённого browser preview редактора правил, перенос уже существующих фоновых медиа и светящегося контура в мультичат, утверждённые по D41-REQ-38 фоновые варианты (прозрачный/цвет/изображение/GIF/видео) и их техническую поддержку, способы масштабирования/позиционирования и воспроизведения, два принятых режима пустого виджета по D41-REQ-35, поведение общей рамки в окне минимального размера. Полная прозрачность пустого OBS больше не обязательна во всех случаях: пользователь выбирает режим по D41-REQ-35. D41-REQ-36 окончательно исключает таймер скрытия при отсутствии активности и любую анимацию появления или роста OBS-виджета в режиме «Скрывать, когда чат пуст». Проверить нижнюю привязку, рост вверх при длинном тексте/крупных GIF, обрезку сверху на границе источника, поведение при изменении OBS размера и сохранение старых сообщений при отсутствии новых. ЗАКРЫТО ПОВТОРНЫМ ПОДТВЕРЖДЕНИЕМ: окончание трансляции одной или обеих платформ не удаляет и не скрывает сообщения автоматически; поведение уже определено D41-REQ-20 и уточнено D41-REQ-36. Проверить этот сценарий в Windows/OBS QA без добавления нового режима очистки.</w:t>
       </w:r>
     </w:p>
     <w:p>
@@ -18202,6 +18208,9 @@
       </w:r>
       <w:r>
         <w:t xml:space="preserve"> 24 октября 2026 года пользователь выбрал вариант 1 для режима «Показывать постоянно»: полный размер общего фона/контура по всей области браузерного источника OBS с самого начала, даже без сообщений, и без динамического расширения области от новых сообщений. Это D41-REQ-37; предложенный вариант 2 отклонён. Скрываемый режим D41-REQ-36 не меняется.</w:t>
+      </w:r>
+      <w:r>
+        <w:t xml:space="preserve"> 24 октября 2026 года пользователь принял предложенный полный перечень вариантов общего фона мультичата: полностью прозрачный, однотонная заливка с выбором цвета и прозрачности, статическое изображение, GIF и видео из существующей библиотеки. Решение занесено в D41-REQ-38; параметры размещения и воспроизведения остаются для технической проверки, новые медиа-механизмы без необходимости не добавлять.</w:t>
       </w:r>
     </w:p>
     <w:p>

</xml_diff>

<commit_message>
docs: record D41-REQ-39 image fitting and D41-REQ-40 looped multichat video backgrounds
</commit_message>
<xml_diff>
--- a/docs/Правила_и_дальнейший_распорядок_работ.docx
+++ b/docs/Правила_и_дальнейший_распорядок_работ.docx
@@ -18177,7 +18177,19 @@
     <w:p>
       <w:pPr/>
       <w:r>
-        <w:t>D41-REQ-38. ДОПУСТИМЫЕ ВАРИАНТЫ ОБЩЕГО ФОНА МУЛЬТИЧАТА (прямое принятие пользователем 24 октября 2026 года; требование согласовано, код не реализован). Для общего фона области чата во вкладке программы и отдельного браузерного OBS-виджета пользователь выбирает один из согласованных вариантов: (1) полностью прозрачный фон; (2) однотонная заливка с выбором цвета и степени прозрачности; (3) статическое изображение; (4) анимированное изображение GIF; (5) видео. Для изображений, GIF и видео использовать существующую библиотеку фонов/общую медиа-инфраструктуру InOneLine по образцу редактора правил аукциона; не создавать второй параллельный импортёр, каталог или механизм хранения при наличии пригодной существующей реализации. Общий фон отличается от независимо настраиваемого фона карточек сообщений Twitch/YouTube (D41-REQ-11/34). Черновая смена общего фона немедленно видна в локальной области чата вместе с реальными и включёнными тестовыми сообщениями; браузер и OBS получают только сохранённый выбор после «Сохранить» (D41-REQ-31/33). Два режима видимости пустого виджета (D41-REQ-35), мгновенный рост скрываемой оболочки (D41-REQ-36) и полный фиксированный размер постоянно видимой области (D41-REQ-37) сохраняются. Фоновое GIF/видео вправе воспроизводить свою собственную анимацию: запрет анимации относится к появлению сообщений и оболочки чата, а не к содержимому выбранного медиа. Точные способы размещения/масштабирования фонового изображения или видео, параметры цикличности/воспроизведения, поддержанные контейнеры/кодеки и диапазоны численных настроек не выбирались данным решением и подлежат отдельной проверке; не выдавать их за утверждённые. Связи: D41-REQ-11/31/32/33/34/35/36/37 и GLOBAL-UI-001, общая библиотека фонов.</w:t>
+        <w:t>D41-REQ-38. ДОПУСТИМЫЕ ВАРИАНТЫ ОБЩЕГО ФОНА МУЛЬТИЧАТА (прямое принятие пользователем 24 октября 2026 года; требование согласовано, код не реализован). Для общего фона области чата во вкладке программы и отдельного браузерного OBS-виджета пользователь выбирает один из согласованных вариантов: (1) полностью прозрачный фон; (2) однотонная заливка с выбором цвета и степени прозрачности; (3) статическое изображение; (4) анимированное изображение GIF; (5) видео. Для изображений, GIF и видео использовать существующую библиотеку фонов/общую медиа-инфраструктуру InOneLine по образцу редактора правил аукциона; не создавать второй параллельный импортёр, каталог или механизм хранения при наличии пригодной существующей реализации. Общий фон отличается от независимо настраиваемого фона карточек сообщений Twitch/YouTube (D41-REQ-11/34). Черновая смена общего фона немедленно видна в локальной области чата вместе с реальными и включёнными тестовыми сообщениями; браузер и OBS получают только сохранённый выбор после «Сохранить» (D41-REQ-31/33). Два режима видимости пустого виджета (D41-REQ-35), мгновенный рост скрываемой оболочки (D41-REQ-36) и полный фиксированный размер постоянно видимой области (D41-REQ-37) сохраняются. Фоновое GIF/видео вправе воспроизводить свою собственную анимацию: запрет анимации относится к появлению сообщений и оболочки чата, а не к содержимому выбранного медиа. Масштабирование изображений/GIF/видео теперь согласовано отдельно в D41-REQ-39; циклическое воспроизведение видео утверждено отдельно в D41-REQ-40; режим звука, поддержанные контейнеры/кодеки и диапазоны численных настроек остаются для отдельной проверки, не выдавать их за утверждённые. Связи: D41-REQ-11/31/32/33/34/35/36/37/39 и GLOBAL-UI-001, общая библиотека фонов.</w:t>
+      </w:r>
+    </w:p>
+    <w:p>
+      <w:pPr/>
+      <w:r>
+        <w:t>D41-REQ-39. ДВА СПОСОБА МАСШТАБИРОВАНИЯ ОБЩЕГО МЕДИА-ФОНА МУЛЬТИЧАТА (прямое принятие пользователем 24 октября 2026 года; согласовано как требование, код D41 не реализован). Для фоновых статических изображений, анимированных GIF и видео из D41-REQ-38 пользователь может переключать способ размещения внутри ФАКТИЧЕСКОЙ оформленной области мультичата: (1) «Вписать целиком» — показывать весь исходный кадр, сохранять его пропорции, при несовпадении пропорций допускать незаполненные полосы по краям; (2) «Заполнить область» — полностью покрывать исходным кадром оформленную область с сохранением пропорций, допуская обрезку части кадра по краям. Оба варианта являются вариантами размещения ОДНОГО ОБЩЕГО фона, а не независимыми параметрами Twitch/YouTube. Изменение режима немедленно видно в локальном предпросмотре; в браузерном виджете и OBS применяется только после нажатия «Сохранить» по D41-REQ-31/33. При динамическом росте виджета в скрываемом режиме фон подстраивается под актуальный размер области (D41-REQ-36); при постоянном показе — под полную область источника (D41-REQ-37). Масштабирование не вводит задержек, таймеров и анимации оболочки или сообщений; собственная анимация GIF/видео не затрагивается. Положение точки обрезки, отдельные способы размещения (растянуть с искажением, плитка и др.), циклическое воспроизведение видео утверждено отдельным более поздним D41-REQ-40; точка обрезки и прочие параметры данным решением НЕ утверждены. Связи: D41-REQ-31/33/35/36/37/38; общая библиотека фонов. Статус: согласовано к реализации; код, Windows QA и ручная приёмка отсутствуют.</w:t>
+      </w:r>
+    </w:p>
+    <w:p>
+      <w:pPr/>
+      <w:r>
+        <w:t>D41-REQ-40. ЦИКЛИЧЕСКОЕ ВОСПРОИЗВЕДЕНИЕ ВИДЕОФОНА МУЛЬТИЧАТА (прямое принятие пользователем 24 октября 2026 года; согласовано как требование, код не реализован). Если в качестве ОБЩЕГО фона выбран видеофайл по D41-REQ-38, видео воспроизводится циклически: когда достигается конец файла, воспроизведение автоматически начинается с его начала; циклы повторяются без ограниченного числа повторов, пока пользователь не заменит видеофон другим видом фона или другим файлом. Это поведение относится именно к выбранному видеофону во вкладке программы, браузерном просмотре и OBS, а не к анимации появления сообщений, расширения оболочки чата или к графическим элементам сообщений. Сохранённая версия для OBS следует D41-REQ-31/33, локальный черновик сразу виден в области предпросмотра. Утверждённая цикличность не вводит таймеров показа и не изменяет два режима видимости D41-REQ-35/36/37 или способы масштабирования D41-REQ-39. Поведение звуковой дорожки видео и техническая совместимость контейнеров/кодеков данным ответом отдельно НЕ согласованы; проверить перед реализацией, не придумывая настройку звука. Источник: прямой ответ пользователя «Принимаю. Дальше.» от 24 октября 2026 года на предложение о циклическом воспроизведении видеофона. Статус: согласовано к реализации; код, Windows QA, ручная приёмка, слияние и релиз отсутствуют. Связи: D41-REQ-31/33/35/36/37/38/39; общая библиотека фоновых медиа.</w:t>
       </w:r>
     </w:p>
     <w:p>
@@ -18192,7 +18204,7 @@
     <w:p>
       <w:pPr/>
       <w:r>
-        <w:t>Не решено и требует технической проверки: точные пределы ручного значения задержки и лимита памяти; поведение при экстремальной нагрузке и весе медиа; факт доступности всех типовых и нестандартных эмодзи YouTube/стикеров и других платформ; полнота событий удаления и подключения; точные пропорции и точки адаптивного перестроения принятой двухрежимной компоновки вкладки «Мультичат», положение регуляторов и URL-кнопок; штатное сохранение признака «разрешено в OBS» на момент готовности сообщения для надёжного восстановления нескольких браузерных экземпляров. Для D41-REQ-27/28 согласованы место кнопки, образец с текстом, никнеймом, аватаром, знаком платформы и эмодзи, способ закрытия и непрерывный приём настоящего чата; более широкие наборы тестовых медиа не утверждены. D41-REQ-29: одновременное отображение нескольких тестовых образцов принято; визуальное размещение и удобство сравнения на минимальной ширине проверяются при UI-реализации. Не возвращаться к отвергнутому режиму автоматической замены образца одного сервиса другим. Для D41-REQ-30/31/32 проверить геометрию закреплённых снизу тестовых сообщений при высокой нагрузке и малой высоте; отдельно согласовать судьбу несохранённого черновика оформления при выходе из программы и переключении вкладок. Мгновенное локальное предпросмотр-оформление не следует путать с сохранённым стилем OBS; изменение OBS только по явной кнопке «Сохранить». Дополнение D41-REQ-33/34: проверить фактическую реализацию сохранённого browser preview редактора правил, перенос уже существующих фоновых медиа и светящегося контура в мультичат, утверждённые по D41-REQ-38 фоновые варианты (прозрачный/цвет/изображение/GIF/видео) и их техническую поддержку, способы масштабирования/позиционирования и воспроизведения, два принятых режима пустого виджета по D41-REQ-35, поведение общей рамки в окне минимального размера. Полная прозрачность пустого OBS больше не обязательна во всех случаях: пользователь выбирает режим по D41-REQ-35. D41-REQ-36 окончательно исключает таймер скрытия при отсутствии активности и любую анимацию появления или роста OBS-виджета в режиме «Скрывать, когда чат пуст». Проверить нижнюю привязку, рост вверх при длинном тексте/крупных GIF, обрезку сверху на границе источника, поведение при изменении OBS размера и сохранение старых сообщений при отсутствии новых. ЗАКРЫТО ПОВТОРНЫМ ПОДТВЕРЖДЕНИЕМ: окончание трансляции одной или обеих платформ не удаляет и не скрывает сообщения автоматически; поведение уже определено D41-REQ-20 и уточнено D41-REQ-36. Проверить этот сценарий в Windows/OBS QA без добавления нового режима очистки.</w:t>
+        <w:t>Не решено и требует технической проверки: точные пределы ручного значения задержки и лимита памяти; поведение при экстремальной нагрузке и весе медиа; факт доступности всех типовых и нестандартных эмодзи YouTube/стикеров и других платформ; полнота событий удаления и подключения; точные пропорции и точки адаптивного перестроения принятой двухрежимной компоновки вкладки «Мультичат», положение регуляторов и URL-кнопок; штатное сохранение признака «разрешено в OBS» на момент готовности сообщения для надёжного восстановления нескольких браузерных экземпляров. Для D41-REQ-27/28 согласованы место кнопки, образец с текстом, никнеймом, аватаром, знаком платформы и эмодзи, способ закрытия и непрерывный приём настоящего чата; более широкие наборы тестовых медиа не утверждены. D41-REQ-29: одновременное отображение нескольких тестовых образцов принято; визуальное размещение и удобство сравнения на минимальной ширине проверяются при UI-реализации. Не возвращаться к отвергнутому режиму автоматической замены образца одного сервиса другим. Для D41-REQ-30/31/32 проверить геометрию закреплённых снизу тестовых сообщений при высокой нагрузке и малой высоте; поведение несохранённого черновика при переключении вкладок и закрытии уже согласовано D41-REQ-32; при реализации проверить три действия диалога закрытия. Мгновенное локальное предпросмотр-оформление не следует путать с сохранённым стилем OBS; изменение OBS только по явной кнопке «Сохранить». Дополнение D41-REQ-33/34: проверить фактическую реализацию сохранённого browser preview редактора правил, перенос уже существующих фоновых медиа и светящегося контура в мультичат, утверждённые по D41-REQ-38 фоновые варианты (прозрачный/цвет/изображение/GIF/видео) и их техническую поддержку, два согласованных способа масштабирования общего медиа-фона по D41-REQ-39, открытые параметры точки обрезки и звуковой дорожки; повтор видеофона уже согласован D41-REQ-40, два принятых режима пустого виджета по D41-REQ-35, поведение общей рамки в окне минимального размера. Полная прозрачность пустого OBS больше не обязательна во всех случаях: пользователь выбирает режим по D41-REQ-35. D41-REQ-36 окончательно исключает таймер скрытия при отсутствии активности и любую анимацию появления или роста OBS-виджета в режиме «Скрывать, когда чат пуст». Проверить нижнюю привязку, рост вверх при длинном тексте/крупных GIF, обрезку сверху на границе источника, поведение при изменении OBS размера и сохранение старых сообщений при отсутствии новых. ЗАКРЫТО ПОВТОРНЫМ ПОДТВЕРЖДЕНИЕМ: окончание трансляции одной или обеих платформ не удаляет и не скрывает сообщения автоматически; поведение уже определено D41-REQ-20 и уточнено D41-REQ-36. Проверить этот сценарий в Windows/OBS QA без добавления нового режима очистки.</w:t>
       </w:r>
     </w:p>
     <w:p>
@@ -18204,13 +18216,7 @@
     <w:p>
       <w:pPr/>
       <w:r>
-        <w:t>Источники решений: «Программа для стриминга 70» и продолжение 23–24 октября 2026 года. Отдельные ответы «принимаю», «принимаем», «вариант 2», «так и делаем» относятся к конкретным перечисленным выше вопросам. Последнее решение о мгновенном изменении оформления всех уже отображённых сообщений принято 24 октября 2026 года. После этой записи принято дополнительное правило D41-REQ-23: запуск InOneLine посреди эфира не загружает предыдущую переписку. В тот же день пользователь потребовал регистрировать каждое принятое решение в этом документе и синхронизировать его копию на GitHub; правило закреплено в §1.7. Дополнение от 24 октября 2026 года: принято D41-REQ-24 — при обычном отключении аккаунта без замены уже отображённые сообщения остаются до обычного вытеснения; ожидавшие в буфере сообщения не выводятся. Отличать это от смены аккаунта по D41-REQ-22. 24 октября 2026 года пользователь потребовал разместить мультичат и его настройки в одной вкладке, слева ленту и справа параметры на широком окне, с обязательной адаптацией под 520 × 360 и сохранением узнаваемого общего UI; это внесено в D41-REQ-25. В следующем ответе 24 октября 2026 года пользователь окончательно утвердил минимальную компоновку: чат сверху, настройки снизу с собственной вертикальной прокруткой, а чат остаётся без ручной прокрутки. 24 октября 2026 года пользователь принял группировку настроек мультичата в раскрывающиеся блоки и потребовал скрывать настройки неподключённых сервисов; зафиксировано D41-REQ-26. 24 октября 2026 года принято D41-REQ-27: отдельное тестовое сообщение только для локального предпросмотра оформления, без добавления в настоящий чат, OBS и историю. 24 октября 2026 года принято D41-REQ-28: кнопка тестового сообщения внутри оформления соответствующей подключённой платформы, локальный образец с текстом и графическими элементами, закрытие кнопкой «Закрыть предпросмотр» и возврат к текущей живой ленте без остановки получения сообщений. 24 октября 2026 года принято D41-REQ-29: независимый одновременный показ тестовых сообщений каждой подключённой платформы; предложенная замена одного образца другим явно отклонена. При этом не создаются настоящие сообщения или OBS-события. 24 октября 2026 года пользователь предложил D41-REQ-30/31: настоящие сообщения остаются выше закреплённых снизу тестовых образцов; область чата является немедленным локальным предпросмотром изменений внешнего вида, а опубликованное оформление OBS обновляется только по нажатию «Сохранить». Ранее согласованное мгновенное применение черновых изменений оформления в OBS этим уточнением заменено. 24 октября 2026 года пользователь принял сохранение черновика при смене вкладки и диалог закрытия из D41-REQ-32, а также отдельно подчеркнул обязательное одновременное мгновенное изменение ВСЕХ тестовых и реальных сообщений в локальном предпросмотре D41-REQ-12/31; OBS по-прежнему обновляется только после «Сохранить». 24 октября 2026 года пользователь прямо предложил сопоставить локальную область редактирования/предпросмотра мультичата с редактором правил аукциона, добавить кнопку браузерной проверки, возможность выбора фона и светящийся контур с регулируемым цветом и полным отключением; записано как D41-REQ-33/34. Детали, перечисленные в §13.6.7, ещё не согласованы. Дополнение от 24 октября 2026 года: D41-REQ-35 — два пользовательских режима видимости пустого OBS-виджета («скрывать» или «показывать фон и контур постоянно»); способ мгновенного появления без таймера окончательно установлен более поздним D41-REQ-36. Дополнение от 24 октября 2026 года: пользователь отверг предложение о скрытии после тайм-аута, не принял анимацию и прямо установил последовательное мгновенное появление сообщений снизу с ростом общего виджета вверх до границы OBS браузерного источника; сообщения не исчезают по времени и должны оставаться показанными на протяжении эфира. Зафиксировано как D41-REQ-36, уточнение D41-REQ-13/17/20/35. 24 октября 2026 года пользователь повторно подтвердил ранее согласованный D41-REQ-20: завершение трансляции любой платформы не удаляет и не скрывает её уже отображённые сообщения, поскольку некоторые чаты доступны и вне эфира; автоматически очищать при окончании нельзя. Правило о достоверном начале нового эфира и остальные ограничения памяти/отображения сохраняются. Предыдущее предложение ассистента выбрать между удалением и сохранением сообщений после окончания Twitch было ошибочным повторным открытием уже решённого вопроса.</w:t>
-      </w:r>
-      <w:r>
-        <w:t xml:space="preserve"> 24 октября 2026 года пользователь выбрал вариант 1 для режима «Показывать постоянно»: полный размер общего фона/контура по всей области браузерного источника OBS с самого начала, даже без сообщений, и без динамического расширения области от новых сообщений. Это D41-REQ-37; предложенный вариант 2 отклонён. Скрываемый режим D41-REQ-36 не меняется.</w:t>
-      </w:r>
-      <w:r>
-        <w:t xml:space="preserve"> 24 октября 2026 года пользователь принял предложенный полный перечень вариантов общего фона мультичата: полностью прозрачный, однотонная заливка с выбором цвета и прозрачности, статическое изображение, GIF и видео из существующей библиотеки. Решение занесено в D41-REQ-38; параметры размещения и воспроизведения остаются для технической проверки, новые медиа-механизмы без необходимости не добавлять.</w:t>
+        <w:t>Источники решений: «Программа для стриминга 70» и продолжение 23–24 октября 2026 года. Отдельные ответы «принимаю», «принимаем», «вариант 2», «так и делаем» относятся к конкретным перечисленным выше вопросам. Последнее решение о мгновенном изменении оформления всех уже отображённых сообщений принято 24 октября 2026 года. После этой записи принято дополнительное правило D41-REQ-23: запуск InOneLine посреди эфира не загружает предыдущую переписку. В тот же день пользователь потребовал регистрировать каждое принятое решение в этом документе и синхронизировать его копию на GitHub; правило закреплено в §1.7. Дополнение от 24 октября 2026 года: принято D41-REQ-24 — при обычном отключении аккаунта без замены уже отображённые сообщения остаются до обычного вытеснения; ожидавшие в буфере сообщения не выводятся. Отличать это от смены аккаунта по D41-REQ-22. 24 октября 2026 года пользователь потребовал разместить мультичат и его настройки в одной вкладке, слева ленту и справа параметры на широком окне, с обязательной адаптацией под 520 × 360 и сохранением узнаваемого общего UI; это внесено в D41-REQ-25. В следующем ответе 24 октября 2026 года пользователь окончательно утвердил минимальную компоновку: чат сверху, настройки снизу с собственной вертикальной прокруткой, а чат остаётся без ручной прокрутки. 24 октября 2026 года пользователь принял группировку настроек мультичата в раскрывающиеся блоки и потребовал скрывать настройки неподключённых сервисов; зафиксировано D41-REQ-26. 24 октября 2026 года принято D41-REQ-27: отдельное тестовое сообщение только для локального предпросмотра оформления, без добавления в настоящий чат, OBS и историю. 24 октября 2026 года принято D41-REQ-28: кнопка тестового сообщения внутри оформления соответствующей подключённой платформы, локальный образец с текстом и графическими элементами, закрытие кнопкой «Закрыть предпросмотр» и возврат к текущей живой ленте без остановки получения сообщений. 24 октября 2026 года принято D41-REQ-29: независимый одновременный показ тестовых сообщений каждой подключённой платформы; предложенная замена одного образца другим явно отклонена. При этом не создаются настоящие сообщения или OBS-события. 24 октября 2026 года пользователь предложил D41-REQ-30/31: настоящие сообщения остаются выше закреплённых снизу тестовых образцов; область чата является немедленным локальным предпросмотром изменений внешнего вида, а опубликованное оформление OBS обновляется только по нажатию «Сохранить». Ранее согласованное мгновенное применение черновых изменений оформления в OBS этим уточнением заменено. 24 октября 2026 года пользователь принял сохранение черновика при смене вкладки и диалог закрытия из D41-REQ-32, а также отдельно подчеркнул обязательное одновременное мгновенное изменение ВСЕХ тестовых и реальных сообщений в локальном предпросмотре D41-REQ-12/31; OBS по-прежнему обновляется только после «Сохранить». 24 октября 2026 года пользователь прямо предложил сопоставить локальную область редактирования/предпросмотра мультичата с редактором правил аукциона, добавить кнопку браузерной проверки, возможность выбора фона и светящийся контур с регулируемым цветом и полным отключением; записано как D41-REQ-33/34. Детали, перечисленные в §13.6.7, ещё не согласованы. Дополнение от 24 октября 2026 года: D41-REQ-35 — два пользовательских режима видимости пустого OBS-виджета («скрывать» или «показывать фон и контур постоянно»); способ мгновенного появления без таймера окончательно установлен более поздним D41-REQ-36. Дополнение от 24 октября 2026 года: пользователь отверг предложение о скрытии после тайм-аута, не принял анимацию и прямо установил последовательное мгновенное появление сообщений снизу с ростом общего виджета вверх до границы OBS браузерного источника; сообщения не исчезают по времени и должны оставаться показанными на протяжении эфира. Зафиксировано как D41-REQ-36, уточнение D41-REQ-13/17/20/35. 24 октября 2026 года пользователь повторно подтвердил ранее согласованный D41-REQ-20: завершение трансляции любой платформы не удаляет и не скрывает её уже отображённые сообщения, поскольку некоторые чаты доступны и вне эфира; автоматически очищать при окончании нельзя. Правило о достоверном начале нового эфира и остальные ограничения памяти/отображения сохраняются. Предыдущее предложение ассистента выбрать между удалением и сохранением сообщений после окончания Twitch было ошибочным повторным открытием уже решённого вопроса. 24 октября 2026 года пользователь выбрал вариант 1 для режима «Показывать постоянно»: полный размер общего фона/контура по всей области браузерного источника OBS с самого начала, даже без сообщений, и без динамического расширения области от новых сообщений. Это D41-REQ-37; предложенный вариант 2 отклонён. Скрываемый режим D41-REQ-36 не меняется. 24 октября 2026 года пользователь принял предложенный полный перечень вариантов общего фона мультичата: полностью прозрачный, однотонная заливка с выбором цвета и прозрачности, статическое изображение, GIF и видео из существующей библиотеки. Решение занесено в D41-REQ-38; параметры размещения и воспроизведения остаются для технической проверки, новые медиа-механизмы без необходимости не добавлять. 24 октября 2026 года пользователь утвердил оба режима масштабирования фоновых изображений, GIF и видео: «Вписать целиком» и «Заполнить область», с немедленным просмотром локального черновика и применением к OBS только по «Сохранить»; решение внесено как D41-REQ-39. Параметры цикличности/автовоспроизведения видео и точка обрезки не утверждены. 24 октября 2026 года пользователь принял D41-REQ-40 — циклический повтор выбранного видеофона после завершения ролика; звук видео не согласован отдельно. D41-REQ-39 сохранён как два способа масштабирования. На момент документального обновления GitHub-копия отставала от Google Drive по D41-REQ-39; после публикации требуется побайтовая проверка обеих площадок.</w:t>
       </w:r>
     </w:p>
     <w:p>

</xml_diff>

<commit_message>
docs: approve multichat glow scope and require verifying existing in-app analogues (D41-REQ-42)
</commit_message>
<xml_diff>
--- a/docs/Правила_и_дальнейший_распорядок_работ.docx
+++ b/docs/Правила_и_дальнейший_распорядок_работ.docx
@@ -119,6 +119,12 @@
     <w:p>
       <w:r>
         <w:t>Основной принцип: reuse first → minimal diff → no parallel logic → no new persistence unless unavoidable. Сначала использовать существующие данные, UI, настройки, вычисления, API, путь хранения, helper или backend. Новая сущность допустима, когда существующий механизм объективно непригоден для корректности, надёжности или требуемой производительности.</w:t>
+      </w:r>
+    </w:p>
+    <w:p>
+      <w:pPr/>
+      <w:r>
+        <w:t>ОБЯЗАТЕЛЬНАЯ ПРОВЕРКА АНАЛОГОВ В КОДЕ (прямое правило пользователя, 24 октября 2026 года). Прежде чем предлагать новую настройку, действие или поведение «по образцу» уже имеющейся функции InOneLine, сначала проверить актуальную реализацию в GitHub: фактически доступные пользователю элементы интерфейса, связанные значения и код вывода/сохранения. Разделять то, что действительно настраивается пользователем, и константы/внутренние эффекты кода. Ссылаться на точный файл и обнаруженный механизм; если настройка или поведение в программе отсутствуют, не выдавать их за существующий аналог, а прямо обозначать как новое самостоятельное предложение, требующее согласования. Не придумывать возможности, настройки или свойства по памяти либо аналогии без подтверждения. Правило действует для всех будущих обсуждений, не только D41.</w:t>
       </w:r>
     </w:p>
     <w:p>
@@ -18150,7 +18156,7 @@
     <w:p>
       <w:pPr/>
       <w:r>
-        <w:t>D41-REQ-34. Дополнительное оформление общего мультичата (прямое предложение пользователя 24 октября 2026 года). В настройках мультичата добавить выбор ФОНА для области/виджета мультичата, отдельно от уже принятого фона карточек отдельных сообщений (D41-REQ-11). Добавить СВЕТЯЩИЙСЯ КОНТУР общего виджета чата, с настройкой его цвета и отдельной возможностью полностью ВЫКЛЮЧИТЬ свечение. Значения относятся к редактируемому оформлению: в локальной области предпросмотра видны сразу, а в браузере и OBS применяются после «Сохранить» по D41-REQ-31/33; несохранённые изменения подчиняются D41-REQ-32. В первую очередь переиспользовать действующие элементы редактора правил (выбор фонового медиа, переключение glow и цвет контура) и общую библиотеку медиа; не заводить ещё один импортёр/формат хранения без доказанной необходимости. Допустимые варианты общего фона утверждены отдельно в D41-REQ-38. Точные диапазоны прозрачности, масштабирование и позиционирование фоновых медиа, размеры/толщина контура и размещение соответствующих контролов требуют проверки и/или отдельного уточнения. Поведение фона и контура при отсутствии сообщений утверждено отдельно в D41-REQ-35. Это предложение пользователя относится к внешнему виду D41, а не к изменению поведения уже реализованного редактора правил.</w:t>
+        <w:t>D41-REQ-34. Дополнительное оформление общего мультичата (прямое предложение пользователя 24 октября 2026 года). В настройках мультичата добавить выбор ФОНА для области/виджета мультичата, отдельно от уже принятого фона карточек отдельных сообщений (D41-REQ-11). Добавить СВЕТЯЩИЙСЯ КОНТУР общего виджета чата, с настройкой его цвета и отдельной возможностью полностью ВЫКЛЮЧИТЬ свечение. Значения относятся к редактируемому оформлению: в локальной области предпросмотра видны сразу, а в браузере и OBS применяются после «Сохранить» по D41-REQ-31/33; несохранённые изменения подчиняются D41-REQ-32. В первую очередь переиспользовать действующие элементы редактора правил (выбор фонового медиа, переключение glow и цвет контура) и общую библиотеку медиа; не заводить ещё один импортёр/формат хранения без доказанной необходимости. Допустимые варианты общего фона утверждены отдельно в D41-REQ-38. Точные диапазоны прозрачности, позиционирование фоновых медиа и размещение соответствующих контролов требуют технической проверки; масштабирование фонов уже согласовано в D41-REQ-39. Состав настроек свечения окончательно ограничен D41-REQ-42: только переключатель и выбор цвета, без пользовательской регулировки толщины или интенсивности. Поведение фона и контура при отсутствии сообщений утверждено отдельно в D41-REQ-35. Это предложение пользователя относится к внешнему виду D41, а не к изменению поведения уже реализованного редактора правил.</w:t>
       </w:r>
     </w:p>
     <w:p>
@@ -18177,7 +18183,7 @@
     <w:p>
       <w:pPr/>
       <w:r>
-        <w:t>D41-REQ-38. ДОПУСТИМЫЕ ВАРИАНТЫ ОБЩЕГО ФОНА МУЛЬТИЧАТА (прямое принятие пользователем 24 октября 2026 года; требование согласовано, код не реализован). Для общего фона области чата во вкладке программы и отдельного браузерного OBS-виджета пользователь выбирает один из согласованных вариантов: (1) полностью прозрачный фон; (2) однотонная заливка с выбором цвета и степени прозрачности; (3) статическое изображение; (4) анимированное изображение GIF; (5) видео. Для изображений, GIF и видео использовать существующую библиотеку фонов/общую медиа-инфраструктуру InOneLine по образцу редактора правил аукциона; не создавать второй параллельный импортёр, каталог или механизм хранения при наличии пригодной существующей реализации. Общий фон отличается от независимо настраиваемого фона карточек сообщений Twitch/YouTube (D41-REQ-11/34). Черновая смена общего фона немедленно видна в локальной области чата вместе с реальными и включёнными тестовыми сообщениями; браузер и OBS получают только сохранённый выбор после «Сохранить» (D41-REQ-31/33). Два режима видимости пустого виджета (D41-REQ-35), мгновенный рост скрываемой оболочки (D41-REQ-36) и полный фиксированный размер постоянно видимой области (D41-REQ-37) сохраняются. Фоновое GIF/видео вправе воспроизводить свою собственную анимацию: запрет анимации относится к появлению сообщений и оболочки чата, а не к содержимому выбранного медиа. Масштабирование изображений/GIF/видео теперь согласовано отдельно в D41-REQ-39; циклическое воспроизведение видео утверждено отдельно в D41-REQ-40; режим звука, поддержанные контейнеры/кодеки и диапазоны численных настроек остаются для отдельной проверки, не выдавать их за утверждённые. Связи: D41-REQ-11/31/32/33/34/35/36/37/39 и GLOBAL-UI-001, общая библиотека фонов.</w:t>
+        <w:t>D41-REQ-38. ДОПУСТИМЫЕ ВАРИАНТЫ ОБЩЕГО ФОНА МУЛЬТИЧАТА (прямое принятие пользователем 24 октября 2026 года; требование согласовано, код не реализован). Для общего фона области чата во вкладке программы и отдельного браузерного OBS-виджета пользователь выбирает один из согласованных вариантов: (1) полностью прозрачный фон; (2) однотонная заливка с выбором цвета и степени прозрачности; (3) статическое изображение; (4) анимированное изображение GIF; (5) видео. Для изображений, GIF и видео использовать существующую библиотеку фонов/общую медиа-инфраструктуру InOneLine по образцу редактора правил аукциона; не создавать второй параллельный импортёр, каталог или механизм хранения при наличии пригодной существующей реализации. Общий фон отличается от независимо настраиваемого фона карточек сообщений Twitch/YouTube (D41-REQ-11/34). Черновая смена общего фона немедленно видна в локальной области чата вместе с реальными и включёнными тестовыми сообщениями; браузер и OBS получают только сохранённый выбор после «Сохранить» (D41-REQ-31/33). Два режима видимости пустого виджета (D41-REQ-35), мгновенный рост скрываемой оболочки (D41-REQ-36) и полный фиксированный размер постоянно видимой области (D41-REQ-37) сохраняются. Фоновое GIF/видео вправе воспроизводить свою собственную анимацию: запрет анимации относится к появлению сообщений и оболочки чата, а не к содержимому выбранного медиа. Масштабирование изображений/GIF/видео теперь согласовано отдельно в D41-REQ-39; циклическое воспроизведение видео утверждено отдельно в D41-REQ-40; звук видеофона прямо согласован позднее в D41-REQ-41 (всегда без звука); поддержанные контейнеры/кодеки и диапазоны численных настроек остаются для технической проверки. Связи: D41-REQ-11/31/32/33/34/35/36/37/39 и GLOBAL-UI-001, общая библиотека фонов.</w:t>
       </w:r>
     </w:p>
     <w:p>
@@ -18189,7 +18195,19 @@
     <w:p>
       <w:pPr/>
       <w:r>
-        <w:t>D41-REQ-40. ЦИКЛИЧЕСКОЕ ВОСПРОИЗВЕДЕНИЕ ВИДЕОФОНА МУЛЬТИЧАТА (прямое принятие пользователем 24 октября 2026 года; согласовано как требование, код не реализован). Если в качестве ОБЩЕГО фона выбран видеофайл по D41-REQ-38, видео воспроизводится циклически: когда достигается конец файла, воспроизведение автоматически начинается с его начала; циклы повторяются без ограниченного числа повторов, пока пользователь не заменит видеофон другим видом фона или другим файлом. Это поведение относится именно к выбранному видеофону во вкладке программы, браузерном просмотре и OBS, а не к анимации появления сообщений, расширения оболочки чата или к графическим элементам сообщений. Сохранённая версия для OBS следует D41-REQ-31/33, локальный черновик сразу виден в области предпросмотра. Утверждённая цикличность не вводит таймеров показа и не изменяет два режима видимости D41-REQ-35/36/37 или способы масштабирования D41-REQ-39. Поведение звуковой дорожки видео и техническая совместимость контейнеров/кодеков данным ответом отдельно НЕ согласованы; проверить перед реализацией, не придумывая настройку звука. Источник: прямой ответ пользователя «Принимаю. Дальше.» от 24 октября 2026 года на предложение о циклическом воспроизведении видеофона. Статус: согласовано к реализации; код, Windows QA, ручная приёмка, слияние и релиз отсутствуют. Связи: D41-REQ-31/33/35/36/37/38/39; общая библиотека фоновых медиа.</w:t>
+        <w:t>D41-REQ-40. ЦИКЛИЧЕСКОЕ ВОСПРОИЗВЕДЕНИЕ ВИДЕОФОНА МУЛЬТИЧАТА (прямое принятие пользователем 24 октября 2026 года; согласовано как требование, код не реализован). Если в качестве ОБЩЕГО фона выбран видеофайл по D41-REQ-38, видео воспроизводится циклически: когда достигается конец файла, воспроизведение автоматически начинается с его начала; циклы повторяются без ограниченного числа повторов, пока пользователь не заменит видеофон другим видом фона или другим файлом. Это поведение относится именно к выбранному видеофону во вкладке программы, браузерном просмотре и OBS, а не к анимации появления сообщений, расширения оболочки чата или к графическим элементам сообщений. Сохранённая версия для OBS следует D41-REQ-31/33, локальный черновик сразу виден в области предпросмотра. Утверждённая цикличность не вводит таймеров показа и не изменяет два режима видимости D41-REQ-35/36/37 или способы масштабирования D41-REQ-39. Позднее пользователь отдельно согласовал D41-REQ-41: звуковая дорожка видеофона всегда отключена, настройки включения звука и громкости не нужны. Техническую совместимость контейнеров/кодеков проверить перед реализацией. Источник: прямой ответ пользователя «Принимаю. Дальше.» от 24 октября 2026 года на предложение о циклическом воспроизведении видеофона. Статус: согласовано к реализации; код, Windows QA, ручная приёмка, слияние и релиз отсутствуют. Связи: D41-REQ-31/33/35/36/37/38/39; общая библиотека фоновых медиа.</w:t>
+      </w:r>
+    </w:p>
+    <w:p>
+      <w:pPr/>
+      <w:r>
+        <w:t>D41-REQ-41. ВИДЕОФОН МУЛЬТИЧАТА ВСЕГДА БЕЗ ЗВУКА (прямое принятие пользователем 24 октября 2026 года; требование согласовано, код не реализован). Когда общим фоном выбран видеофайл по D41-REQ-38, его звуковая дорожка НЕ воспроизводится ни в локальной области мультичата InOneLine, ни в просмотре по кнопке «Проверить в браузере», ни в OBS-виджете. Видеофон служит исключительно декоративным визуальным элементом. В настройках мультичата НЕ создавать переключатель включения звука видеофона и НЕ добавлять для него регулятор громкости. Автоматический бесконечный повтор по D41-REQ-40 и способы масштабирования по D41-REQ-39 остаются неизменными; это правило не выключает графическую анимацию фона и не затрагивает аудио других функций программы. Источник: прямой ответ пользователя «Принимаю. Дальше.» от 24 октября 2026 года на предложение всегда проигрывать видеофон без звука. Статус: согласовано к реализации; код, Windows QA, ручная приёмка, слияние и релиз отсутствуют. Связи: D41-REQ-31/33/34/38/39/40; общий аудиоконтракт и правило переиспользования.</w:t>
+      </w:r>
+    </w:p>
+    <w:p>
+      <w:pPr/>
+      <w:r>
+        <w:t>D41-REQ-42. НАСТРОЙКИ СВЕТЯЩЕГОСЯ КОНТУРА МУЛЬТИЧАТА (прямое принятие пользователем 24 октября 2026 года; код D41 не реализован). Для ОБЩЕГО контура мультичата использовать ТОЛЬКО уже существующий набор пользовательских контролов редактора правил аукциона: (1) флажок «Светящийся контур», включающий и полностью отключающий свечение; (2) «Цвет контура», выбираемый через диалог и существующую экранную пипетку. Отдельные пользовательские настройки ТОЛЩИНЫ контура, ИНТЕНСИВНОСТИ свечения или радиуса размытия НЕ добавлять. Проверка действующего кода streaming_manager/views/rules_editor.py в GitHub подтверждает только флажок и цвет; эффект QGraphicsDropShadowEffect имеет фиксированный setBlurRadius(20), не доступный пользователю. Локальный предпросмотр изменяется сразу, браузер/OBS — после «Сохранить» (D41-REQ-31/33); сочетание с фоном и обоими режимами видимости — D41-REQ-34/35/36/37. Предыдущее предложение ассистента о пользовательской толщине и интенсивности «по образцу редактора правил» было некорректно и не утверждалось. Дополнительно пользователь прямо потребовал сначала подтверждать фактическое наличие любой аналогичной функции в актуальном коде; общее правило внесено в §1.2. Статус: согласовано как требование, не реализовано и не прошло Windows QA.</w:t>
       </w:r>
     </w:p>
     <w:p>
@@ -18204,7 +18222,7 @@
     <w:p>
       <w:pPr/>
       <w:r>
-        <w:t>Не решено и требует технической проверки: точные пределы ручного значения задержки и лимита памяти; поведение при экстремальной нагрузке и весе медиа; факт доступности всех типовых и нестандартных эмодзи YouTube/стикеров и других платформ; полнота событий удаления и подключения; точные пропорции и точки адаптивного перестроения принятой двухрежимной компоновки вкладки «Мультичат», положение регуляторов и URL-кнопок; штатное сохранение признака «разрешено в OBS» на момент готовности сообщения для надёжного восстановления нескольких браузерных экземпляров. Для D41-REQ-27/28 согласованы место кнопки, образец с текстом, никнеймом, аватаром, знаком платформы и эмодзи, способ закрытия и непрерывный приём настоящего чата; более широкие наборы тестовых медиа не утверждены. D41-REQ-29: одновременное отображение нескольких тестовых образцов принято; визуальное размещение и удобство сравнения на минимальной ширине проверяются при UI-реализации. Не возвращаться к отвергнутому режиму автоматической замены образца одного сервиса другим. Для D41-REQ-30/31/32 проверить геометрию закреплённых снизу тестовых сообщений при высокой нагрузке и малой высоте; поведение несохранённого черновика при переключении вкладок и закрытии уже согласовано D41-REQ-32; при реализации проверить три действия диалога закрытия. Мгновенное локальное предпросмотр-оформление не следует путать с сохранённым стилем OBS; изменение OBS только по явной кнопке «Сохранить». Дополнение D41-REQ-33/34: проверить фактическую реализацию сохранённого browser preview редактора правил, перенос уже существующих фоновых медиа и светящегося контура в мультичат, утверждённые по D41-REQ-38 фоновые варианты (прозрачный/цвет/изображение/GIF/видео) и их техническую поддержку, два согласованных способа масштабирования общего медиа-фона по D41-REQ-39, открытые параметры точки обрезки и звуковой дорожки; повтор видеофона уже согласован D41-REQ-40, два принятых режима пустого виджета по D41-REQ-35, поведение общей рамки в окне минимального размера. Полная прозрачность пустого OBS больше не обязательна во всех случаях: пользователь выбирает режим по D41-REQ-35. D41-REQ-36 окончательно исключает таймер скрытия при отсутствии активности и любую анимацию появления или роста OBS-виджета в режиме «Скрывать, когда чат пуст». Проверить нижнюю привязку, рост вверх при длинном тексте/крупных GIF, обрезку сверху на границе источника, поведение при изменении OBS размера и сохранение старых сообщений при отсутствии новых. ЗАКРЫТО ПОВТОРНЫМ ПОДТВЕРЖДЕНИЕМ: окончание трансляции одной или обеих платформ не удаляет и не скрывает сообщения автоматически; поведение уже определено D41-REQ-20 и уточнено D41-REQ-36. Проверить этот сценарий в Windows/OBS QA без добавления нового режима очистки.</w:t>
+        <w:t>Не решено и требует технической проверки: точные пределы ручного значения задержки и лимита памяти; поведение при экстремальной нагрузке и весе медиа; факт доступности всех типовых и нестандартных эмодзи YouTube/стикеров и других платформ; полнота событий удаления и подключения; точные пропорции и точки адаптивного перестроения принятой двухрежимной компоновки вкладки «Мультичат», положение регуляторов и URL-кнопок; штатное сохранение признака «разрешено в OBS» на момент готовности сообщения для надёжного восстановления нескольких браузерных экземпляров. Для D41-REQ-27/28 согласованы место кнопки, образец с текстом, никнеймом, аватаром, знаком платформы и эмодзи, способ закрытия и непрерывный приём настоящего чата; более широкие наборы тестовых медиа не утверждены. D41-REQ-29: одновременное отображение нескольких тестовых образцов принято; визуальное размещение и удобство сравнения на минимальной ширине проверяются при UI-реализации. Не возвращаться к отвергнутому режиму автоматической замены образца одного сервиса другим. Для D41-REQ-30/31/32 проверить геометрию закреплённых снизу тестовых сообщений при высокой нагрузке и малой высоте; поведение несохранённого черновика при переключении вкладок и закрытии уже согласовано D41-REQ-32; при реализации проверить три действия диалога закрытия. Мгновенное локальное предпросмотр-оформление не следует путать с сохранённым стилем OBS; изменение OBS только по явной кнопке «Сохранить». Дополнение D41-REQ-33/34: проверить фактическую реализацию сохранённого browser preview редактора правил, перенос уже существующих фоновых медиа и светящегося контура в мультичат, утверждённые по D41-REQ-38 фоновые варианты (прозрачный/цвет/изображение/GIF/видео) и их техническую поддержку, два согласованных способа масштабирования общего медиа-фона по D41-REQ-39, открытый параметр точки обрезки; повтор видеофона уже согласован D41-REQ-40, а звук видеофона всегда отключён по D41-REQ-41, два принятых режима пустого виджета по D41-REQ-35, поведение общей рамки в окне минимального размера. Полная прозрачность пустого OBS больше не обязательна во всех случаях: пользователь выбирает режим по D41-REQ-35. D41-REQ-36 окончательно исключает таймер скрытия при отсутствии активности и любую анимацию появления или роста OBS-виджета в режиме «Скрывать, когда чат пуст». Проверить нижнюю привязку, рост вверх при длинном тексте/крупных GIF, обрезку сверху на границе источника, поведение при изменении OBS размера и сохранение старых сообщений при отсутствии новых. ЗАКРЫТО ПОВТОРНЫМ ПОДТВЕРЖДЕНИЕМ: окончание трансляции одной или обеих платформ не удаляет и не скрывает сообщения автоматически; поведение уже определено D41-REQ-20 и уточнено D41-REQ-36. Проверить этот сценарий в Windows/OBS QA без добавления нового режима очистки. D41-REQ-42: перечень доступных пользователю параметров свечения закрыт и проверен по исходникам редактора правил; отдельные ползунки толщины, силы или радиуса размытия не предлагать как уже имеющиеся. При переносе свечения проверить реальную рамку и цвета в локальном предпросмотре и OBS.</w:t>
       </w:r>
     </w:p>
     <w:p>
@@ -18216,7 +18234,7 @@
     <w:p>
       <w:pPr/>
       <w:r>
-        <w:t>Источники решений: «Программа для стриминга 70» и продолжение 23–24 октября 2026 года. Отдельные ответы «принимаю», «принимаем», «вариант 2», «так и делаем» относятся к конкретным перечисленным выше вопросам. Последнее решение о мгновенном изменении оформления всех уже отображённых сообщений принято 24 октября 2026 года. После этой записи принято дополнительное правило D41-REQ-23: запуск InOneLine посреди эфира не загружает предыдущую переписку. В тот же день пользователь потребовал регистрировать каждое принятое решение в этом документе и синхронизировать его копию на GitHub; правило закреплено в §1.7. Дополнение от 24 октября 2026 года: принято D41-REQ-24 — при обычном отключении аккаунта без замены уже отображённые сообщения остаются до обычного вытеснения; ожидавшие в буфере сообщения не выводятся. Отличать это от смены аккаунта по D41-REQ-22. 24 октября 2026 года пользователь потребовал разместить мультичат и его настройки в одной вкладке, слева ленту и справа параметры на широком окне, с обязательной адаптацией под 520 × 360 и сохранением узнаваемого общего UI; это внесено в D41-REQ-25. В следующем ответе 24 октября 2026 года пользователь окончательно утвердил минимальную компоновку: чат сверху, настройки снизу с собственной вертикальной прокруткой, а чат остаётся без ручной прокрутки. 24 октября 2026 года пользователь принял группировку настроек мультичата в раскрывающиеся блоки и потребовал скрывать настройки неподключённых сервисов; зафиксировано D41-REQ-26. 24 октября 2026 года принято D41-REQ-27: отдельное тестовое сообщение только для локального предпросмотра оформления, без добавления в настоящий чат, OBS и историю. 24 октября 2026 года принято D41-REQ-28: кнопка тестового сообщения внутри оформления соответствующей подключённой платформы, локальный образец с текстом и графическими элементами, закрытие кнопкой «Закрыть предпросмотр» и возврат к текущей живой ленте без остановки получения сообщений. 24 октября 2026 года принято D41-REQ-29: независимый одновременный показ тестовых сообщений каждой подключённой платформы; предложенная замена одного образца другим явно отклонена. При этом не создаются настоящие сообщения или OBS-события. 24 октября 2026 года пользователь предложил D41-REQ-30/31: настоящие сообщения остаются выше закреплённых снизу тестовых образцов; область чата является немедленным локальным предпросмотром изменений внешнего вида, а опубликованное оформление OBS обновляется только по нажатию «Сохранить». Ранее согласованное мгновенное применение черновых изменений оформления в OBS этим уточнением заменено. 24 октября 2026 года пользователь принял сохранение черновика при смене вкладки и диалог закрытия из D41-REQ-32, а также отдельно подчеркнул обязательное одновременное мгновенное изменение ВСЕХ тестовых и реальных сообщений в локальном предпросмотре D41-REQ-12/31; OBS по-прежнему обновляется только после «Сохранить». 24 октября 2026 года пользователь прямо предложил сопоставить локальную область редактирования/предпросмотра мультичата с редактором правил аукциона, добавить кнопку браузерной проверки, возможность выбора фона и светящийся контур с регулируемым цветом и полным отключением; записано как D41-REQ-33/34. Детали, перечисленные в §13.6.7, ещё не согласованы. Дополнение от 24 октября 2026 года: D41-REQ-35 — два пользовательских режима видимости пустого OBS-виджета («скрывать» или «показывать фон и контур постоянно»); способ мгновенного появления без таймера окончательно установлен более поздним D41-REQ-36. Дополнение от 24 октября 2026 года: пользователь отверг предложение о скрытии после тайм-аута, не принял анимацию и прямо установил последовательное мгновенное появление сообщений снизу с ростом общего виджета вверх до границы OBS браузерного источника; сообщения не исчезают по времени и должны оставаться показанными на протяжении эфира. Зафиксировано как D41-REQ-36, уточнение D41-REQ-13/17/20/35. 24 октября 2026 года пользователь повторно подтвердил ранее согласованный D41-REQ-20: завершение трансляции любой платформы не удаляет и не скрывает её уже отображённые сообщения, поскольку некоторые чаты доступны и вне эфира; автоматически очищать при окончании нельзя. Правило о достоверном начале нового эфира и остальные ограничения памяти/отображения сохраняются. Предыдущее предложение ассистента выбрать между удалением и сохранением сообщений после окончания Twitch было ошибочным повторным открытием уже решённого вопроса. 24 октября 2026 года пользователь выбрал вариант 1 для режима «Показывать постоянно»: полный размер общего фона/контура по всей области браузерного источника OBS с самого начала, даже без сообщений, и без динамического расширения области от новых сообщений. Это D41-REQ-37; предложенный вариант 2 отклонён. Скрываемый режим D41-REQ-36 не меняется. 24 октября 2026 года пользователь принял предложенный полный перечень вариантов общего фона мультичата: полностью прозрачный, однотонная заливка с выбором цвета и прозрачности, статическое изображение, GIF и видео из существующей библиотеки. Решение занесено в D41-REQ-38; параметры размещения и воспроизведения остаются для технической проверки, новые медиа-механизмы без необходимости не добавлять. 24 октября 2026 года пользователь утвердил оба режима масштабирования фоновых изображений, GIF и видео: «Вписать целиком» и «Заполнить область», с немедленным просмотром локального черновика и применением к OBS только по «Сохранить»; решение внесено как D41-REQ-39. Параметры цикличности/автовоспроизведения видео и точка обрезки не утверждены. 24 октября 2026 года пользователь принял D41-REQ-40 — циклический повтор выбранного видеофона после завершения ролика; звук видео не согласован отдельно. D41-REQ-39 сохранён как два способа масштабирования. На момент документального обновления GitHub-копия отставала от Google Drive по D41-REQ-39; после публикации требуется побайтовая проверка обеих площадок.</w:t>
+        <w:t>Источники решений: «Программа для стриминга 70» и продолжение 23–24 октября 2026 года. Отдельные ответы «принимаю», «принимаем», «вариант 2», «так и делаем» относятся к конкретным перечисленным выше вопросам. Последнее решение о мгновенном изменении оформления всех уже отображённых сообщений принято 24 октября 2026 года. После этой записи принято дополнительное правило D41-REQ-23: запуск InOneLine посреди эфира не загружает предыдущую переписку. В тот же день пользователь потребовал регистрировать каждое принятое решение в этом документе и синхронизировать его копию на GitHub; правило закреплено в §1.7. Дополнение от 24 октября 2026 года: принято D41-REQ-24 — при обычном отключении аккаунта без замены уже отображённые сообщения остаются до обычного вытеснения; ожидавшие в буфере сообщения не выводятся. Отличать это от смены аккаунта по D41-REQ-22. 24 октября 2026 года пользователь потребовал разместить мультичат и его настройки в одной вкладке, слева ленту и справа параметры на широком окне, с обязательной адаптацией под 520 × 360 и сохранением узнаваемого общего UI; это внесено в D41-REQ-25. В следующем ответе 24 октября 2026 года пользователь окончательно утвердил минимальную компоновку: чат сверху, настройки снизу с собственной вертикальной прокруткой, а чат остаётся без ручной прокрутки. 24 октября 2026 года пользователь принял группировку настроек мультичата в раскрывающиеся блоки и потребовал скрывать настройки неподключённых сервисов; зафиксировано D41-REQ-26. 24 октября 2026 года принято D41-REQ-27: отдельное тестовое сообщение только для локального предпросмотра оформления, без добавления в настоящий чат, OBS и историю. 24 октября 2026 года принято D41-REQ-28: кнопка тестового сообщения внутри оформления соответствующей подключённой платформы, локальный образец с текстом и графическими элементами, закрытие кнопкой «Закрыть предпросмотр» и возврат к текущей живой ленте без остановки получения сообщений. 24 октября 2026 года принято D41-REQ-29: независимый одновременный показ тестовых сообщений каждой подключённой платформы; предложенная замена одного образца другим явно отклонена. При этом не создаются настоящие сообщения или OBS-события. 24 октября 2026 года пользователь предложил D41-REQ-30/31: настоящие сообщения остаются выше закреплённых снизу тестовых образцов; область чата является немедленным локальным предпросмотром изменений внешнего вида, а опубликованное оформление OBS обновляется только по нажатию «Сохранить». Ранее согласованное мгновенное применение черновых изменений оформления в OBS этим уточнением заменено. 24 октября 2026 года пользователь принял сохранение черновика при смене вкладки и диалог закрытия из D41-REQ-32, а также отдельно подчеркнул обязательное одновременное мгновенное изменение ВСЕХ тестовых и реальных сообщений в локальном предпросмотре D41-REQ-12/31; OBS по-прежнему обновляется только после «Сохранить». 24 октября 2026 года пользователь прямо предложил сопоставить локальную область редактирования/предпросмотра мультичата с редактором правил аукциона, добавить кнопку браузерной проверки, возможность выбора фона и светящийся контур с регулируемым цветом и полным отключением; записано как D41-REQ-33/34. Детали, перечисленные в §13.6.7, ещё не согласованы. Дополнение от 24 октября 2026 года: D41-REQ-35 — два пользовательских режима видимости пустого OBS-виджета («скрывать» или «показывать фон и контур постоянно»); способ мгновенного появления без таймера окончательно установлен более поздним D41-REQ-36. Дополнение от 24 октября 2026 года: пользователь отверг предложение о скрытии после тайм-аута, не принял анимацию и прямо установил последовательное мгновенное появление сообщений снизу с ростом общего виджета вверх до границы OBS браузерного источника; сообщения не исчезают по времени и должны оставаться показанными на протяжении эфира. Зафиксировано как D41-REQ-36, уточнение D41-REQ-13/17/20/35. 24 октября 2026 года пользователь повторно подтвердил ранее согласованный D41-REQ-20: завершение трансляции любой платформы не удаляет и не скрывает её уже отображённые сообщения, поскольку некоторые чаты доступны и вне эфира; автоматически очищать при окончании нельзя. Правило о достоверном начале нового эфира и остальные ограничения памяти/отображения сохраняются. Предыдущее предложение ассистента выбрать между удалением и сохранением сообщений после окончания Twitch было ошибочным повторным открытием уже решённого вопроса. 24 октября 2026 года пользователь выбрал вариант 1 для режима «Показывать постоянно»: полный размер общего фона/контура по всей области браузерного источника OBS с самого начала, даже без сообщений, и без динамического расширения области от новых сообщений. Это D41-REQ-37; предложенный вариант 2 отклонён. Скрываемый режим D41-REQ-36 не меняется. 24 октября 2026 года пользователь принял предложенный полный перечень вариантов общего фона мультичата: полностью прозрачный, однотонная заливка с выбором цвета и прозрачности, статическое изображение, GIF и видео из существующей библиотеки. Решение занесено в D41-REQ-38; параметры размещения и воспроизведения остаются для технической проверки, новые медиа-механизмы без необходимости не добавлять. 24 октября 2026 года пользователь утвердил оба режима масштабирования фоновых изображений, GIF и видео: «Вписать целиком» и «Заполнить область», с немедленным просмотром локального черновика и применением к OBS только по «Сохранить»; решение внесено как D41-REQ-39. Циклический повтор видеофона утверждён отдельно D41-REQ-40; точка обрезки осталась неуточнённой. 24 октября 2026 года пользователь принял D41-REQ-40 — циклический повтор выбранного видеофона после завершения ролика; затем прямо утвердил D41-REQ-41 — видеофон всегда без звука, без управления включением звука и громкостью. D41-REQ-39 сохранён как два способа масштабирования. После записи D41-REQ-40 отставание GitHub-копии по D41-REQ-39 было устранено и побайтовое совпадение обеих площадок подтверждено. Для D41-REQ-41 повторно необходима обязательная синхронизация по §1.7. Дополнение 24 октября 2026 года: пользователь подтвердил минимальное оформление свечения D41-REQ-42 (включение/отключение + цвет, как действительно реализовано в редакторе правил) без регулировки толщины и интенсивности. В ответ на ошибочное предположение ассистента он установил обязательное правило §1.2: прежде чем ссылаться на существующую функцию программы как образец, проверять её фактический доступный состав в текущем коде; не представлять придуманные параметры как уже существующие. Источник проверки: streaming_manager/views/rules_editor.py, блок правил «Светящийся контур» и «Цвет контура».</w:t>
       </w:r>
     </w:p>
     <w:p>

</xml_diff>

<commit_message>
docs: approve D41-REQ-43 centered cover cropping for multichat backgrounds
</commit_message>
<xml_diff>
--- a/docs/Правила_и_дальнейший_распорядок_работ.docx
+++ b/docs/Правила_и_дальнейший_распорядок_работ.docx
@@ -18189,7 +18189,7 @@
     <w:p>
       <w:pPr/>
       <w:r>
-        <w:t>D41-REQ-39. ДВА СПОСОБА МАСШТАБИРОВАНИЯ ОБЩЕГО МЕДИА-ФОНА МУЛЬТИЧАТА (прямое принятие пользователем 24 октября 2026 года; согласовано как требование, код D41 не реализован). Для фоновых статических изображений, анимированных GIF и видео из D41-REQ-38 пользователь может переключать способ размещения внутри ФАКТИЧЕСКОЙ оформленной области мультичата: (1) «Вписать целиком» — показывать весь исходный кадр, сохранять его пропорции, при несовпадении пропорций допускать незаполненные полосы по краям; (2) «Заполнить область» — полностью покрывать исходным кадром оформленную область с сохранением пропорций, допуская обрезку части кадра по краям. Оба варианта являются вариантами размещения ОДНОГО ОБЩЕГО фона, а не независимыми параметрами Twitch/YouTube. Изменение режима немедленно видно в локальном предпросмотре; в браузерном виджете и OBS применяется только после нажатия «Сохранить» по D41-REQ-31/33. При динамическом росте виджета в скрываемом режиме фон подстраивается под актуальный размер области (D41-REQ-36); при постоянном показе — под полную область источника (D41-REQ-37). Масштабирование не вводит задержек, таймеров и анимации оболочки или сообщений; собственная анимация GIF/видео не затрагивается. Положение точки обрезки, отдельные способы размещения (растянуть с искажением, плитка и др.), циклическое воспроизведение видео утверждено отдельным более поздним D41-REQ-40; точка обрезки и прочие параметры данным решением НЕ утверждены. Связи: D41-REQ-31/33/35/36/37/38; общая библиотека фонов. Статус: согласовано к реализации; код, Windows QA и ручная приёмка отсутствуют.</w:t>
+        <w:t>D41-REQ-39. ДВА СПОСОБА МАСШТАБИРОВАНИЯ ОБЩЕГО МЕДИА-ФОНА МУЛЬТИЧАТА (прямое принятие пользователем 24 октября 2026 года; согласовано как требование, код D41 не реализован). Для фоновых статических изображений, анимированных GIF и видео из D41-REQ-38 пользователь может переключать способ размещения внутри ФАКТИЧЕСКОЙ оформленной области мультичата: (1) «Вписать целиком» — показывать весь исходный кадр, сохранять его пропорции, при несовпадении пропорций допускать незаполненные полосы по краям; (2) «Заполнить область» — полностью покрывать исходным кадром оформленную область с сохранением пропорций, допуская обрезку части кадра по краям. Оба варианта являются вариантами размещения ОДНОГО ОБЩЕГО фона, а не независимыми параметрами Twitch/YouTube. Изменение режима немедленно видно в локальном предпросмотре; в браузерном виджете и OBS применяется только после нажатия «Сохранить» по D41-REQ-31/33. При динамическом росте виджета в скрываемом режиме фон подстраивается под актуальный размер области (D41-REQ-36); при постоянном показе — под полную область источника (D41-REQ-37). Масштабирование не вводит задержек, таймеров и анимации оболочки или сообщений; собственная анимация GIF/видео не затрагивается. Положение обрезки в режиме «Заполнить область» определено отдельным более поздним D41-REQ-43: центрирование кадра без пользовательского сдвига. Циклическое воспроизведение видео утверждено D41-REQ-40. Растяжение с искажением, плиточная заливка и иные способы размещения не утверждены. Связи: D41-REQ-31/33/35/36/37/38; общая библиотека фонов. Статус: согласовано к реализации; код, Windows QA и ручная приёмка отсутствуют.</w:t>
       </w:r>
     </w:p>
     <w:p>
@@ -18211,6 +18211,12 @@
       </w:r>
     </w:p>
     <w:p>
+      <w:pPr/>
+      <w:r>
+        <w:t>D41-REQ-43. АВТОМАТИЧЕСКОЕ ЦЕНТРИРОВАНИЕ ОБЩЕГО МЕДИАФОНА МУЛЬТИЧАТА (прямой выбор пользователя 24 октября 2026 года после пояснения на примере; требование согласовано, код не реализован). Для общих фоновых изображений, GIF и видео в режиме «Заполнить область» по D41-REQ-39 размещать кадр АВТОМАТИЧЕСКИ ПО ЦЕНТРУ фактической оформленной области мультичата. Сохранять пропорции исходного кадра и заполнять область полностью; при несовпадении соотношения сторон обрезать выходящие за границы части симметрично по соответствующей оси (слева и справа либо сверху и снизу). При изменении размера браузерного источника OBS или при росте динамической оформленной области по D41-REQ-36 сохранять центральное выравнивание и пересчитывать границы обрезки под актуальную область. НЕ добавлять пользователю настройки горизонтального/вертикального сдвига, точки привязки либо отдельный выбор «Слева / По центру / Справа». В режиме «Вписать целиком» исходный кадр по-прежнему виден полностью, без обрезки; это решение не меняет другие ранее согласованные варианты фонового оформления, работу GIF/видеофона и правила локального предпросмотра/сохранения. Связи: D41-REQ-31/33/35/36/37/38/39/40/41. Статус: согласовано к реализации; Windows QA, ручного PASS и реализации пока нет.</w:t>
+      </w:r>
+    </w:p>
+    <w:p>
       <w:pPr>
         <w:pStyle w:val="Heading3"/>
         <w:keepNext/>
@@ -18222,7 +18228,7 @@
     <w:p>
       <w:pPr/>
       <w:r>
-        <w:t>Не решено и требует технической проверки: точные пределы ручного значения задержки и лимита памяти; поведение при экстремальной нагрузке и весе медиа; факт доступности всех типовых и нестандартных эмодзи YouTube/стикеров и других платформ; полнота событий удаления и подключения; точные пропорции и точки адаптивного перестроения принятой двухрежимной компоновки вкладки «Мультичат», положение регуляторов и URL-кнопок; штатное сохранение признака «разрешено в OBS» на момент готовности сообщения для надёжного восстановления нескольких браузерных экземпляров. Для D41-REQ-27/28 согласованы место кнопки, образец с текстом, никнеймом, аватаром, знаком платформы и эмодзи, способ закрытия и непрерывный приём настоящего чата; более широкие наборы тестовых медиа не утверждены. D41-REQ-29: одновременное отображение нескольких тестовых образцов принято; визуальное размещение и удобство сравнения на минимальной ширине проверяются при UI-реализации. Не возвращаться к отвергнутому режиму автоматической замены образца одного сервиса другим. Для D41-REQ-30/31/32 проверить геометрию закреплённых снизу тестовых сообщений при высокой нагрузке и малой высоте; поведение несохранённого черновика при переключении вкладок и закрытии уже согласовано D41-REQ-32; при реализации проверить три действия диалога закрытия. Мгновенное локальное предпросмотр-оформление не следует путать с сохранённым стилем OBS; изменение OBS только по явной кнопке «Сохранить». Дополнение D41-REQ-33/34: проверить фактическую реализацию сохранённого browser preview редактора правил, перенос уже существующих фоновых медиа и светящегося контура в мультичат, утверждённые по D41-REQ-38 фоновые варианты (прозрачный/цвет/изображение/GIF/видео) и их техническую поддержку, два согласованных способа масштабирования общего медиа-фона по D41-REQ-39, открытый параметр точки обрезки; повтор видеофона уже согласован D41-REQ-40, а звук видеофона всегда отключён по D41-REQ-41, два принятых режима пустого виджета по D41-REQ-35, поведение общей рамки в окне минимального размера. Полная прозрачность пустого OBS больше не обязательна во всех случаях: пользователь выбирает режим по D41-REQ-35. D41-REQ-36 окончательно исключает таймер скрытия при отсутствии активности и любую анимацию появления или роста OBS-виджета в режиме «Скрывать, когда чат пуст». Проверить нижнюю привязку, рост вверх при длинном тексте/крупных GIF, обрезку сверху на границе источника, поведение при изменении OBS размера и сохранение старых сообщений при отсутствии новых. ЗАКРЫТО ПОВТОРНЫМ ПОДТВЕРЖДЕНИЕМ: окончание трансляции одной или обеих платформ не удаляет и не скрывает сообщения автоматически; поведение уже определено D41-REQ-20 и уточнено D41-REQ-36. Проверить этот сценарий в Windows/OBS QA без добавления нового режима очистки. D41-REQ-42: перечень доступных пользователю параметров свечения закрыт и проверен по исходникам редактора правил; отдельные ползунки толщины, силы или радиуса размытия не предлагать как уже имеющиеся. При переносе свечения проверить реальную рамку и цвета в локальном предпросмотре и OBS.</w:t>
+        <w:t>Не решено и требует технической проверки: точные пределы ручного значения задержки и лимита памяти; поведение при экстремальной нагрузке и весе медиа; факт доступности всех типовых и нестандартных эмодзи YouTube/стикеров и других платформ; полнота событий удаления и подключения; точные пропорции и точки адаптивного перестроения принятой двухрежимной компоновки вкладки «Мультичат», положение регуляторов и URL-кнопок; штатное сохранение признака «разрешено в OBS» на момент готовности сообщения для надёжного восстановления нескольких браузерных экземпляров. Для D41-REQ-27/28 согласованы место кнопки, образец с текстом, никнеймом, аватаром, знаком платформы и эмодзи, способ закрытия и непрерывный приём настоящего чата; более широкие наборы тестовых медиа не утверждены. D41-REQ-29: одновременное отображение нескольких тестовых образцов принято; визуальное размещение и удобство сравнения на минимальной ширине проверяются при UI-реализации. Не возвращаться к отвергнутому режиму автоматической замены образца одного сервиса другим. Для D41-REQ-30/31/32 проверить геометрию закреплённых снизу тестовых сообщений при высокой нагрузке и малой высоте; поведение несохранённого черновика при переключении вкладок и закрытии уже согласовано D41-REQ-32; при реализации проверить три действия диалога закрытия. Мгновенное локальное предпросмотр-оформление не следует путать с сохранённым стилем OBS; изменение OBS только по явной кнопке «Сохранить». Дополнение D41-REQ-33/34: проверить фактическую реализацию сохранённого browser preview редактора правил, перенос уже существующих фоновых медиа и светящегося контура в мультичат, утверждённые по D41-REQ-38 фоновые варианты (прозрачный/цвет/изображение/GIF/видео) и их техническую поддержку, два согласованных способа масштабирования общего медиа-фона по D41-REQ-39 и строго центральную обрезку без настройки положения по D41-REQ-43; повтор видеофона уже согласован D41-REQ-40, а звук видеофона всегда отключён по D41-REQ-41, два принятых режима пустого виджета по D41-REQ-35, поведение общей рамки в окне минимального размера. Полная прозрачность пустого OBS больше не обязательна во всех случаях: пользователь выбирает режим по D41-REQ-35. D41-REQ-36 окончательно исключает таймер скрытия при отсутствии активности и любую анимацию появления или роста OBS-виджета в режиме «Скрывать, когда чат пуст». Проверить нижнюю привязку, рост вверх при длинном тексте/крупных GIF, обрезку сверху на границе источника, поведение при изменении OBS размера и сохранение старых сообщений при отсутствии новых. ЗАКРЫТО ПОВТОРНЫМ ПОДТВЕРЖДЕНИЕМ: окончание трансляции одной или обеих платформ не удаляет и не скрывает сообщения автоматически; поведение уже определено D41-REQ-20 и уточнено D41-REQ-36. Проверить этот сценарий в Windows/OBS QA без добавления нового режима очистки. D41-REQ-42: перечень доступных пользователю параметров свечения закрыт и проверен по исходникам редактора правил; отдельные ползунки толщины, силы или радиуса размытия не предлагать как уже имеющиеся. При переносе свечения проверить реальную рамку и цвета в локальном предпросмотре и OBS.</w:t>
       </w:r>
     </w:p>
     <w:p>
@@ -18234,7 +18240,7 @@
     <w:p>
       <w:pPr/>
       <w:r>
-        <w:t>Источники решений: «Программа для стриминга 70» и продолжение 23–24 октября 2026 года. Отдельные ответы «принимаю», «принимаем», «вариант 2», «так и делаем» относятся к конкретным перечисленным выше вопросам. Последнее решение о мгновенном изменении оформления всех уже отображённых сообщений принято 24 октября 2026 года. После этой записи принято дополнительное правило D41-REQ-23: запуск InOneLine посреди эфира не загружает предыдущую переписку. В тот же день пользователь потребовал регистрировать каждое принятое решение в этом документе и синхронизировать его копию на GitHub; правило закреплено в §1.7. Дополнение от 24 октября 2026 года: принято D41-REQ-24 — при обычном отключении аккаунта без замены уже отображённые сообщения остаются до обычного вытеснения; ожидавшие в буфере сообщения не выводятся. Отличать это от смены аккаунта по D41-REQ-22. 24 октября 2026 года пользователь потребовал разместить мультичат и его настройки в одной вкладке, слева ленту и справа параметры на широком окне, с обязательной адаптацией под 520 × 360 и сохранением узнаваемого общего UI; это внесено в D41-REQ-25. В следующем ответе 24 октября 2026 года пользователь окончательно утвердил минимальную компоновку: чат сверху, настройки снизу с собственной вертикальной прокруткой, а чат остаётся без ручной прокрутки. 24 октября 2026 года пользователь принял группировку настроек мультичата в раскрывающиеся блоки и потребовал скрывать настройки неподключённых сервисов; зафиксировано D41-REQ-26. 24 октября 2026 года принято D41-REQ-27: отдельное тестовое сообщение только для локального предпросмотра оформления, без добавления в настоящий чат, OBS и историю. 24 октября 2026 года принято D41-REQ-28: кнопка тестового сообщения внутри оформления соответствующей подключённой платформы, локальный образец с текстом и графическими элементами, закрытие кнопкой «Закрыть предпросмотр» и возврат к текущей живой ленте без остановки получения сообщений. 24 октября 2026 года принято D41-REQ-29: независимый одновременный показ тестовых сообщений каждой подключённой платформы; предложенная замена одного образца другим явно отклонена. При этом не создаются настоящие сообщения или OBS-события. 24 октября 2026 года пользователь предложил D41-REQ-30/31: настоящие сообщения остаются выше закреплённых снизу тестовых образцов; область чата является немедленным локальным предпросмотром изменений внешнего вида, а опубликованное оформление OBS обновляется только по нажатию «Сохранить». Ранее согласованное мгновенное применение черновых изменений оформления в OBS этим уточнением заменено. 24 октября 2026 года пользователь принял сохранение черновика при смене вкладки и диалог закрытия из D41-REQ-32, а также отдельно подчеркнул обязательное одновременное мгновенное изменение ВСЕХ тестовых и реальных сообщений в локальном предпросмотре D41-REQ-12/31; OBS по-прежнему обновляется только после «Сохранить». 24 октября 2026 года пользователь прямо предложил сопоставить локальную область редактирования/предпросмотра мультичата с редактором правил аукциона, добавить кнопку браузерной проверки, возможность выбора фона и светящийся контур с регулируемым цветом и полным отключением; записано как D41-REQ-33/34. Детали, перечисленные в §13.6.7, ещё не согласованы. Дополнение от 24 октября 2026 года: D41-REQ-35 — два пользовательских режима видимости пустого OBS-виджета («скрывать» или «показывать фон и контур постоянно»); способ мгновенного появления без таймера окончательно установлен более поздним D41-REQ-36. Дополнение от 24 октября 2026 года: пользователь отверг предложение о скрытии после тайм-аута, не принял анимацию и прямо установил последовательное мгновенное появление сообщений снизу с ростом общего виджета вверх до границы OBS браузерного источника; сообщения не исчезают по времени и должны оставаться показанными на протяжении эфира. Зафиксировано как D41-REQ-36, уточнение D41-REQ-13/17/20/35. 24 октября 2026 года пользователь повторно подтвердил ранее согласованный D41-REQ-20: завершение трансляции любой платформы не удаляет и не скрывает её уже отображённые сообщения, поскольку некоторые чаты доступны и вне эфира; автоматически очищать при окончании нельзя. Правило о достоверном начале нового эфира и остальные ограничения памяти/отображения сохраняются. Предыдущее предложение ассистента выбрать между удалением и сохранением сообщений после окончания Twitch было ошибочным повторным открытием уже решённого вопроса. 24 октября 2026 года пользователь выбрал вариант 1 для режима «Показывать постоянно»: полный размер общего фона/контура по всей области браузерного источника OBS с самого начала, даже без сообщений, и без динамического расширения области от новых сообщений. Это D41-REQ-37; предложенный вариант 2 отклонён. Скрываемый режим D41-REQ-36 не меняется. 24 октября 2026 года пользователь принял предложенный полный перечень вариантов общего фона мультичата: полностью прозрачный, однотонная заливка с выбором цвета и прозрачности, статическое изображение, GIF и видео из существующей библиотеки. Решение занесено в D41-REQ-38; параметры размещения и воспроизведения остаются для технической проверки, новые медиа-механизмы без необходимости не добавлять. 24 октября 2026 года пользователь утвердил оба режима масштабирования фоновых изображений, GIF и видео: «Вписать целиком» и «Заполнить область», с немедленным просмотром локального черновика и применением к OBS только по «Сохранить»; решение внесено как D41-REQ-39. Циклический повтор видеофона утверждён отдельно D41-REQ-40; точка обрезки осталась неуточнённой. 24 октября 2026 года пользователь принял D41-REQ-40 — циклический повтор выбранного видеофона после завершения ролика; затем прямо утвердил D41-REQ-41 — видеофон всегда без звука, без управления включением звука и громкостью. D41-REQ-39 сохранён как два способа масштабирования. После записи D41-REQ-40 отставание GitHub-копии по D41-REQ-39 было устранено и побайтовое совпадение обеих площадок подтверждено. Для D41-REQ-41 повторно необходима обязательная синхронизация по §1.7. Дополнение 24 октября 2026 года: пользователь подтвердил минимальное оформление свечения D41-REQ-42 (включение/отключение + цвет, как действительно реализовано в редакторе правил) без регулировки толщины и интенсивности. В ответ на ошибочное предположение ассистента он установил обязательное правило §1.2: прежде чем ссылаться на существующую функцию программы как образец, проверять её фактический доступный состав в текущем коде; не представлять придуманные параметры как уже существующие. Источник проверки: streaming_manager/views/rules_editor.py, блок правил «Светящийся контур» и «Цвет контура».</w:t>
+        <w:t>Источники решений: «Программа для стриминга 70» и продолжение 23–24 октября 2026 года. Отдельные ответы «принимаю», «принимаем», «вариант 2», «так и делаем» относятся к конкретным перечисленным выше вопросам. Последнее решение о мгновенном изменении оформления всех уже отображённых сообщений принято 24 октября 2026 года. После этой записи принято дополнительное правило D41-REQ-23: запуск InOneLine посреди эфира не загружает предыдущую переписку. В тот же день пользователь потребовал регистрировать каждое принятое решение в этом документе и синхронизировать его копию на GitHub; правило закреплено в §1.7. Дополнение от 24 октября 2026 года: принято D41-REQ-24 — при обычном отключении аккаунта без замены уже отображённые сообщения остаются до обычного вытеснения; ожидавшие в буфере сообщения не выводятся. Отличать это от смены аккаунта по D41-REQ-22. 24 октября 2026 года пользователь потребовал разместить мультичат и его настройки в одной вкладке, слева ленту и справа параметры на широком окне, с обязательной адаптацией под 520 × 360 и сохранением узнаваемого общего UI; это внесено в D41-REQ-25. В следующем ответе 24 октября 2026 года пользователь окончательно утвердил минимальную компоновку: чат сверху, настройки снизу с собственной вертикальной прокруткой, а чат остаётся без ручной прокрутки. 24 октября 2026 года пользователь принял группировку настроек мультичата в раскрывающиеся блоки и потребовал скрывать настройки неподключённых сервисов; зафиксировано D41-REQ-26. 24 октября 2026 года принято D41-REQ-27: отдельное тестовое сообщение только для локального предпросмотра оформления, без добавления в настоящий чат, OBS и историю. 24 октября 2026 года принято D41-REQ-28: кнопка тестового сообщения внутри оформления соответствующей подключённой платформы, локальный образец с текстом и графическими элементами, закрытие кнопкой «Закрыть предпросмотр» и возврат к текущей живой ленте без остановки получения сообщений. 24 октября 2026 года принято D41-REQ-29: независимый одновременный показ тестовых сообщений каждой подключённой платформы; предложенная замена одного образца другим явно отклонена. При этом не создаются настоящие сообщения или OBS-события. 24 октября 2026 года пользователь предложил D41-REQ-30/31: настоящие сообщения остаются выше закреплённых снизу тестовых образцов; область чата является немедленным локальным предпросмотром изменений внешнего вида, а опубликованное оформление OBS обновляется только по нажатию «Сохранить». Ранее согласованное мгновенное применение черновых изменений оформления в OBS этим уточнением заменено. 24 октября 2026 года пользователь принял сохранение черновика при смене вкладки и диалог закрытия из D41-REQ-32, а также отдельно подчеркнул обязательное одновременное мгновенное изменение ВСЕХ тестовых и реальных сообщений в локальном предпросмотре D41-REQ-12/31; OBS по-прежнему обновляется только после «Сохранить». 24 октября 2026 года пользователь прямо предложил сопоставить локальную область редактирования/предпросмотра мультичата с редактором правил аукциона, добавить кнопку браузерной проверки, возможность выбора фона и светящийся контур с регулируемым цветом и полным отключением; записано как D41-REQ-33/34. Детали, перечисленные в §13.6.7, ещё не согласованы. Дополнение от 24 октября 2026 года: D41-REQ-35 — два пользовательских режима видимости пустого OBS-виджета («скрывать» или «показывать фон и контур постоянно»); способ мгновенного появления без таймера окончательно установлен более поздним D41-REQ-36. Дополнение от 24 октября 2026 года: пользователь отверг предложение о скрытии после тайм-аута, не принял анимацию и прямо установил последовательное мгновенное появление сообщений снизу с ростом общего виджета вверх до границы OBS браузерного источника; сообщения не исчезают по времени и должны оставаться показанными на протяжении эфира. Зафиксировано как D41-REQ-36, уточнение D41-REQ-13/17/20/35. 24 октября 2026 года пользователь повторно подтвердил ранее согласованный D41-REQ-20: завершение трансляции любой платформы не удаляет и не скрывает её уже отображённые сообщения, поскольку некоторые чаты доступны и вне эфира; автоматически очищать при окончании нельзя. Правило о достоверном начале нового эфира и остальные ограничения памяти/отображения сохраняются. Предыдущее предложение ассистента выбрать между удалением и сохранением сообщений после окончания Twitch было ошибочным повторным открытием уже решённого вопроса. 24 октября 2026 года пользователь выбрал вариант 1 для режима «Показывать постоянно»: полный размер общего фона/контура по всей области браузерного источника OBS с самого начала, даже без сообщений, и без динамического расширения области от новых сообщений. Это D41-REQ-37; предложенный вариант 2 отклонён. Скрываемый режим D41-REQ-36 не меняется. 24 октября 2026 года пользователь принял предложенный полный перечень вариантов общего фона мультичата: полностью прозрачный, однотонная заливка с выбором цвета и прозрачности, статическое изображение, GIF и видео из существующей библиотеки. Решение занесено в D41-REQ-38; параметры размещения и воспроизведения остаются для технической проверки, новые медиа-механизмы без необходимости не добавлять. 24 октября 2026 года пользователь утвердил оба режима масштабирования фоновых изображений, GIF и видео: «Вписать целиком» и «Заполнить область», с немедленным просмотром локального черновика и применением к OBS только по «Сохранить»; решение внесено как D41-REQ-39. Циклический повтор видеофона утверждён отдельно D41-REQ-40; центральное положение точки обрезки позднее принято в D41-REQ-43. 24 октября 2026 года пользователь принял D41-REQ-40 — циклический повтор выбранного видеофона после завершения ролика; затем прямо утвердил D41-REQ-41 — видеофон всегда без звука, без управления включением звука и громкостью. D41-REQ-39 сохранён как два способа масштабирования. После записи D41-REQ-40 отставание GitHub-копии по D41-REQ-39 было устранено и побайтовое совпадение обеих площадок подтверждено. Для D41-REQ-41 повторно необходима обязательная синхронизация по §1.7. Дополнение 24 октября 2026 года: пользователь подтвердил минимальное оформление свечения D41-REQ-42 (включение/отключение + цвет, как действительно реализовано в редакторе правил) без регулировки толщины и интенсивности. В ответ на ошибочное предположение ассистента он установил обязательное правило §1.2: прежде чем ссылаться на существующую функцию программы как образец, проверять её фактический доступный состав в текущем коде; не представлять придуманные параметры как уже существующие. Источник проверки: streaming_manager/views/rules_editor.py, блок правил «Светящийся контур» и «Цвет контура». 24 октября 2026 года пользователь после пояснения на примере узкого браузерного источника OBS прямо выбрал автоматическое центрирование общего медиафона при режиме «Заполнить область»: обрезка лишних краёв симметрично относительно центра, никакого ручного сдвига и выбора положения в настройках. Решение внесено в D41-REQ-43; «Вписать целиком» не изменяется.</w:t>
       </w:r>
     </w:p>
     <w:p>

</xml_diff>

<commit_message>
docs: D41-REQ-44 restrict multichat background opacity to solid color
</commit_message>
<xml_diff>
--- a/docs/Правила_и_дальнейший_распорядок_работ.docx
+++ b/docs/Правила_и_дальнейший_распорядок_работ.docx
@@ -18183,7 +18183,7 @@
     <w:p>
       <w:pPr/>
       <w:r>
-        <w:t>D41-REQ-38. ДОПУСТИМЫЕ ВАРИАНТЫ ОБЩЕГО ФОНА МУЛЬТИЧАТА (прямое принятие пользователем 24 октября 2026 года; требование согласовано, код не реализован). Для общего фона области чата во вкладке программы и отдельного браузерного OBS-виджета пользователь выбирает один из согласованных вариантов: (1) полностью прозрачный фон; (2) однотонная заливка с выбором цвета и степени прозрачности; (3) статическое изображение; (4) анимированное изображение GIF; (5) видео. Для изображений, GIF и видео использовать существующую библиотеку фонов/общую медиа-инфраструктуру InOneLine по образцу редактора правил аукциона; не создавать второй параллельный импортёр, каталог или механизм хранения при наличии пригодной существующей реализации. Общий фон отличается от независимо настраиваемого фона карточек сообщений Twitch/YouTube (D41-REQ-11/34). Черновая смена общего фона немедленно видна в локальной области чата вместе с реальными и включёнными тестовыми сообщениями; браузер и OBS получают только сохранённый выбор после «Сохранить» (D41-REQ-31/33). Два режима видимости пустого виджета (D41-REQ-35), мгновенный рост скрываемой оболочки (D41-REQ-36) и полный фиксированный размер постоянно видимой области (D41-REQ-37) сохраняются. Фоновое GIF/видео вправе воспроизводить свою собственную анимацию: запрет анимации относится к появлению сообщений и оболочки чата, а не к содержимому выбранного медиа. Масштабирование изображений/GIF/видео теперь согласовано отдельно в D41-REQ-39; циклическое воспроизведение видео утверждено отдельно в D41-REQ-40; звук видеофона прямо согласован позднее в D41-REQ-41 (всегда без звука); поддержанные контейнеры/кодеки и диапазоны численных настроек остаются для технической проверки. Связи: D41-REQ-11/31/32/33/34/35/36/37/39 и GLOBAL-UI-001, общая библиотека фонов.</w:t>
+        <w:t>D41-REQ-38. ДОПУСТИМЫЕ ВАРИАНТЫ ОБЩЕГО ФОНА МУЛЬТИЧАТА (прямое принятие пользователем 24 октября 2026 года; требование согласовано, код не реализован). Для общего фона области чата во вкладке программы и отдельного браузерного OBS-виджета пользователь выбирает один из согласованных вариантов: (1) полностью прозрачный фон; (2) однотонная заливка с выбором цвета и степени прозрачности; (3) статическое изображение; (4) анимированное изображение GIF; (5) видео. Для изображений, GIF и видео использовать существующую библиотеку фонов/общую медиа-инфраструктуру InOneLine по образцу редактора правил аукциона; не создавать второй параллельный импортёр, каталог или механизм хранения при наличии пригодной существующей реализации. Общий фон отличается от независимо настраиваемого фона карточек сообщений Twitch/YouTube (D41-REQ-11/34). Черновая смена общего фона немедленно видна в локальной области чата вместе с реальными и включёнными тестовыми сообщениями; браузер и OBS получают только сохранённый выбор после «Сохранить» (D41-REQ-31/33). Два режима видимости пустого виджета (D41-REQ-35), мгновенный рост скрываемой оболочки (D41-REQ-36) и полный фиксированный размер постоянно видимой области (D41-REQ-37) сохраняются. Фоновое GIF/видео вправе воспроизводить свою собственную анимацию: запрет анимации относится к появлению сообщений и оболочки чата, а не к содержимому выбранного медиа. Масштабирование изображений/GIF/видео теперь согласовано отдельно в D41-REQ-39; циклическое воспроизведение видео утверждено отдельно в D41-REQ-40; звук видеофона прямо согласован позднее в D41-REQ-41 (всегда без звука); поддержанные контейнеры/кодеки и диапазоны численных настроек остаются для технической проверки. Область действия регулятора непрозрачности отдельно подтверждена D41-REQ-44: только однотонная заливка, не медиафон. Связи: D41-REQ-11/31/32/33/34/35/36/37/39 и GLOBAL-UI-001, общая библиотека фонов.</w:t>
       </w:r>
     </w:p>
     <w:p>
@@ -18217,6 +18217,12 @@
       </w:r>
     </w:p>
     <w:p>
+      <w:pPr/>
+      <w:r>
+        <w:t>D41-REQ-44. НЕПРОЗРАЧНОСТЬ ТОЛЬКО ОДНОТОННОГО ФОНА МУЛЬТИЧАТА (прямое подтверждение пользователя 24 октября 2026 года после сверки существующего редактора правил; требование согласовано, код D41 не реализован). В общем оформлении мультичата регулятор «Непрозрачность» (0–100 %) доступен пользователю ТОЛЬКО при выборе ОДНОТОННОЙ ЗАЛИВКИ по D41-REQ-38; при выборе «Прозрачный фон» или собственного медиафона (статическое изображение, GIF, видео) регулятор неприменим и скрывается либо отключается по GLOBAL-UI-001 с сохранением ранее выбранного значения для цветного режима. Фоновые изображения, GIF и видео отображаются БЕЗ дополнительной пользовательской регулировки непрозрачности, сохраняя собственный альфа-канал/прозрачность файла, когда он поддержан. Не вводить отдельный медиа-opacity, ползунок смешивания с цветом или второй механизм полупрозрачного наложения. Прямое основание в уже реализованном редакторе правил: streaming_manager/views/rules_editor.py, _obs_background_changed: controls opacity доступны только при color_mode; в streaming_manager/web/rules_overlay.html параметр background_opacity применяется только к цветной заливке, а image/video не получают отдельной opacity. Черновое отображение локально сразу, OBS — только после «Сохранить» (D41-REQ-31/33). Связи: D41-REQ-31/33/38/39/40/41/43, GLOBAL-UI-001. Статус: согласовано к реализации; ручной QA и реализация D41 отсутствуют.</w:t>
+      </w:r>
+    </w:p>
+    <w:p>
       <w:pPr>
         <w:pStyle w:val="Heading3"/>
         <w:keepNext/>
@@ -18228,7 +18234,7 @@
     <w:p>
       <w:pPr/>
       <w:r>
-        <w:t>Не решено и требует технической проверки: точные пределы ручного значения задержки и лимита памяти; поведение при экстремальной нагрузке и весе медиа; факт доступности всех типовых и нестандартных эмодзи YouTube/стикеров и других платформ; полнота событий удаления и подключения; точные пропорции и точки адаптивного перестроения принятой двухрежимной компоновки вкладки «Мультичат», положение регуляторов и URL-кнопок; штатное сохранение признака «разрешено в OBS» на момент готовности сообщения для надёжного восстановления нескольких браузерных экземпляров. Для D41-REQ-27/28 согласованы место кнопки, образец с текстом, никнеймом, аватаром, знаком платформы и эмодзи, способ закрытия и непрерывный приём настоящего чата; более широкие наборы тестовых медиа не утверждены. D41-REQ-29: одновременное отображение нескольких тестовых образцов принято; визуальное размещение и удобство сравнения на минимальной ширине проверяются при UI-реализации. Не возвращаться к отвергнутому режиму автоматической замены образца одного сервиса другим. Для D41-REQ-30/31/32 проверить геометрию закреплённых снизу тестовых сообщений при высокой нагрузке и малой высоте; поведение несохранённого черновика при переключении вкладок и закрытии уже согласовано D41-REQ-32; при реализации проверить три действия диалога закрытия. Мгновенное локальное предпросмотр-оформление не следует путать с сохранённым стилем OBS; изменение OBS только по явной кнопке «Сохранить». Дополнение D41-REQ-33/34: проверить фактическую реализацию сохранённого browser preview редактора правил, перенос уже существующих фоновых медиа и светящегося контура в мультичат, утверждённые по D41-REQ-38 фоновые варианты (прозрачный/цвет/изображение/GIF/видео) и их техническую поддержку, два согласованных способа масштабирования общего медиа-фона по D41-REQ-39 и строго центральную обрезку без настройки положения по D41-REQ-43; повтор видеофона уже согласован D41-REQ-40, а звук видеофона всегда отключён по D41-REQ-41, два принятых режима пустого виджета по D41-REQ-35, поведение общей рамки в окне минимального размера. Полная прозрачность пустого OBS больше не обязательна во всех случаях: пользователь выбирает режим по D41-REQ-35. D41-REQ-36 окончательно исключает таймер скрытия при отсутствии активности и любую анимацию появления или роста OBS-виджета в режиме «Скрывать, когда чат пуст». Проверить нижнюю привязку, рост вверх при длинном тексте/крупных GIF, обрезку сверху на границе источника, поведение при изменении OBS размера и сохранение старых сообщений при отсутствии новых. ЗАКРЫТО ПОВТОРНЫМ ПОДТВЕРЖДЕНИЕМ: окончание трансляции одной или обеих платформ не удаляет и не скрывает сообщения автоматически; поведение уже определено D41-REQ-20 и уточнено D41-REQ-36. Проверить этот сценарий в Windows/OBS QA без добавления нового режима очистки. D41-REQ-42: перечень доступных пользователю параметров свечения закрыт и проверен по исходникам редактора правил; отдельные ползунки толщины, силы или радиуса размытия не предлагать как уже имеющиеся. При переносе свечения проверить реальную рамку и цвета в локальном предпросмотре и OBS.</w:t>
+        <w:t>Не решено и требует технической проверки: точные пределы ручного значения задержки и лимита памяти; поведение при экстремальной нагрузке и весе медиа; факт доступности всех типовых и нестандартных эмодзи YouTube/стикеров и других платформ; полнота событий удаления и подключения; точные пропорции и точки адаптивного перестроения принятой двухрежимной компоновки вкладки «Мультичат», положение регуляторов и URL-кнопок; штатное сохранение признака «разрешено в OBS» на момент готовности сообщения для надёжного восстановления нескольких браузерных экземпляров. Для D41-REQ-27/28 согласованы место кнопки, образец с текстом, никнеймом, аватаром, знаком платформы и эмодзи, способ закрытия и непрерывный приём настоящего чата; более широкие наборы тестовых медиа не утверждены. D41-REQ-29: одновременное отображение нескольких тестовых образцов принято; визуальное размещение и удобство сравнения на минимальной ширине проверяются при UI-реализации. Не возвращаться к отвергнутому режиму автоматической замены образца одного сервиса другим. Для D41-REQ-30/31/32 проверить геометрию закреплённых снизу тестовых сообщений при высокой нагрузке и малой высоте; поведение несохранённого черновика при переключении вкладок и закрытии уже согласовано D41-REQ-32; при реализации проверить три действия диалога закрытия. Мгновенное локальное предпросмотр-оформление не следует путать с сохранённым стилем OBS; изменение OBS только по явной кнопке «Сохранить». Дополнение D41-REQ-33/34: проверить фактическую реализацию сохранённого browser preview редактора правил, перенос уже существующих фоновых медиа и светящегося контура в мультичат, утверждённые по D41-REQ-38 фоновые варианты (прозрачный/цвет/изображение/GIF/видео) и их техническую поддержку, два согласованных способа масштабирования общего медиа-фона по D41-REQ-39 и строго центральную обрезку без настройки положения по D41-REQ-43; регулировка непрозрачности только цветного фона и отсутствие такой регулировки для изображения/GIF/видео окончательно согласованы D41-REQ-44; повтор видеофона уже согласован D41-REQ-40, а звук видеофона всегда отключён по D41-REQ-41, два принятых режима пустого виджета по D41-REQ-35, поведение общей рамки в окне минимального размера. Полная прозрачность пустого OBS больше не обязательна во всех случаях: пользователь выбирает режим по D41-REQ-35. D41-REQ-36 окончательно исключает таймер скрытия при отсутствии активности и любую анимацию появления или роста OBS-виджета в режиме «Скрывать, когда чат пуст». Проверить нижнюю привязку, рост вверх при длинном тексте/крупных GIF, обрезку сверху на границе источника, поведение при изменении OBS размера и сохранение старых сообщений при отсутствии новых. ЗАКРЫТО ПОВТОРНЫМ ПОДТВЕРЖДЕНИЕМ: окончание трансляции одной или обеих платформ не удаляет и не скрывает сообщения автоматически; поведение уже определено D41-REQ-20 и уточнено D41-REQ-36. Проверить этот сценарий в Windows/OBS QA без добавления нового режима очистки. D41-REQ-42: перечень доступных пользователю параметров свечения закрыт и проверен по исходникам редактора правил; отдельные ползунки толщины, силы или радиуса размытия не предлагать как уже имеющиеся. При переносе свечения проверить реальную рамку и цвета в локальном предпросмотре и OBS.</w:t>
       </w:r>
     </w:p>
     <w:p>
@@ -18240,7 +18246,7 @@
     <w:p>
       <w:pPr/>
       <w:r>
-        <w:t>Источники решений: «Программа для стриминга 70» и продолжение 23–24 октября 2026 года. Отдельные ответы «принимаю», «принимаем», «вариант 2», «так и делаем» относятся к конкретным перечисленным выше вопросам. Последнее решение о мгновенном изменении оформления всех уже отображённых сообщений принято 24 октября 2026 года. После этой записи принято дополнительное правило D41-REQ-23: запуск InOneLine посреди эфира не загружает предыдущую переписку. В тот же день пользователь потребовал регистрировать каждое принятое решение в этом документе и синхронизировать его копию на GitHub; правило закреплено в §1.7. Дополнение от 24 октября 2026 года: принято D41-REQ-24 — при обычном отключении аккаунта без замены уже отображённые сообщения остаются до обычного вытеснения; ожидавшие в буфере сообщения не выводятся. Отличать это от смены аккаунта по D41-REQ-22. 24 октября 2026 года пользователь потребовал разместить мультичат и его настройки в одной вкладке, слева ленту и справа параметры на широком окне, с обязательной адаптацией под 520 × 360 и сохранением узнаваемого общего UI; это внесено в D41-REQ-25. В следующем ответе 24 октября 2026 года пользователь окончательно утвердил минимальную компоновку: чат сверху, настройки снизу с собственной вертикальной прокруткой, а чат остаётся без ручной прокрутки. 24 октября 2026 года пользователь принял группировку настроек мультичата в раскрывающиеся блоки и потребовал скрывать настройки неподключённых сервисов; зафиксировано D41-REQ-26. 24 октября 2026 года принято D41-REQ-27: отдельное тестовое сообщение только для локального предпросмотра оформления, без добавления в настоящий чат, OBS и историю. 24 октября 2026 года принято D41-REQ-28: кнопка тестового сообщения внутри оформления соответствующей подключённой платформы, локальный образец с текстом и графическими элементами, закрытие кнопкой «Закрыть предпросмотр» и возврат к текущей живой ленте без остановки получения сообщений. 24 октября 2026 года принято D41-REQ-29: независимый одновременный показ тестовых сообщений каждой подключённой платформы; предложенная замена одного образца другим явно отклонена. При этом не создаются настоящие сообщения или OBS-события. 24 октября 2026 года пользователь предложил D41-REQ-30/31: настоящие сообщения остаются выше закреплённых снизу тестовых образцов; область чата является немедленным локальным предпросмотром изменений внешнего вида, а опубликованное оформление OBS обновляется только по нажатию «Сохранить». Ранее согласованное мгновенное применение черновых изменений оформления в OBS этим уточнением заменено. 24 октября 2026 года пользователь принял сохранение черновика при смене вкладки и диалог закрытия из D41-REQ-32, а также отдельно подчеркнул обязательное одновременное мгновенное изменение ВСЕХ тестовых и реальных сообщений в локальном предпросмотре D41-REQ-12/31; OBS по-прежнему обновляется только после «Сохранить». 24 октября 2026 года пользователь прямо предложил сопоставить локальную область редактирования/предпросмотра мультичата с редактором правил аукциона, добавить кнопку браузерной проверки, возможность выбора фона и светящийся контур с регулируемым цветом и полным отключением; записано как D41-REQ-33/34. Детали, перечисленные в §13.6.7, ещё не согласованы. Дополнение от 24 октября 2026 года: D41-REQ-35 — два пользовательских режима видимости пустого OBS-виджета («скрывать» или «показывать фон и контур постоянно»); способ мгновенного появления без таймера окончательно установлен более поздним D41-REQ-36. Дополнение от 24 октября 2026 года: пользователь отверг предложение о скрытии после тайм-аута, не принял анимацию и прямо установил последовательное мгновенное появление сообщений снизу с ростом общего виджета вверх до границы OBS браузерного источника; сообщения не исчезают по времени и должны оставаться показанными на протяжении эфира. Зафиксировано как D41-REQ-36, уточнение D41-REQ-13/17/20/35. 24 октября 2026 года пользователь повторно подтвердил ранее согласованный D41-REQ-20: завершение трансляции любой платформы не удаляет и не скрывает её уже отображённые сообщения, поскольку некоторые чаты доступны и вне эфира; автоматически очищать при окончании нельзя. Правило о достоверном начале нового эфира и остальные ограничения памяти/отображения сохраняются. Предыдущее предложение ассистента выбрать между удалением и сохранением сообщений после окончания Twitch было ошибочным повторным открытием уже решённого вопроса. 24 октября 2026 года пользователь выбрал вариант 1 для режима «Показывать постоянно»: полный размер общего фона/контура по всей области браузерного источника OBS с самого начала, даже без сообщений, и без динамического расширения области от новых сообщений. Это D41-REQ-37; предложенный вариант 2 отклонён. Скрываемый режим D41-REQ-36 не меняется. 24 октября 2026 года пользователь принял предложенный полный перечень вариантов общего фона мультичата: полностью прозрачный, однотонная заливка с выбором цвета и прозрачности, статическое изображение, GIF и видео из существующей библиотеки. Решение занесено в D41-REQ-38; параметры размещения и воспроизведения остаются для технической проверки, новые медиа-механизмы без необходимости не добавлять. 24 октября 2026 года пользователь утвердил оба режима масштабирования фоновых изображений, GIF и видео: «Вписать целиком» и «Заполнить область», с немедленным просмотром локального черновика и применением к OBS только по «Сохранить»; решение внесено как D41-REQ-39. Циклический повтор видеофона утверждён отдельно D41-REQ-40; центральное положение точки обрезки позднее принято в D41-REQ-43. 24 октября 2026 года пользователь принял D41-REQ-40 — циклический повтор выбранного видеофона после завершения ролика; затем прямо утвердил D41-REQ-41 — видеофон всегда без звука, без управления включением звука и громкостью. D41-REQ-39 сохранён как два способа масштабирования. После записи D41-REQ-40 отставание GitHub-копии по D41-REQ-39 было устранено и побайтовое совпадение обеих площадок подтверждено. Для D41-REQ-41 повторно необходима обязательная синхронизация по §1.7. Дополнение 24 октября 2026 года: пользователь подтвердил минимальное оформление свечения D41-REQ-42 (включение/отключение + цвет, как действительно реализовано в редакторе правил) без регулировки толщины и интенсивности. В ответ на ошибочное предположение ассистента он установил обязательное правило §1.2: прежде чем ссылаться на существующую функцию программы как образец, проверять её фактический доступный состав в текущем коде; не представлять придуманные параметры как уже существующие. Источник проверки: streaming_manager/views/rules_editor.py, блок правил «Светящийся контур» и «Цвет контура». 24 октября 2026 года пользователь после пояснения на примере узкого браузерного источника OBS прямо выбрал автоматическое центрирование общего медиафона при режиме «Заполнить область»: обрезка лишних краёв симметрично относительно центра, никакого ручного сдвига и выбора положения в настройках. Решение внесено в D41-REQ-43; «Вписать целиком» не изменяется.</w:t>
+        <w:t>Источники решений: «Программа для стриминга 70» и продолжение 23–24 октября 2026 года. Отдельные ответы «принимаю», «принимаем», «вариант 2», «так и делаем» относятся к конкретным перечисленным выше вопросам. Последнее решение о мгновенном изменении оформления всех уже отображённых сообщений принято 24 октября 2026 года. После этой записи принято дополнительное правило D41-REQ-23: запуск InOneLine посреди эфира не загружает предыдущую переписку. В тот же день пользователь потребовал регистрировать каждое принятое решение в этом документе и синхронизировать его копию на GitHub; правило закреплено в §1.7. Дополнение от 24 октября 2026 года: принято D41-REQ-24 — при обычном отключении аккаунта без замены уже отображённые сообщения остаются до обычного вытеснения; ожидавшие в буфере сообщения не выводятся. Отличать это от смены аккаунта по D41-REQ-22. 24 октября 2026 года пользователь потребовал разместить мультичат и его настройки в одной вкладке, слева ленту и справа параметры на широком окне, с обязательной адаптацией под 520 × 360 и сохранением узнаваемого общего UI; это внесено в D41-REQ-25. В следующем ответе 24 октября 2026 года пользователь окончательно утвердил минимальную компоновку: чат сверху, настройки снизу с собственной вертикальной прокруткой, а чат остаётся без ручной прокрутки. 24 октября 2026 года пользователь принял группировку настроек мультичата в раскрывающиеся блоки и потребовал скрывать настройки неподключённых сервисов; зафиксировано D41-REQ-26. 24 октября 2026 года принято D41-REQ-27: отдельное тестовое сообщение только для локального предпросмотра оформления, без добавления в настоящий чат, OBS и историю. 24 октября 2026 года принято D41-REQ-28: кнопка тестового сообщения внутри оформления соответствующей подключённой платформы, локальный образец с текстом и графическими элементами, закрытие кнопкой «Закрыть предпросмотр» и возврат к текущей живой ленте без остановки получения сообщений. 24 октября 2026 года принято D41-REQ-29: независимый одновременный показ тестовых сообщений каждой подключённой платформы; предложенная замена одного образца другим явно отклонена. При этом не создаются настоящие сообщения или OBS-события. 24 октября 2026 года пользователь предложил D41-REQ-30/31: настоящие сообщения остаются выше закреплённых снизу тестовых образцов; область чата является немедленным локальным предпросмотром изменений внешнего вида, а опубликованное оформление OBS обновляется только по нажатию «Сохранить». Ранее согласованное мгновенное применение черновых изменений оформления в OBS этим уточнением заменено. 24 октября 2026 года пользователь принял сохранение черновика при смене вкладки и диалог закрытия из D41-REQ-32, а также отдельно подчеркнул обязательное одновременное мгновенное изменение ВСЕХ тестовых и реальных сообщений в локальном предпросмотре D41-REQ-12/31; OBS по-прежнему обновляется только после «Сохранить». 24 октября 2026 года пользователь прямо предложил сопоставить локальную область редактирования/предпросмотра мультичата с редактором правил аукциона, добавить кнопку браузерной проверки, возможность выбора фона и светящийся контур с регулируемым цветом и полным отключением; записано как D41-REQ-33/34. Детали, перечисленные в §13.6.7, ещё не согласованы. Дополнение от 24 октября 2026 года: D41-REQ-35 — два пользовательских режима видимости пустого OBS-виджета («скрывать» или «показывать фон и контур постоянно»); способ мгновенного появления без таймера окончательно установлен более поздним D41-REQ-36. Дополнение от 24 октября 2026 года: пользователь отверг предложение о скрытии после тайм-аута, не принял анимацию и прямо установил последовательное мгновенное появление сообщений снизу с ростом общего виджета вверх до границы OBS браузерного источника; сообщения не исчезают по времени и должны оставаться показанными на протяжении эфира. Зафиксировано как D41-REQ-36, уточнение D41-REQ-13/17/20/35. 24 октября 2026 года пользователь повторно подтвердил ранее согласованный D41-REQ-20: завершение трансляции любой платформы не удаляет и не скрывает её уже отображённые сообщения, поскольку некоторые чаты доступны и вне эфира; автоматически очищать при окончании нельзя. Правило о достоверном начале нового эфира и остальные ограничения памяти/отображения сохраняются. Предыдущее предложение ассистента выбрать между удалением и сохранением сообщений после окончания Twitch было ошибочным повторным открытием уже решённого вопроса. 24 октября 2026 года пользователь выбрал вариант 1 для режима «Показывать постоянно»: полный размер общего фона/контура по всей области браузерного источника OBS с самого начала, даже без сообщений, и без динамического расширения области от новых сообщений. Это D41-REQ-37; предложенный вариант 2 отклонён. Скрываемый режим D41-REQ-36 не меняется. 24 октября 2026 года пользователь принял предложенный полный перечень вариантов общего фона мультичата: полностью прозрачный, однотонная заливка с выбором цвета и прозрачности, статическое изображение, GIF и видео из существующей библиотеки. Решение занесено в D41-REQ-38; параметры размещения и воспроизведения остаются для технической проверки, новые медиа-механизмы без необходимости не добавлять. 24 октября 2026 года пользователь утвердил оба режима масштабирования фоновых изображений, GIF и видео: «Вписать целиком» и «Заполнить область», с немедленным просмотром локального черновика и применением к OBS только по «Сохранить»; решение внесено как D41-REQ-39. Циклический повтор видеофона утверждён отдельно D41-REQ-40; центральное положение точки обрезки позднее принято в D41-REQ-43. 24 октября 2026 года пользователь принял D41-REQ-40 — циклический повтор выбранного видеофона после завершения ролика; затем прямо утвердил D41-REQ-41 — видеофон всегда без звука, без управления включением звука и громкостью. D41-REQ-39 сохранён как два способа масштабирования. После записи D41-REQ-40 отставание GitHub-копии по D41-REQ-39 было устранено и побайтовое совпадение обеих площадок подтверждено. Для D41-REQ-41 повторно необходима обязательная синхронизация по §1.7. Дополнение 24 октября 2026 года: пользователь подтвердил минимальное оформление свечения D41-REQ-42 (включение/отключение + цвет, как действительно реализовано в редакторе правил) без регулировки толщины и интенсивности. В ответ на ошибочное предположение ассистента он установил обязательное правило §1.2: прежде чем ссылаться на существующую функцию программы как образец, проверять её фактический доступный состав в текущем коде; не представлять придуманные параметры как уже существующие. Источник проверки: streaming_manager/views/rules_editor.py, блок правил «Светящийся контур» и «Цвет контура». 24 октября 2026 года пользователь после пояснения на примере узкого браузерного источника OBS прямо выбрал автоматическое центрирование общего медиафона при режиме «Заполнить область»: обрезка лишних краёв симметрично относительно центра, никакого ручного сдвига и выбора положения в настройках. Решение внесено в D41-REQ-43; «Вписать целиком» не изменяется. 24 октября 2026 года пользователь после адресной проверки действующего редактора правил сохранил прежний механизм непрозрачности: отдельный регулятор 0–100 % только у однотонного фона; изображение, GIF и видео без дополнительного opacity-параметра. Закреплено D41-REQ-44. Аналог подтверждён по streaming_manager/views/rules_editor.py и streaming_manager/web/rules_overlay.html. Это согласование требований, не реализация.</w:t>
       </w:r>
     </w:p>
     <w:p>

</xml_diff>

<commit_message>
docs: approve D41-REQ-45 official platform icons for multichat
</commit_message>
<xml_diff>
--- a/docs/Правила_и_дальнейший_распорядок_работ.docx
+++ b/docs/Правила_и_дальнейший_распорядок_работ.docx
@@ -17853,7 +17853,7 @@
     </w:p>
     <w:p>
       <w:r>
-        <w:t>У каждого сообщения должен быть узнаваемый маркер источника — значок платформы либо собственный значок. Конкретные изображения ещё не выбраны. Показ времени включается и выключается пользователем; при выключении времени хронологический порядок сохраняется. Исходное требование к содержимому — максимально полное дублирование чатов, включая смайлики, анимированные элементы и GIF. Подмена недоступного изображения текстовой заглушкой как достаточный результат пока не согласована.</w:t>
+        <w:t>У каждого сообщения должен быть узнаваемый маркер источника. Более поздним решением пользователя от 24 октября 2026 года утверждены официальные значки самих платформ (D41-REQ-45): в первой версии Twitch и YouTube, для будущих подключённых платформ — их собственные официальные значки. Собственные заменяющие значки InOneLine не выбраны. Показ времени включается и выключается пользователем; при выключении времени хронологический порядок сохраняется. Исходное требование к содержимому — максимально полное дублирование чатов, включая смайлики, анимированные элементы и GIF. Подмена недоступного изображения текстовой заглушкой как достаточный результат пока не согласована.</w:t>
       </w:r>
     </w:p>
     <w:p>
@@ -17968,6 +17968,9 @@
       <w:pPr/>
       <w:r>
         <w:t>D41-REQ-07. Максимально точно показывать сообщения такими, как платформа их предоставляет: текст, никнейм, доступные аватары/роли, нативные смайлики, анимированные элементы, GIF, ссылки, упоминания, ответы, подписки, подарки, платные сообщения, системные события, если они показаны оригинальной площадкой и доступны через её интерфейс. У каждой записи должен быть различимый маркер платформы. Условие «показать всё» ограничено фактически доступными данными API; недоступные типы отдельно проверять и помечать.</w:t>
+      </w:r>
+      <w:r>
+        <w:t xml:space="preserve"> Уточнение о типе маркера платформы см. D41-REQ-45.</w:t>
       </w:r>
     </w:p>
     <w:p>
@@ -18223,6 +18226,12 @@
       </w:r>
     </w:p>
     <w:p>
+      <w:pPr/>
+      <w:r>
+        <w:t>D41-REQ-45. ОФИЦИАЛЬНЫЕ ЗНАЧКИ ПЛАТФОРМ В МУЛЬТИЧАТЕ (прямое принятие пользователем 24 октября 2026 года; согласовано как требование, код D41 не реализован). Для визуального указания платформы каждого сообщения использовать узнаваемый ОФИЦИАЛЬНЫЙ значок соответствующего сервиса. В первой версии — значки Twitch и YouTube; для позднее добавляемых платформ использовать их собственные официальные значки по тому же общему правилу. Значок располагается перед соответствующим сообщением в едином хронологическом потоке и позволяет определить источник без обязательной текстовой подписи «Twitch» / «YouTube». Это уточняет ранее открытый выбор между значком платформы и собственным значком InOneLine (D41-REQ-07 и §13.5): пользователь принял ОФИЦИАЛЬНЫЕ значки, а не специально нарисованные заменители. Применяется к отображению сообщений в операторской вкладке и OBS-виджете, не влияет на порядок, задержку, содержание или видимость сообщений. Проверить при реализации источники графических ресурсов и применимые требования к использованию знаков платформ, качество отображения при разных масштабах OBS и будущую расширяемость адаптеров; не считать такую техническую проверку согласованием новых функций. Источник: прямой ответ пользователя «Принимаю. Идём дальше.» 24 октября 2026 года на предложение использовать официальные знаки Twitch/YouTube и остальных платформ. Статус: согласовано к реализации; код, Windows QA, ручной PASS, merge и release отсутствуют. Связи: D41-REQ-01/03/07/11/13/25/27/28; единый поток и отдельный OBS-виджет.</w:t>
+      </w:r>
+    </w:p>
+    <w:p>
       <w:pPr>
         <w:pStyle w:val="Heading3"/>
         <w:keepNext/>
@@ -18236,6 +18245,9 @@
       <w:r>
         <w:t>Не решено и требует технической проверки: точные пределы ручного значения задержки и лимита памяти; поведение при экстремальной нагрузке и весе медиа; факт доступности всех типовых и нестандартных эмодзи YouTube/стикеров и других платформ; полнота событий удаления и подключения; точные пропорции и точки адаптивного перестроения принятой двухрежимной компоновки вкладки «Мультичат», положение регуляторов и URL-кнопок; штатное сохранение признака «разрешено в OBS» на момент готовности сообщения для надёжного восстановления нескольких браузерных экземпляров. Для D41-REQ-27/28 согласованы место кнопки, образец с текстом, никнеймом, аватаром, знаком платформы и эмодзи, способ закрытия и непрерывный приём настоящего чата; более широкие наборы тестовых медиа не утверждены. D41-REQ-29: одновременное отображение нескольких тестовых образцов принято; визуальное размещение и удобство сравнения на минимальной ширине проверяются при UI-реализации. Не возвращаться к отвергнутому режиму автоматической замены образца одного сервиса другим. Для D41-REQ-30/31/32 проверить геометрию закреплённых снизу тестовых сообщений при высокой нагрузке и малой высоте; поведение несохранённого черновика при переключении вкладок и закрытии уже согласовано D41-REQ-32; при реализации проверить три действия диалога закрытия. Мгновенное локальное предпросмотр-оформление не следует путать с сохранённым стилем OBS; изменение OBS только по явной кнопке «Сохранить». Дополнение D41-REQ-33/34: проверить фактическую реализацию сохранённого browser preview редактора правил, перенос уже существующих фоновых медиа и светящегося контура в мультичат, утверждённые по D41-REQ-38 фоновые варианты (прозрачный/цвет/изображение/GIF/видео) и их техническую поддержку, два согласованных способа масштабирования общего медиа-фона по D41-REQ-39 и строго центральную обрезку без настройки положения по D41-REQ-43; регулировка непрозрачности только цветного фона и отсутствие такой регулировки для изображения/GIF/видео окончательно согласованы D41-REQ-44; повтор видеофона уже согласован D41-REQ-40, а звук видеофона всегда отключён по D41-REQ-41, два принятых режима пустого виджета по D41-REQ-35, поведение общей рамки в окне минимального размера. Полная прозрачность пустого OBS больше не обязательна во всех случаях: пользователь выбирает режим по D41-REQ-35. D41-REQ-36 окончательно исключает таймер скрытия при отсутствии активности и любую анимацию появления или роста OBS-виджета в режиме «Скрывать, когда чат пуст». Проверить нижнюю привязку, рост вверх при длинном тексте/крупных GIF, обрезку сверху на границе источника, поведение при изменении OBS размера и сохранение старых сообщений при отсутствии новых. ЗАКРЫТО ПОВТОРНЫМ ПОДТВЕРЖДЕНИЕМ: окончание трансляции одной или обеих платформ не удаляет и не скрывает сообщения автоматически; поведение уже определено D41-REQ-20 и уточнено D41-REQ-36. Проверить этот сценарий в Windows/OBS QA без добавления нового режима очистки. D41-REQ-42: перечень доступных пользователю параметров свечения закрыт и проверен по исходникам редактора правил; отдельные ползунки толщины, силы или радиуса размытия не предлагать как уже имеющиеся. При переносе свечения проверить реальную рамку и цвета в локальном предпросмотре и OBS.</w:t>
       </w:r>
+      <w:r>
+        <w:t xml:space="preserve"> D41-REQ-45: выбор между собственными и официальными маркерами закрыт в пользу официальных значков; при разработке проверить происхождение/условия использования ресурсов и читаемость изображения в виджете, не вводить вместо них собственные заменители без отдельного решения.</w:t>
+      </w:r>
     </w:p>
     <w:p>
       <w:pPr/>
@@ -18247,6 +18259,9 @@
       <w:pPr/>
       <w:r>
         <w:t>Источники решений: «Программа для стриминга 70» и продолжение 23–24 октября 2026 года. Отдельные ответы «принимаю», «принимаем», «вариант 2», «так и делаем» относятся к конкретным перечисленным выше вопросам. Последнее решение о мгновенном изменении оформления всех уже отображённых сообщений принято 24 октября 2026 года. После этой записи принято дополнительное правило D41-REQ-23: запуск InOneLine посреди эфира не загружает предыдущую переписку. В тот же день пользователь потребовал регистрировать каждое принятое решение в этом документе и синхронизировать его копию на GitHub; правило закреплено в §1.7. Дополнение от 24 октября 2026 года: принято D41-REQ-24 — при обычном отключении аккаунта без замены уже отображённые сообщения остаются до обычного вытеснения; ожидавшие в буфере сообщения не выводятся. Отличать это от смены аккаунта по D41-REQ-22. 24 октября 2026 года пользователь потребовал разместить мультичат и его настройки в одной вкладке, слева ленту и справа параметры на широком окне, с обязательной адаптацией под 520 × 360 и сохранением узнаваемого общего UI; это внесено в D41-REQ-25. В следующем ответе 24 октября 2026 года пользователь окончательно утвердил минимальную компоновку: чат сверху, настройки снизу с собственной вертикальной прокруткой, а чат остаётся без ручной прокрутки. 24 октября 2026 года пользователь принял группировку настроек мультичата в раскрывающиеся блоки и потребовал скрывать настройки неподключённых сервисов; зафиксировано D41-REQ-26. 24 октября 2026 года принято D41-REQ-27: отдельное тестовое сообщение только для локального предпросмотра оформления, без добавления в настоящий чат, OBS и историю. 24 октября 2026 года принято D41-REQ-28: кнопка тестового сообщения внутри оформления соответствующей подключённой платформы, локальный образец с текстом и графическими элементами, закрытие кнопкой «Закрыть предпросмотр» и возврат к текущей живой ленте без остановки получения сообщений. 24 октября 2026 года принято D41-REQ-29: независимый одновременный показ тестовых сообщений каждой подключённой платформы; предложенная замена одного образца другим явно отклонена. При этом не создаются настоящие сообщения или OBS-события. 24 октября 2026 года пользователь предложил D41-REQ-30/31: настоящие сообщения остаются выше закреплённых снизу тестовых образцов; область чата является немедленным локальным предпросмотром изменений внешнего вида, а опубликованное оформление OBS обновляется только по нажатию «Сохранить». Ранее согласованное мгновенное применение черновых изменений оформления в OBS этим уточнением заменено. 24 октября 2026 года пользователь принял сохранение черновика при смене вкладки и диалог закрытия из D41-REQ-32, а также отдельно подчеркнул обязательное одновременное мгновенное изменение ВСЕХ тестовых и реальных сообщений в локальном предпросмотре D41-REQ-12/31; OBS по-прежнему обновляется только после «Сохранить». 24 октября 2026 года пользователь прямо предложил сопоставить локальную область редактирования/предпросмотра мультичата с редактором правил аукциона, добавить кнопку браузерной проверки, возможность выбора фона и светящийся контур с регулируемым цветом и полным отключением; записано как D41-REQ-33/34. Детали, перечисленные в §13.6.7, ещё не согласованы. Дополнение от 24 октября 2026 года: D41-REQ-35 — два пользовательских режима видимости пустого OBS-виджета («скрывать» или «показывать фон и контур постоянно»); способ мгновенного появления без таймера окончательно установлен более поздним D41-REQ-36. Дополнение от 24 октября 2026 года: пользователь отверг предложение о скрытии после тайм-аута, не принял анимацию и прямо установил последовательное мгновенное появление сообщений снизу с ростом общего виджета вверх до границы OBS браузерного источника; сообщения не исчезают по времени и должны оставаться показанными на протяжении эфира. Зафиксировано как D41-REQ-36, уточнение D41-REQ-13/17/20/35. 24 октября 2026 года пользователь повторно подтвердил ранее согласованный D41-REQ-20: завершение трансляции любой платформы не удаляет и не скрывает её уже отображённые сообщения, поскольку некоторые чаты доступны и вне эфира; автоматически очищать при окончании нельзя. Правило о достоверном начале нового эфира и остальные ограничения памяти/отображения сохраняются. Предыдущее предложение ассистента выбрать между удалением и сохранением сообщений после окончания Twitch было ошибочным повторным открытием уже решённого вопроса. 24 октября 2026 года пользователь выбрал вариант 1 для режима «Показывать постоянно»: полный размер общего фона/контура по всей области браузерного источника OBS с самого начала, даже без сообщений, и без динамического расширения области от новых сообщений. Это D41-REQ-37; предложенный вариант 2 отклонён. Скрываемый режим D41-REQ-36 не меняется. 24 октября 2026 года пользователь принял предложенный полный перечень вариантов общего фона мультичата: полностью прозрачный, однотонная заливка с выбором цвета и прозрачности, статическое изображение, GIF и видео из существующей библиотеки. Решение занесено в D41-REQ-38; параметры размещения и воспроизведения остаются для технической проверки, новые медиа-механизмы без необходимости не добавлять. 24 октября 2026 года пользователь утвердил оба режима масштабирования фоновых изображений, GIF и видео: «Вписать целиком» и «Заполнить область», с немедленным просмотром локального черновика и применением к OBS только по «Сохранить»; решение внесено как D41-REQ-39. Циклический повтор видеофона утверждён отдельно D41-REQ-40; центральное положение точки обрезки позднее принято в D41-REQ-43. 24 октября 2026 года пользователь принял D41-REQ-40 — циклический повтор выбранного видеофона после завершения ролика; затем прямо утвердил D41-REQ-41 — видеофон всегда без звука, без управления включением звука и громкостью. D41-REQ-39 сохранён как два способа масштабирования. После записи D41-REQ-40 отставание GitHub-копии по D41-REQ-39 было устранено и побайтовое совпадение обеих площадок подтверждено. Для D41-REQ-41 повторно необходима обязательная синхронизация по §1.7. Дополнение 24 октября 2026 года: пользователь подтвердил минимальное оформление свечения D41-REQ-42 (включение/отключение + цвет, как действительно реализовано в редакторе правил) без регулировки толщины и интенсивности. В ответ на ошибочное предположение ассистента он установил обязательное правило §1.2: прежде чем ссылаться на существующую функцию программы как образец, проверять её фактический доступный состав в текущем коде; не представлять придуманные параметры как уже существующие. Источник проверки: streaming_manager/views/rules_editor.py, блок правил «Светящийся контур» и «Цвет контура». 24 октября 2026 года пользователь после пояснения на примере узкого браузерного источника OBS прямо выбрал автоматическое центрирование общего медиафона при режиме «Заполнить область»: обрезка лишних краёв симметрично относительно центра, никакого ручного сдвига и выбора положения в настройках. Решение внесено в D41-REQ-43; «Вписать целиком» не изменяется. 24 октября 2026 года пользователь после адресной проверки действующего редактора правил сохранил прежний механизм непрозрачности: отдельный регулятор 0–100 % только у однотонного фона; изображение, GIF и видео без дополнительного opacity-параметра. Закреплено D41-REQ-44. Аналог подтверждён по streaming_manager/views/rules_editor.py и streaming_manager/web/rules_overlay.html. Это согласование требований, не реализация.</w:t>
+      </w:r>
+      <w:r>
+        <w:t xml:space="preserve"> 24 октября 2026 года пользователем утверждён D41-REQ-45: официальные значки платформ Twitch/YouTube перед сообщениями и правило использования официальных значков при подключении следующих платформ.</w:t>
       </w:r>
     </w:p>
     <w:p>

</xml_diff>

<commit_message>
docs: D41-REQ-46 platform icon placement
</commit_message>
<xml_diff>
--- a/docs/Правила_и_дальнейший_распорядок_работ.docx
+++ b/docs/Правила_и_дальнейший_распорядок_работ.docx
@@ -17855,6 +17855,9 @@
       <w:r>
         <w:t>У каждого сообщения должен быть узнаваемый маркер источника. Более поздним решением пользователя от 24 октября 2026 года утверждены официальные значки самих платформ (D41-REQ-45): в первой версии Twitch и YouTube, для будущих подключённых платформ — их собственные официальные значки. Собственные заменяющие значки InOneLine не выбраны. Показ времени включается и выключается пользователем; при выключении времени хронологический порядок сохраняется. Исходное требование к содержимому — максимально полное дублирование чатов, включая смайлики, анимированные элементы и GIF. Подмена недоступного изображения текстовой заглушкой как достаточный результат пока не согласована.</w:t>
       </w:r>
+      <w:r>
+        <w:t xml:space="preserve"> Положение официального значка слева от аватара и имени согласовано в D41-REQ-46; метка времени в приведённом пользователю примере находится после никнейма, а при выключении времени отсутствует.</w:t>
+      </w:r>
     </w:p>
     <w:p>
       <w:r>
@@ -18230,6 +18233,15 @@
       <w:r>
         <w:t>D41-REQ-45. ОФИЦИАЛЬНЫЕ ЗНАЧКИ ПЛАТФОРМ В МУЛЬТИЧАТЕ (прямое принятие пользователем 24 октября 2026 года; согласовано как требование, код D41 не реализован). Для визуального указания платформы каждого сообщения использовать узнаваемый ОФИЦИАЛЬНЫЙ значок соответствующего сервиса. В первой версии — значки Twitch и YouTube; для позднее добавляемых платформ использовать их собственные официальные значки по тому же общему правилу. Значок располагается перед соответствующим сообщением в едином хронологическом потоке и позволяет определить источник без обязательной текстовой подписи «Twitch» / «YouTube». Это уточняет ранее открытый выбор между значком платформы и собственным значком InOneLine (D41-REQ-07 и §13.5): пользователь принял ОФИЦИАЛЬНЫЕ значки, а не специально нарисованные заменители. Применяется к отображению сообщений в операторской вкладке и OBS-виджете, не влияет на порядок, задержку, содержание или видимость сообщений. Проверить при реализации источники графических ресурсов и применимые требования к использованию знаков платформ, качество отображения при разных масштабах OBS и будущую расширяемость адаптеров; не считать такую техническую проверку согласованием новых функций. Источник: прямой ответ пользователя «Принимаю. Идём дальше.» 24 октября 2026 года на предложение использовать официальные знаки Twitch/YouTube и остальных платформ. Статус: согласовано к реализации; код, Windows QA, ручной PASS, merge и release отсутствуют. Связи: D41-REQ-01/03/07/11/13/25/27/28; единый поток и отдельный OBS-виджет.</w:t>
       </w:r>
+      <w:r>
+        <w:t xml:space="preserve"> Точное положение значка внутри строки сообщения утверждено последующим D41-REQ-46: СЛЕВА от аватара и никнейма; эта позиция обязательна для всех платформ, в том числе добавленных позднее.</w:t>
+      </w:r>
+    </w:p>
+    <w:p>
+      <w:pPr/>
+      <w:r>
+        <w:t>D41-REQ-46. ПОЛОЖЕНИЕ ОФИЦИАЛЬНОГО ЗНАЧКА ПЛАТФОРМЫ В СООБЩЕНИИ (прямое принятие пользователем 24 октября 2026 года на схему после D41-REQ-45; согласовано как требование, код D41 не реализован). В каждой карточке/строке сообщения официальный значок источника ставить СЛЕВА от аватара автора и его никнейма. Порядок элементов шапки в обычном варианте: [официальный значок платформы] [доступный аватар] [никнейм] [время при включённом показе]. Текст или графическое содержимое сообщения располагаются ниже этой шапки, согласно показанному пользователю условному примеру. При отключении времени исчезает только временная метка: расположение значка, аватара, никнейма и последовательность сообщений сохраняются. Единое правило действует и в операторской вкладке, и в OBS, в оригинальном и настраиваемом оформлении, для Twitch/YouTube и позднее добавленных сервисов. Отсутствующий аватар и его возможная заглушка требуют отдельного решения; не записывать тестовую условную пиктограмму пользователя из схемы как утверждённую заглушку. Параметры расстояний/размеров проверить при адаптивной реализации на разных ширинах, без дополнительного согласованного режима перемещения маркера. Связи: D41-REQ-06/07/11/12/13/45. Источник: прямой ответ пользователя «Принимаю. Идём дальше.» 24 октября 2026 года на предложение «значок платформы слева от аватара и никнейма» с двумя примерами и метками времени. Статус: требование согласовано к реализации; код, Windows QA, ручной PASS, merge и release отсутствуют.</w:t>
+      </w:r>
     </w:p>
     <w:p>
       <w:pPr>
@@ -18248,6 +18260,9 @@
       <w:r>
         <w:t xml:space="preserve"> D41-REQ-45: выбор между собственными и официальными маркерами закрыт в пользу официальных значков; при разработке проверить происхождение/условия использования ресурсов и читаемость изображения в виджете, не вводить вместо них собственные заменители без отдельного решения.</w:t>
       </w:r>
+      <w:r>
+        <w:t xml:space="preserve"> Дополнение D41-REQ-46: расположение официального маркера СЛЕВА от аватара и никнейма утверждено; проверить адаптивную геометрию, допустимость отсутствия аватара и читабельность шапки в узком OBS-источнике. Не считать серый тестовый аватар на условной схеме требованием к заглушке.</w:t>
+      </w:r>
     </w:p>
     <w:p>
       <w:pPr/>
@@ -18262,6 +18277,9 @@
       </w:r>
       <w:r>
         <w:t xml:space="preserve"> 24 октября 2026 года пользователем утверждён D41-REQ-45: официальные значки платформ Twitch/YouTube перед сообщениями и правило использования официальных значков при подключении следующих платформ.</w:t>
+      </w:r>
+      <w:r>
+        <w:t xml:space="preserve"> 24 октября 2026 года пользователь принял D41-REQ-46: официальный значок платформы слева от аватара и никнейма, с необязательной меткой времени после имени; одинаковое правило для локальной вкладки и OBS. Источник — ответ «Принимаю. Идём дальше.» на схему двух сообщений, предложенную после D41-REQ-45.</w:t>
       </w:r>
     </w:p>
     <w:p>

</xml_diff>